<commit_message>
Exercices GameHub G31 à G34
</commit_message>
<xml_diff>
--- a/_documents/GameHub_Solution_Finale.docx
+++ b/_documents/GameHub_Solution_Finale.docx
@@ -5277,6 +5277,150 @@
           <w:sz w:val="19"/>
           <w:szCs w:val="19"/>
         </w:rPr>
+        <w:t xml:space="preserve">    // G.32 — la facon de fabriquer chaque jeu, rangee par type. Une valeur   //@G.32</w:t>
+      </w:r>
+    </w:p>
+    <w:p>
+      <w:pPr>
+        <w:keepLines/>
+        <w:shd w:fill="F2F2F2" w:val="clear"/>
+        <w:spacing w:after="0" w:before="0"/>
+        <w:ind w:left="220"/>
+      </w:pPr>
+      <w:r>
+        <w:rPr>
+          <w:rFonts w:ascii="Consolas" w:cs="Consolas" w:eastAsia="Consolas" w:hAnsi="Consolas"/>
+          <w:sz w:val="19"/>
+          <w:szCs w:val="19"/>
+        </w:rPr>
+        <w:t xml:space="preserve">    // n'est pas un jeu, c'est de quoi en fabriquer un neuf a chaque appel.   //@G.32</w:t>
+      </w:r>
+    </w:p>
+    <w:p>
+      <w:pPr>
+        <w:keepLines/>
+        <w:shd w:fill="F2F2F2" w:val="clear"/>
+        <w:spacing w:after="0" w:before="0"/>
+        <w:ind w:left="220"/>
+      </w:pPr>
+      <w:r>
+        <w:rPr>
+          <w:rFonts w:ascii="Consolas" w:cs="Consolas" w:eastAsia="Consolas" w:hAnsi="Consolas"/>
+          <w:sz w:val="19"/>
+          <w:szCs w:val="19"/>
+        </w:rPr>
+        <w:t xml:space="preserve">    private static final Map&lt;TypeJeu, Supplier&lt;Jeu&gt;&gt; CATALOGUE = Map.of(   //@G.32</w:t>
+      </w:r>
+    </w:p>
+    <w:p>
+      <w:pPr>
+        <w:keepLines/>
+        <w:shd w:fill="F2F2F2" w:val="clear"/>
+        <w:spacing w:after="0" w:before="0"/>
+        <w:ind w:left="220"/>
+      </w:pPr>
+      <w:r>
+        <w:rPr>
+          <w:rFonts w:ascii="Consolas" w:cs="Consolas" w:eastAsia="Consolas" w:hAnsi="Consolas"/>
+          <w:sz w:val="19"/>
+          <w:szCs w:val="19"/>
+        </w:rPr>
+        <w:t xml:space="preserve">            TypeJeu.NIM, () -&gt; new JeuNim(ALLUMETTES_NIM, new ReglesNim()),   //@G.32</w:t>
+      </w:r>
+    </w:p>
+    <w:p>
+      <w:pPr>
+        <w:keepLines/>
+        <w:shd w:fill="F2F2F2" w:val="clear"/>
+        <w:spacing w:after="0" w:before="0"/>
+        <w:ind w:left="220"/>
+      </w:pPr>
+      <w:r>
+        <w:rPr>
+          <w:rFonts w:ascii="Consolas" w:cs="Consolas" w:eastAsia="Consolas" w:hAnsi="Consolas"/>
+          <w:sz w:val="19"/>
+          <w:szCs w:val="19"/>
+        </w:rPr>
+        <w:t xml:space="preserve">            TypeJeu.BATAILLE, JeuBatailleV1::new,   //@G.32</w:t>
+      </w:r>
+    </w:p>
+    <w:p>
+      <w:pPr>
+        <w:keepLines/>
+        <w:shd w:fill="F2F2F2" w:val="clear"/>
+        <w:spacing w:after="0" w:before="0"/>
+        <w:ind w:left="220"/>
+      </w:pPr>
+      <w:r>
+        <w:rPr>
+          <w:rFonts w:ascii="Consolas" w:cs="Consolas" w:eastAsia="Consolas" w:hAnsi="Consolas"/>
+          <w:sz w:val="19"/>
+          <w:szCs w:val="19"/>
+        </w:rPr>
+        <w:t xml:space="preserve">            TypeJeu.DEVINE_LE_NOMBRE, JeuDevineLeNombre::new,   //@G.32</w:t>
+      </w:r>
+    </w:p>
+    <w:p>
+      <w:pPr>
+        <w:keepLines/>
+        <w:shd w:fill="F2F2F2" w:val="clear"/>
+        <w:spacing w:after="0" w:before="0"/>
+        <w:ind w:left="220"/>
+      </w:pPr>
+      <w:r>
+        <w:rPr>
+          <w:rFonts w:ascii="Consolas" w:cs="Consolas" w:eastAsia="Consolas" w:hAnsi="Consolas"/>
+          <w:sz w:val="19"/>
+          <w:szCs w:val="19"/>
+        </w:rPr>
+        <w:t xml:space="preserve">            TypeJeu.MORPION, JeuMorpion::new,   //@G.32</w:t>
+      </w:r>
+    </w:p>
+    <w:p>
+      <w:pPr>
+        <w:keepLines/>
+        <w:shd w:fill="F2F2F2" w:val="clear"/>
+        <w:spacing w:after="0" w:before="0"/>
+        <w:ind w:left="220"/>
+      </w:pPr>
+      <w:r>
+        <w:rPr>
+          <w:rFonts w:ascii="Consolas" w:cs="Consolas" w:eastAsia="Consolas" w:hAnsi="Consolas"/>
+          <w:sz w:val="19"/>
+          <w:szCs w:val="19"/>
+        </w:rPr>
+        <w:t xml:space="preserve">            TypeJeu.PUISSANCE4, JeuPuissance4::new);   //@G.32</w:t>
+      </w:r>
+    </w:p>
+    <w:p>
+      <w:pPr>
+        <w:keepLines/>
+        <w:shd w:fill="F2F2F2" w:val="clear"/>
+        <w:spacing w:after="0" w:before="0"/>
+        <w:ind w:left="220"/>
+      </w:pPr>
+      <w:r>
+        <w:rPr>
+          <w:rFonts w:ascii="Consolas" w:cs="Consolas" w:eastAsia="Consolas" w:hAnsi="Consolas"/>
+          <w:sz w:val="19"/>
+          <w:szCs w:val="19"/>
+        </w:rPr>
+        <w:t xml:space="preserve"> </w:t>
+      </w:r>
+    </w:p>
+    <w:p>
+      <w:pPr>
+        <w:keepLines/>
+        <w:shd w:fill="F2F2F2" w:val="clear"/>
+        <w:spacing w:after="0" w:before="0"/>
+        <w:ind w:left="220"/>
+      </w:pPr>
+      <w:r>
+        <w:rPr>
+          <w:rFonts w:ascii="Consolas" w:cs="Consolas" w:eastAsia="Consolas" w:hAnsi="Consolas"/>
+          <w:sz w:val="19"/>
+          <w:szCs w:val="19"/>
+        </w:rPr>
         <w:t xml:space="preserve">    public Jeu creer(TypeJeu type) {</w:t>
       </w:r>
     </w:p>
@@ -5309,199 +5453,247 @@
           <w:sz w:val="19"/>
           <w:szCs w:val="19"/>
         </w:rPr>
-        <w:t xml:space="preserve">        //@G.18</w:t>
-      </w:r>
-    </w:p>
-    <w:p>
-      <w:pPr>
-        <w:keepLines/>
-        <w:shd w:fill="F2F2F2" w:val="clear"/>
-        <w:spacing w:after="0" w:before="0"/>
-        <w:ind w:left="220"/>
-      </w:pPr>
-      <w:r>
-        <w:rPr>
-          <w:rFonts w:ascii="Consolas" w:cs="Consolas" w:eastAsia="Consolas" w:hAnsi="Consolas"/>
-          <w:sz w:val="19"/>
-          <w:szCs w:val="19"/>
-        </w:rPr>
-        <w:t xml:space="preserve">        return switch (type) {</w:t>
-      </w:r>
-    </w:p>
-    <w:p>
-      <w:pPr>
-        <w:keepLines/>
-        <w:shd w:fill="F2F2F2" w:val="clear"/>
-        <w:spacing w:after="0" w:before="0"/>
-        <w:ind w:left="220"/>
-      </w:pPr>
-      <w:r>
-        <w:rPr>
-          <w:rFonts w:ascii="Consolas" w:cs="Consolas" w:eastAsia="Consolas" w:hAnsi="Consolas"/>
-          <w:sz w:val="19"/>
-          <w:szCs w:val="19"/>
-        </w:rPr>
-        <w:t xml:space="preserve">            case NIM -&gt; new JeuNim(ALLUMETTES_NIM, new ReglesNim());</w:t>
-      </w:r>
-    </w:p>
-    <w:p>
-      <w:pPr>
-        <w:keepLines/>
-        <w:shd w:fill="F2F2F2" w:val="clear"/>
-        <w:spacing w:after="0" w:before="0"/>
-        <w:ind w:left="220"/>
-      </w:pPr>
-      <w:r>
-        <w:rPr>
-          <w:rFonts w:ascii="Consolas" w:cs="Consolas" w:eastAsia="Consolas" w:hAnsi="Consolas"/>
-          <w:sz w:val="19"/>
-          <w:szCs w:val="19"/>
-        </w:rPr>
-        <w:t xml:space="preserve">            case BATAILLE -&gt; new JeuBatailleV1();   //@G.27</w:t>
-      </w:r>
-    </w:p>
-    <w:p>
-      <w:pPr>
-        <w:keepLines/>
-        <w:shd w:fill="F2F2F2" w:val="clear"/>
-        <w:spacing w:after="0" w:before="0"/>
-        <w:ind w:left="220"/>
-      </w:pPr>
-      <w:r>
-        <w:rPr>
-          <w:rFonts w:ascii="Consolas" w:cs="Consolas" w:eastAsia="Consolas" w:hAnsi="Consolas"/>
-          <w:sz w:val="19"/>
-          <w:szCs w:val="19"/>
-        </w:rPr>
-        <w:t xml:space="preserve">            case DEVINE_LE_NOMBRE -&gt; new JeuDevineLeNombre();   //@G.28</w:t>
-      </w:r>
-    </w:p>
-    <w:p>
-      <w:pPr>
-        <w:keepLines/>
-        <w:shd w:fill="F2F2F2" w:val="clear"/>
-        <w:spacing w:after="0" w:before="0"/>
-        <w:ind w:left="220"/>
-      </w:pPr>
-      <w:r>
-        <w:rPr>
-          <w:rFonts w:ascii="Consolas" w:cs="Consolas" w:eastAsia="Consolas" w:hAnsi="Consolas"/>
-          <w:sz w:val="19"/>
-          <w:szCs w:val="19"/>
-        </w:rPr>
-        <w:t xml:space="preserve">            case MORPION -&gt; new JeuMorpion();   //@G.29</w:t>
-      </w:r>
-    </w:p>
-    <w:p>
-      <w:pPr>
-        <w:keepLines/>
-        <w:shd w:fill="F2F2F2" w:val="clear"/>
-        <w:spacing w:after="0" w:before="0"/>
-        <w:ind w:left="220"/>
-      </w:pPr>
-      <w:r>
-        <w:rPr>
-          <w:rFonts w:ascii="Consolas" w:cs="Consolas" w:eastAsia="Consolas" w:hAnsi="Consolas"/>
-          <w:sz w:val="19"/>
-          <w:szCs w:val="19"/>
-        </w:rPr>
-        <w:t xml:space="preserve">            case PUISSANCE4 -&gt; new JeuPuissance4();   //@G.30</w:t>
-      </w:r>
-    </w:p>
-    <w:p>
-      <w:pPr>
-        <w:keepLines/>
-        <w:shd w:fill="F2F2F2" w:val="clear"/>
-        <w:spacing w:after="0" w:before="0"/>
-        <w:ind w:left="220"/>
-      </w:pPr>
-      <w:r>
-        <w:rPr>
-          <w:rFonts w:ascii="Consolas" w:cs="Consolas" w:eastAsia="Consolas" w:hAnsi="Consolas"/>
-          <w:sz w:val="19"/>
-          <w:szCs w:val="19"/>
-        </w:rPr>
-        <w:t xml:space="preserve"> </w:t>
-      </w:r>
-    </w:p>
-    <w:p>
-      <w:pPr>
-        <w:keepLines/>
-        <w:shd w:fill="F2F2F2" w:val="clear"/>
-        <w:spacing w:after="0" w:before="0"/>
-        <w:ind w:left="220"/>
-      </w:pPr>
-      <w:r>
-        <w:rPr>
-          <w:rFonts w:ascii="Consolas" w:cs="Consolas" w:eastAsia="Consolas" w:hAnsi="Consolas"/>
-          <w:sz w:val="19"/>
-          <w:szCs w:val="19"/>
-        </w:rPr>
-        <w:t xml:space="preserve">            // Un switch sur une enumeration doit couvrir toutes ses</w:t>
-      </w:r>
-    </w:p>
-    <w:p>
-      <w:pPr>
-        <w:keepLines/>
-        <w:shd w:fill="F2F2F2" w:val="clear"/>
-        <w:spacing w:after="0" w:before="0"/>
-        <w:ind w:left="220"/>
-      </w:pPr>
-      <w:r>
-        <w:rPr>
-          <w:rFonts w:ascii="Consolas" w:cs="Consolas" w:eastAsia="Consolas" w:hAnsi="Consolas"/>
-          <w:sz w:val="19"/>
-          <w:szCs w:val="19"/>
-        </w:rPr>
-        <w:t xml:space="preserve">            // valeurs. Ce cas absorbe celles qui n'ont pas encore de jeu.</w:t>
-      </w:r>
-    </w:p>
-    <w:p>
-      <w:pPr>
-        <w:keepLines/>
-        <w:shd w:fill="F2F2F2" w:val="clear"/>
-        <w:spacing w:after="0" w:before="0"/>
-        <w:ind w:left="220"/>
-      </w:pPr>
-      <w:r>
-        <w:rPr>
-          <w:rFonts w:ascii="Consolas" w:cs="Consolas" w:eastAsia="Consolas" w:hAnsi="Consolas"/>
-          <w:sz w:val="19"/>
-          <w:szCs w:val="19"/>
-        </w:rPr>
-        <w:t xml:space="preserve">            default -&gt; throw new UnsupportedOperationException(</w:t>
-      </w:r>
-    </w:p>
-    <w:p>
-      <w:pPr>
-        <w:keepLines/>
-        <w:shd w:fill="F2F2F2" w:val="clear"/>
-        <w:spacing w:after="0" w:before="0"/>
-        <w:ind w:left="220"/>
-      </w:pPr>
-      <w:r>
-        <w:rPr>
-          <w:rFonts w:ascii="Consolas" w:cs="Consolas" w:eastAsia="Consolas" w:hAnsi="Consolas"/>
-          <w:sz w:val="19"/>
-          <w:szCs w:val="19"/>
-        </w:rPr>
-        <w:t xml:space="preserve">                    type + " n'est pas encore implemente");</w:t>
-      </w:r>
-    </w:p>
-    <w:p>
-      <w:pPr>
-        <w:keepLines/>
-        <w:shd w:fill="F2F2F2" w:val="clear"/>
-        <w:spacing w:after="0" w:before="0"/>
-        <w:ind w:left="220"/>
-      </w:pPr>
-      <w:r>
-        <w:rPr>
-          <w:rFonts w:ascii="Consolas" w:cs="Consolas" w:eastAsia="Consolas" w:hAnsi="Consolas"/>
-          <w:sz w:val="19"/>
-          <w:szCs w:val="19"/>
-        </w:rPr>
-        <w:t xml:space="preserve">        };</w:t>
+        <w:t xml:space="preserve">        //@G.18-G.31 return switch (type) {</w:t>
+      </w:r>
+    </w:p>
+    <w:p>
+      <w:pPr>
+        <w:keepLines/>
+        <w:shd w:fill="F2F2F2" w:val="clear"/>
+        <w:spacing w:after="0" w:before="0"/>
+        <w:ind w:left="220"/>
+      </w:pPr>
+      <w:r>
+        <w:rPr>
+          <w:rFonts w:ascii="Consolas" w:cs="Consolas" w:eastAsia="Consolas" w:hAnsi="Consolas"/>
+          <w:sz w:val="19"/>
+          <w:szCs w:val="19"/>
+        </w:rPr>
+        <w:t xml:space="preserve">            //@G.18-G.31 case NIM -&gt; new JeuNim(ALLUMETTES_NIM, new ReglesNim());</w:t>
+      </w:r>
+    </w:p>
+    <w:p>
+      <w:pPr>
+        <w:keepLines/>
+        <w:shd w:fill="F2F2F2" w:val="clear"/>
+        <w:spacing w:after="0" w:before="0"/>
+        <w:ind w:left="220"/>
+      </w:pPr>
+      <w:r>
+        <w:rPr>
+          <w:rFonts w:ascii="Consolas" w:cs="Consolas" w:eastAsia="Consolas" w:hAnsi="Consolas"/>
+          <w:sz w:val="19"/>
+          <w:szCs w:val="19"/>
+        </w:rPr>
+        <w:t xml:space="preserve">            //@G.27-G.31 case BATAILLE -&gt; new JeuBatailleV1();</w:t>
+      </w:r>
+    </w:p>
+    <w:p>
+      <w:pPr>
+        <w:keepLines/>
+        <w:shd w:fill="F2F2F2" w:val="clear"/>
+        <w:spacing w:after="0" w:before="0"/>
+        <w:ind w:left="220"/>
+      </w:pPr>
+      <w:r>
+        <w:rPr>
+          <w:rFonts w:ascii="Consolas" w:cs="Consolas" w:eastAsia="Consolas" w:hAnsi="Consolas"/>
+          <w:sz w:val="19"/>
+          <w:szCs w:val="19"/>
+        </w:rPr>
+        <w:t xml:space="preserve">            //@G.28-G.31 case DEVINE_LE_NOMBRE -&gt; new JeuDevineLeNombre();</w:t>
+      </w:r>
+    </w:p>
+    <w:p>
+      <w:pPr>
+        <w:keepLines/>
+        <w:shd w:fill="F2F2F2" w:val="clear"/>
+        <w:spacing w:after="0" w:before="0"/>
+        <w:ind w:left="220"/>
+      </w:pPr>
+      <w:r>
+        <w:rPr>
+          <w:rFonts w:ascii="Consolas" w:cs="Consolas" w:eastAsia="Consolas" w:hAnsi="Consolas"/>
+          <w:sz w:val="19"/>
+          <w:szCs w:val="19"/>
+        </w:rPr>
+        <w:t xml:space="preserve">            //@G.29-G.31 case MORPION -&gt; new JeuMorpion();</w:t>
+      </w:r>
+    </w:p>
+    <w:p>
+      <w:pPr>
+        <w:keepLines/>
+        <w:shd w:fill="F2F2F2" w:val="clear"/>
+        <w:spacing w:after="0" w:before="0"/>
+        <w:ind w:left="220"/>
+      </w:pPr>
+      <w:r>
+        <w:rPr>
+          <w:rFonts w:ascii="Consolas" w:cs="Consolas" w:eastAsia="Consolas" w:hAnsi="Consolas"/>
+          <w:sz w:val="19"/>
+          <w:szCs w:val="19"/>
+        </w:rPr>
+        <w:t xml:space="preserve">            //@G.30-G.31 case PUISSANCE4 -&gt; new JeuPuissance4();</w:t>
+      </w:r>
+    </w:p>
+    <w:p>
+      <w:pPr>
+        <w:keepLines/>
+        <w:shd w:fill="F2F2F2" w:val="clear"/>
+        <w:spacing w:after="0" w:before="0"/>
+        <w:ind w:left="220"/>
+      </w:pPr>
+      <w:r>
+        <w:rPr>
+          <w:rFonts w:ascii="Consolas" w:cs="Consolas" w:eastAsia="Consolas" w:hAnsi="Consolas"/>
+          <w:sz w:val="19"/>
+          <w:szCs w:val="19"/>
+        </w:rPr>
+        <w:t xml:space="preserve">            //@G.18-G.31 // Un switch sur une enumeration doit couvrir toutes ses</w:t>
+      </w:r>
+    </w:p>
+    <w:p>
+      <w:pPr>
+        <w:keepLines/>
+        <w:shd w:fill="F2F2F2" w:val="clear"/>
+        <w:spacing w:after="0" w:before="0"/>
+        <w:ind w:left="220"/>
+      </w:pPr>
+      <w:r>
+        <w:rPr>
+          <w:rFonts w:ascii="Consolas" w:cs="Consolas" w:eastAsia="Consolas" w:hAnsi="Consolas"/>
+          <w:sz w:val="19"/>
+          <w:szCs w:val="19"/>
+        </w:rPr>
+        <w:t xml:space="preserve">            //@G.18-G.31 // valeurs. Ce cas absorbe celles qui n'ont pas encore de jeu.</w:t>
+      </w:r>
+    </w:p>
+    <w:p>
+      <w:pPr>
+        <w:keepLines/>
+        <w:shd w:fill="F2F2F2" w:val="clear"/>
+        <w:spacing w:after="0" w:before="0"/>
+        <w:ind w:left="220"/>
+      </w:pPr>
+      <w:r>
+        <w:rPr>
+          <w:rFonts w:ascii="Consolas" w:cs="Consolas" w:eastAsia="Consolas" w:hAnsi="Consolas"/>
+          <w:sz w:val="19"/>
+          <w:szCs w:val="19"/>
+        </w:rPr>
+        <w:t xml:space="preserve">            //@G.18-G.31 default -&gt; throw new UnsupportedOperationException(</w:t>
+      </w:r>
+    </w:p>
+    <w:p>
+      <w:pPr>
+        <w:keepLines/>
+        <w:shd w:fill="F2F2F2" w:val="clear"/>
+        <w:spacing w:after="0" w:before="0"/>
+        <w:ind w:left="220"/>
+      </w:pPr>
+      <w:r>
+        <w:rPr>
+          <w:rFonts w:ascii="Consolas" w:cs="Consolas" w:eastAsia="Consolas" w:hAnsi="Consolas"/>
+          <w:sz w:val="19"/>
+          <w:szCs w:val="19"/>
+        </w:rPr>
+        <w:t xml:space="preserve">                    //@G.18-G.31 type + " n'est pas encore implemente");</w:t>
+      </w:r>
+    </w:p>
+    <w:p>
+      <w:pPr>
+        <w:keepLines/>
+        <w:shd w:fill="F2F2F2" w:val="clear"/>
+        <w:spacing w:after="0" w:before="0"/>
+        <w:ind w:left="220"/>
+      </w:pPr>
+      <w:r>
+        <w:rPr>
+          <w:rFonts w:ascii="Consolas" w:cs="Consolas" w:eastAsia="Consolas" w:hAnsi="Consolas"/>
+          <w:sz w:val="19"/>
+          <w:szCs w:val="19"/>
+        </w:rPr>
+        <w:t xml:space="preserve">        //@G.18-G.31 };</w:t>
+      </w:r>
+    </w:p>
+    <w:p>
+      <w:pPr>
+        <w:keepLines/>
+        <w:shd w:fill="F2F2F2" w:val="clear"/>
+        <w:spacing w:after="0" w:before="0"/>
+        <w:ind w:left="220"/>
+      </w:pPr>
+      <w:r>
+        <w:rPr>
+          <w:rFonts w:ascii="Consolas" w:cs="Consolas" w:eastAsia="Consolas" w:hAnsi="Consolas"/>
+          <w:sz w:val="19"/>
+          <w:szCs w:val="19"/>
+        </w:rPr>
+        <w:t xml:space="preserve">        Supplier&lt;Jeu&gt; fabrication = CATALOGUE.get(type);   //@G.32</w:t>
+      </w:r>
+    </w:p>
+    <w:p>
+      <w:pPr>
+        <w:keepLines/>
+        <w:shd w:fill="F2F2F2" w:val="clear"/>
+        <w:spacing w:after="0" w:before="0"/>
+        <w:ind w:left="220"/>
+      </w:pPr>
+      <w:r>
+        <w:rPr>
+          <w:rFonts w:ascii="Consolas" w:cs="Consolas" w:eastAsia="Consolas" w:hAnsi="Consolas"/>
+          <w:sz w:val="19"/>
+          <w:szCs w:val="19"/>
+        </w:rPr>
+        <w:t xml:space="preserve">        if (fabrication == null) {   //@G.32</w:t>
+      </w:r>
+    </w:p>
+    <w:p>
+      <w:pPr>
+        <w:keepLines/>
+        <w:shd w:fill="F2F2F2" w:val="clear"/>
+        <w:spacing w:after="0" w:before="0"/>
+        <w:ind w:left="220"/>
+      </w:pPr>
+      <w:r>
+        <w:rPr>
+          <w:rFonts w:ascii="Consolas" w:cs="Consolas" w:eastAsia="Consolas" w:hAnsi="Consolas"/>
+          <w:sz w:val="19"/>
+          <w:szCs w:val="19"/>
+        </w:rPr>
+        <w:t xml:space="preserve">            throw new UnsupportedOperationException(type + " n'est pas encore implemente");   //@G.32</w:t>
+      </w:r>
+    </w:p>
+    <w:p>
+      <w:pPr>
+        <w:keepLines/>
+        <w:shd w:fill="F2F2F2" w:val="clear"/>
+        <w:spacing w:after="0" w:before="0"/>
+        <w:ind w:left="220"/>
+      </w:pPr>
+      <w:r>
+        <w:rPr>
+          <w:rFonts w:ascii="Consolas" w:cs="Consolas" w:eastAsia="Consolas" w:hAnsi="Consolas"/>
+          <w:sz w:val="19"/>
+          <w:szCs w:val="19"/>
+        </w:rPr>
+        <w:t xml:space="preserve">        }   //@G.32</w:t>
+      </w:r>
+    </w:p>
+    <w:p>
+      <w:pPr>
+        <w:keepLines/>
+        <w:shd w:fill="F2F2F2" w:val="clear"/>
+        <w:spacing w:after="0" w:before="0"/>
+        <w:ind w:left="220"/>
+      </w:pPr>
+      <w:r>
+        <w:rPr>
+          <w:rFonts w:ascii="Consolas" w:cs="Consolas" w:eastAsia="Consolas" w:hAnsi="Consolas"/>
+          <w:sz w:val="19"/>
+          <w:szCs w:val="19"/>
+        </w:rPr>
+        <w:t xml:space="preserve">        return fabrication.get();   //@G.32</w:t>
       </w:r>
     </w:p>
     <w:p>
@@ -7238,23 +7430,55 @@
           <w:sz w:val="19"/>
           <w:szCs w:val="19"/>
         </w:rPr>
-        <w:t xml:space="preserve">    private StrategieNim strategieJoueur1 = new StrategieTimide();</w:t>
-      </w:r>
-    </w:p>
-    <w:p>
-      <w:pPr>
-        <w:keepLines/>
-        <w:shd w:fill="F2F2F2" w:val="clear"/>
-        <w:spacing w:after="0" w:before="0"/>
-        <w:ind w:left="220"/>
-      </w:pPr>
-      <w:r>
-        <w:rPr>
-          <w:rFonts w:ascii="Consolas" w:cs="Consolas" w:eastAsia="Consolas" w:hAnsi="Consolas"/>
-          <w:sz w:val="19"/>
-          <w:szCs w:val="19"/>
-        </w:rPr>
-        <w:t xml:space="preserve">    private StrategieNim strategieJoueur2 = new StrategieTimide();</w:t>
+        <w:t xml:space="preserve">    //@G.18-G.30 private StrategieNim strategieJoueur1 = new StrategieTimide();</w:t>
+      </w:r>
+    </w:p>
+    <w:p>
+      <w:pPr>
+        <w:keepLines/>
+        <w:shd w:fill="F2F2F2" w:val="clear"/>
+        <w:spacing w:after="0" w:before="0"/>
+        <w:ind w:left="220"/>
+      </w:pPr>
+      <w:r>
+        <w:rPr>
+          <w:rFonts w:ascii="Consolas" w:cs="Consolas" w:eastAsia="Consolas" w:hAnsi="Consolas"/>
+          <w:sz w:val="19"/>
+          <w:szCs w:val="19"/>
+        </w:rPr>
+        <w:t xml:space="preserve">    //@G.18-G.30 private StrategieNim strategieJoueur2 = new StrategieTimide();</w:t>
+      </w:r>
+    </w:p>
+    <w:p>
+      <w:pPr>
+        <w:keepLines/>
+        <w:shd w:fill="F2F2F2" w:val="clear"/>
+        <w:spacing w:after="0" w:before="0"/>
+        <w:ind w:left="220"/>
+      </w:pPr>
+      <w:r>
+        <w:rPr>
+          <w:rFonts w:ascii="Consolas" w:cs="Consolas" w:eastAsia="Consolas" w:hAnsi="Consolas"/>
+          <w:sz w:val="19"/>
+          <w:szCs w:val="19"/>
+        </w:rPr>
+        <w:t xml:space="preserve">    private ParJoueur&lt;StrategieNim&gt; strategies =   //@G.31</w:t>
+      </w:r>
+    </w:p>
+    <w:p>
+      <w:pPr>
+        <w:keepLines/>
+        <w:shd w:fill="F2F2F2" w:val="clear"/>
+        <w:spacing w:after="0" w:before="0"/>
+        <w:ind w:left="220"/>
+      </w:pPr>
+      <w:r>
+        <w:rPr>
+          <w:rFonts w:ascii="Consolas" w:cs="Consolas" w:eastAsia="Consolas" w:hAnsi="Consolas"/>
+          <w:sz w:val="19"/>
+          <w:szCs w:val="19"/>
+        </w:rPr>
+        <w:t xml:space="preserve">            new ParJoueur&lt;&gt;(new StrategieTimide(), new StrategieTimide());   //@G.31</w:t>
       </w:r>
     </w:p>
     <w:p>
@@ -7494,23 +7718,55 @@
           <w:sz w:val="19"/>
           <w:szCs w:val="19"/>
         </w:rPr>
-        <w:t xml:space="preserve">        strategieJoueur1 = demanderStrategie(entree, "premier");</w:t>
-      </w:r>
-    </w:p>
-    <w:p>
-      <w:pPr>
-        <w:keepLines/>
-        <w:shd w:fill="F2F2F2" w:val="clear"/>
-        <w:spacing w:after="0" w:before="0"/>
-        <w:ind w:left="220"/>
-      </w:pPr>
-      <w:r>
-        <w:rPr>
-          <w:rFonts w:ascii="Consolas" w:cs="Consolas" w:eastAsia="Consolas" w:hAnsi="Consolas"/>
-          <w:sz w:val="19"/>
-          <w:szCs w:val="19"/>
-        </w:rPr>
-        <w:t xml:space="preserve">        strategieJoueur2 = demanderStrategie(entree, "second");</w:t>
+        <w:t xml:space="preserve">        //@G.20-G.30 strategieJoueur1 = demanderStrategie(entree, "premier");</w:t>
+      </w:r>
+    </w:p>
+    <w:p>
+      <w:pPr>
+        <w:keepLines/>
+        <w:shd w:fill="F2F2F2" w:val="clear"/>
+        <w:spacing w:after="0" w:before="0"/>
+        <w:ind w:left="220"/>
+      </w:pPr>
+      <w:r>
+        <w:rPr>
+          <w:rFonts w:ascii="Consolas" w:cs="Consolas" w:eastAsia="Consolas" w:hAnsi="Consolas"/>
+          <w:sz w:val="19"/>
+          <w:szCs w:val="19"/>
+        </w:rPr>
+        <w:t xml:space="preserve">        //@G.20-G.30 strategieJoueur2 = demanderStrategie(entree, "second");</w:t>
+      </w:r>
+    </w:p>
+    <w:p>
+      <w:pPr>
+        <w:keepLines/>
+        <w:shd w:fill="F2F2F2" w:val="clear"/>
+        <w:spacing w:after="0" w:before="0"/>
+        <w:ind w:left="220"/>
+      </w:pPr>
+      <w:r>
+        <w:rPr>
+          <w:rFonts w:ascii="Consolas" w:cs="Consolas" w:eastAsia="Consolas" w:hAnsi="Consolas"/>
+          <w:sz w:val="19"/>
+          <w:szCs w:val="19"/>
+        </w:rPr>
+        <w:t xml:space="preserve">        strategies = new ParJoueur&lt;&gt;(demanderStrategie(entree, "premier"),   //@G.31</w:t>
+      </w:r>
+    </w:p>
+    <w:p>
+      <w:pPr>
+        <w:keepLines/>
+        <w:shd w:fill="F2F2F2" w:val="clear"/>
+        <w:spacing w:after="0" w:before="0"/>
+        <w:ind w:left="220"/>
+      </w:pPr>
+      <w:r>
+        <w:rPr>
+          <w:rFonts w:ascii="Consolas" w:cs="Consolas" w:eastAsia="Consolas" w:hAnsi="Consolas"/>
+          <w:sz w:val="19"/>
+          <w:szCs w:val="19"/>
+        </w:rPr>
+        <w:t xml:space="preserve">                demanderStrategie(entree, "second"));   //@G.31</w:t>
       </w:r>
     </w:p>
     <w:p>
@@ -7974,6 +8230,22 @@
           <w:sz w:val="19"/>
           <w:szCs w:val="19"/>
         </w:rPr>
+        <w:t xml:space="preserve">        ParJoueur&lt;Joueur&gt; joueurs = new ParJoueur&lt;&gt;(joueur1, joueur2);   //@G.31</w:t>
+      </w:r>
+    </w:p>
+    <w:p>
+      <w:pPr>
+        <w:keepLines/>
+        <w:shd w:fill="F2F2F2" w:val="clear"/>
+        <w:spacing w:after="0" w:before="0"/>
+        <w:ind w:left="220"/>
+      </w:pPr>
+      <w:r>
+        <w:rPr>
+          <w:rFonts w:ascii="Consolas" w:cs="Consolas" w:eastAsia="Consolas" w:hAnsi="Consolas"/>
+          <w:sz w:val="19"/>
+          <w:szCs w:val="19"/>
+        </w:rPr>
         <w:t xml:space="preserve">        boolean auTourDuPremier = true;</w:t>
       </w:r>
     </w:p>
@@ -8070,23 +8342,55 @@
           <w:sz w:val="19"/>
           <w:szCs w:val="19"/>
         </w:rPr>
-        <w:t xml:space="preserve">            StrategieNim strategie = auTourDuPremier ? strategieJoueur1 : strategieJoueur2;</w:t>
-      </w:r>
-    </w:p>
-    <w:p>
-      <w:pPr>
-        <w:keepLines/>
-        <w:shd w:fill="F2F2F2" w:val="clear"/>
-        <w:spacing w:after="0" w:before="0"/>
-        <w:ind w:left="220"/>
-      </w:pPr>
-      <w:r>
-        <w:rPr>
-          <w:rFonts w:ascii="Consolas" w:cs="Consolas" w:eastAsia="Consolas" w:hAnsi="Consolas"/>
-          <w:sz w:val="19"/>
-          <w:szCs w:val="19"/>
-        </w:rPr>
-        <w:t xml:space="preserve">            Joueur joueur = auTourDuPremier ? joueur1 : joueur2;</w:t>
+        <w:t xml:space="preserve">            //@G.18-G.30 StrategieNim strategie = auTourDuPremier ? strategieJoueur1 : strategieJoueur2;</w:t>
+      </w:r>
+    </w:p>
+    <w:p>
+      <w:pPr>
+        <w:keepLines/>
+        <w:shd w:fill="F2F2F2" w:val="clear"/>
+        <w:spacing w:after="0" w:before="0"/>
+        <w:ind w:left="220"/>
+      </w:pPr>
+      <w:r>
+        <w:rPr>
+          <w:rFonts w:ascii="Consolas" w:cs="Consolas" w:eastAsia="Consolas" w:hAnsi="Consolas"/>
+          <w:sz w:val="19"/>
+          <w:szCs w:val="19"/>
+        </w:rPr>
+        <w:t xml:space="preserve">            //@G.18-G.30 Joueur joueur = auTourDuPremier ? joueur1 : joueur2;</w:t>
+      </w:r>
+    </w:p>
+    <w:p>
+      <w:pPr>
+        <w:keepLines/>
+        <w:shd w:fill="F2F2F2" w:val="clear"/>
+        <w:spacing w:after="0" w:before="0"/>
+        <w:ind w:left="220"/>
+      </w:pPr>
+      <w:r>
+        <w:rPr>
+          <w:rFonts w:ascii="Consolas" w:cs="Consolas" w:eastAsia="Consolas" w:hAnsi="Consolas"/>
+          <w:sz w:val="19"/>
+          <w:szCs w:val="19"/>
+        </w:rPr>
+        <w:t xml:space="preserve">            StrategieNim strategie = strategies.selon(auTourDuPremier);   //@G.31</w:t>
+      </w:r>
+    </w:p>
+    <w:p>
+      <w:pPr>
+        <w:keepLines/>
+        <w:shd w:fill="F2F2F2" w:val="clear"/>
+        <w:spacing w:after="0" w:before="0"/>
+        <w:ind w:left="220"/>
+      </w:pPr>
+      <w:r>
+        <w:rPr>
+          <w:rFonts w:ascii="Consolas" w:cs="Consolas" w:eastAsia="Consolas" w:hAnsi="Consolas"/>
+          <w:sz w:val="19"/>
+          <w:szCs w:val="19"/>
+        </w:rPr>
+        <w:t xml:space="preserve">            Joueur joueur = joueurs.selon(auTourDuPremier);   //@G.31</w:t>
       </w:r>
     </w:p>
     <w:p>
@@ -15530,6 +15834,2784 @@
           <w:szCs w:val="17"/>
         </w:rPr>
         <w:t xml:space="preserve">Le jeu qui se joue seul — G.28.</w:t>
+      </w:r>
+    </w:p>
+    <w:p>
+      <w:r>
+        <w:br w:type="page"/>
+      </w:r>
+    </w:p>
+    <w:p>
+      <w:pPr>
+        <w:pStyle w:val="Heading1"/>
+        <w:keepNext/>
+        <w:spacing w:after="160" w:before="360"/>
+      </w:pPr>
+      <w:r>
+        <w:rPr>
+          <w:b/>
+          <w:bCs/>
+          <w:color w:val="1F4E79"/>
+          <w:sz w:val="30"/>
+          <w:szCs w:val="30"/>
+        </w:rPr>
+        <w:t xml:space="preserve">Septième partie — généricité et lambdas</w:t>
+      </w:r>
+    </w:p>
+    <w:p>
+      <w:pPr>
+        <w:keepNext/>
+        <w:spacing w:after="140" w:before="320"/>
+      </w:pPr>
+      <w:r>
+        <w:rPr>
+          <w:b/>
+          <w:bCs/>
+          <w:color w:val="7B9E4B"/>
+          <w:sz w:val="28"/>
+          <w:szCs w:val="28"/>
+        </w:rPr>
+        <w:t xml:space="preserve">G.31  </w:t>
+      </w:r>
+      <w:r>
+        <w:rPr>
+          <w:b/>
+          <w:bCs/>
+          <w:color w:val="1F4E79"/>
+          <w:sz w:val="28"/>
+          <w:szCs w:val="28"/>
+        </w:rPr>
+        <w:t xml:space="preserve">Un objet par joueur</w:t>
+      </w:r>
+    </w:p>
+    <w:p>
+      <w:pPr>
+        <w:spacing w:after="120"/>
+      </w:pPr>
+      <w:r>
+        <w:rPr>
+          <w:b/>
+          <w:bCs/>
+          <w:sz w:val="22"/>
+          <w:szCs w:val="22"/>
+        </w:rPr>
+        <w:t xml:space="preserve">La classe est immuable, et c'est un choix. </w:t>
+      </w:r>
+      <w:r>
+        <w:rPr>
+          <w:sz w:val="22"/>
+          <w:szCs w:val="22"/>
+        </w:rPr>
+        <w:t xml:space="preserve">Configurer les stratégies remplace la ParJoueur entière au lieu de modifier l'une de ses moitiés : il n'existe jamais d'état où une stratégie est neuve et l'autre ancienne.</w:t>
+      </w:r>
+    </w:p>
+    <w:p>
+      <w:pPr>
+        <w:spacing w:after="120"/>
+      </w:pPr>
+      <w:r>
+        <w:rPr>
+          <w:sz w:val="22"/>
+          <w:szCs w:val="22"/>
+        </w:rPr>
+        <w:t xml:space="preserve">La bataille garde ses deux pioches en paramètres jumeaux. Le corrigé n'y touche pas : les méthodes de V0 et V1 les reçoivent séparément, et les regrouper déplacerait la question sans la simplifier. C'est la dernière question de l'énoncé, et les deux réponses se défendent.</w:t>
+      </w:r>
+    </w:p>
+    <w:p>
+      <w:pPr>
+        <w:spacing w:after="40" w:before="160"/>
+      </w:pPr>
+      <w:r>
+        <w:rPr>
+          <w:rFonts w:ascii="Consolas" w:cs="Consolas" w:eastAsia="Consolas" w:hAnsi="Consolas"/>
+          <w:color w:val="595959"/>
+          <w:sz w:val="17"/>
+          <w:szCs w:val="17"/>
+        </w:rPr>
+        <w:t xml:space="preserve">modele/ParJoueur.java</w:t>
+      </w:r>
+    </w:p>
+    <w:p>
+      <w:pPr>
+        <w:keepLines/>
+        <w:shd w:fill="F2F2F2" w:val="clear"/>
+        <w:spacing w:after="0" w:before="100"/>
+        <w:ind w:left="220"/>
+      </w:pPr>
+      <w:r>
+        <w:rPr>
+          <w:rFonts w:ascii="Consolas" w:cs="Consolas" w:eastAsia="Consolas" w:hAnsi="Consolas"/>
+          <w:sz w:val="19"/>
+          <w:szCs w:val="19"/>
+        </w:rPr>
+        <w:t xml:space="preserve">//@G.31</w:t>
+      </w:r>
+    </w:p>
+    <w:p>
+      <w:pPr>
+        <w:keepLines/>
+        <w:shd w:fill="F2F2F2" w:val="clear"/>
+        <w:spacing w:after="0" w:before="0"/>
+        <w:ind w:left="220"/>
+      </w:pPr>
+      <w:r>
+        <w:rPr>
+          <w:rFonts w:ascii="Consolas" w:cs="Consolas" w:eastAsia="Consolas" w:hAnsi="Consolas"/>
+          <w:sz w:val="19"/>
+          <w:szCs w:val="19"/>
+        </w:rPr>
+        <w:t xml:space="preserve">public class ParJoueur&lt;T&gt; {</w:t>
+      </w:r>
+    </w:p>
+    <w:p>
+      <w:pPr>
+        <w:keepLines/>
+        <w:shd w:fill="F2F2F2" w:val="clear"/>
+        <w:spacing w:after="0" w:before="0"/>
+        <w:ind w:left="220"/>
+      </w:pPr>
+      <w:r>
+        <w:rPr>
+          <w:rFonts w:ascii="Consolas" w:cs="Consolas" w:eastAsia="Consolas" w:hAnsi="Consolas"/>
+          <w:sz w:val="19"/>
+          <w:szCs w:val="19"/>
+        </w:rPr>
+        <w:t xml:space="preserve"> </w:t>
+      </w:r>
+    </w:p>
+    <w:p>
+      <w:pPr>
+        <w:keepLines/>
+        <w:shd w:fill="F2F2F2" w:val="clear"/>
+        <w:spacing w:after="0" w:before="0"/>
+        <w:ind w:left="220"/>
+      </w:pPr>
+      <w:r>
+        <w:rPr>
+          <w:rFonts w:ascii="Consolas" w:cs="Consolas" w:eastAsia="Consolas" w:hAnsi="Consolas"/>
+          <w:sz w:val="19"/>
+          <w:szCs w:val="19"/>
+        </w:rPr>
+        <w:t xml:space="preserve">    private final T duPremier;</w:t>
+      </w:r>
+    </w:p>
+    <w:p>
+      <w:pPr>
+        <w:keepLines/>
+        <w:shd w:fill="F2F2F2" w:val="clear"/>
+        <w:spacing w:after="0" w:before="0"/>
+        <w:ind w:left="220"/>
+      </w:pPr>
+      <w:r>
+        <w:rPr>
+          <w:rFonts w:ascii="Consolas" w:cs="Consolas" w:eastAsia="Consolas" w:hAnsi="Consolas"/>
+          <w:sz w:val="19"/>
+          <w:szCs w:val="19"/>
+        </w:rPr>
+        <w:t xml:space="preserve">    private final T duSecond;</w:t>
+      </w:r>
+    </w:p>
+    <w:p>
+      <w:pPr>
+        <w:keepLines/>
+        <w:shd w:fill="F2F2F2" w:val="clear"/>
+        <w:spacing w:after="0" w:before="0"/>
+        <w:ind w:left="220"/>
+      </w:pPr>
+      <w:r>
+        <w:rPr>
+          <w:rFonts w:ascii="Consolas" w:cs="Consolas" w:eastAsia="Consolas" w:hAnsi="Consolas"/>
+          <w:sz w:val="19"/>
+          <w:szCs w:val="19"/>
+        </w:rPr>
+        <w:t xml:space="preserve"> </w:t>
+      </w:r>
+    </w:p>
+    <w:p>
+      <w:pPr>
+        <w:keepLines/>
+        <w:shd w:fill="F2F2F2" w:val="clear"/>
+        <w:spacing w:after="0" w:before="0"/>
+        <w:ind w:left="220"/>
+      </w:pPr>
+      <w:r>
+        <w:rPr>
+          <w:rFonts w:ascii="Consolas" w:cs="Consolas" w:eastAsia="Consolas" w:hAnsi="Consolas"/>
+          <w:sz w:val="19"/>
+          <w:szCs w:val="19"/>
+        </w:rPr>
+        <w:t xml:space="preserve">    public ParJoueur(T duPremier, T duSecond) {</w:t>
+      </w:r>
+    </w:p>
+    <w:p>
+      <w:pPr>
+        <w:keepLines/>
+        <w:shd w:fill="F2F2F2" w:val="clear"/>
+        <w:spacing w:after="0" w:before="0"/>
+        <w:ind w:left="220"/>
+      </w:pPr>
+      <w:r>
+        <w:rPr>
+          <w:rFonts w:ascii="Consolas" w:cs="Consolas" w:eastAsia="Consolas" w:hAnsi="Consolas"/>
+          <w:sz w:val="19"/>
+          <w:szCs w:val="19"/>
+        </w:rPr>
+        <w:t xml:space="preserve">        this.duPremier = duPremier;</w:t>
+      </w:r>
+    </w:p>
+    <w:p>
+      <w:pPr>
+        <w:keepLines/>
+        <w:shd w:fill="F2F2F2" w:val="clear"/>
+        <w:spacing w:after="0" w:before="0"/>
+        <w:ind w:left="220"/>
+      </w:pPr>
+      <w:r>
+        <w:rPr>
+          <w:rFonts w:ascii="Consolas" w:cs="Consolas" w:eastAsia="Consolas" w:hAnsi="Consolas"/>
+          <w:sz w:val="19"/>
+          <w:szCs w:val="19"/>
+        </w:rPr>
+        <w:t xml:space="preserve">        this.duSecond = duSecond;</w:t>
+      </w:r>
+    </w:p>
+    <w:p>
+      <w:pPr>
+        <w:keepLines/>
+        <w:shd w:fill="F2F2F2" w:val="clear"/>
+        <w:spacing w:after="0" w:before="0"/>
+        <w:ind w:left="220"/>
+      </w:pPr>
+      <w:r>
+        <w:rPr>
+          <w:rFonts w:ascii="Consolas" w:cs="Consolas" w:eastAsia="Consolas" w:hAnsi="Consolas"/>
+          <w:sz w:val="19"/>
+          <w:szCs w:val="19"/>
+        </w:rPr>
+        <w:t xml:space="preserve">    }</w:t>
+      </w:r>
+    </w:p>
+    <w:p>
+      <w:pPr>
+        <w:keepLines/>
+        <w:shd w:fill="F2F2F2" w:val="clear"/>
+        <w:spacing w:after="0" w:before="0"/>
+        <w:ind w:left="220"/>
+      </w:pPr>
+      <w:r>
+        <w:rPr>
+          <w:rFonts w:ascii="Consolas" w:cs="Consolas" w:eastAsia="Consolas" w:hAnsi="Consolas"/>
+          <w:sz w:val="19"/>
+          <w:szCs w:val="19"/>
+        </w:rPr>
+        <w:t xml:space="preserve"> </w:t>
+      </w:r>
+    </w:p>
+    <w:p>
+      <w:pPr>
+        <w:keepLines/>
+        <w:shd w:fill="F2F2F2" w:val="clear"/>
+        <w:spacing w:after="0" w:before="0"/>
+        <w:ind w:left="220"/>
+      </w:pPr>
+      <w:r>
+        <w:rPr>
+          <w:rFonts w:ascii="Consolas" w:cs="Consolas" w:eastAsia="Consolas" w:hAnsi="Consolas"/>
+          <w:sz w:val="19"/>
+          <w:szCs w:val="19"/>
+        </w:rPr>
+        <w:t xml:space="preserve">    public T duPremier() {</w:t>
+      </w:r>
+    </w:p>
+    <w:p>
+      <w:pPr>
+        <w:keepLines/>
+        <w:shd w:fill="F2F2F2" w:val="clear"/>
+        <w:spacing w:after="0" w:before="0"/>
+        <w:ind w:left="220"/>
+      </w:pPr>
+      <w:r>
+        <w:rPr>
+          <w:rFonts w:ascii="Consolas" w:cs="Consolas" w:eastAsia="Consolas" w:hAnsi="Consolas"/>
+          <w:sz w:val="19"/>
+          <w:szCs w:val="19"/>
+        </w:rPr>
+        <w:t xml:space="preserve">        return duPremier;</w:t>
+      </w:r>
+    </w:p>
+    <w:p>
+      <w:pPr>
+        <w:keepLines/>
+        <w:shd w:fill="F2F2F2" w:val="clear"/>
+        <w:spacing w:after="0" w:before="0"/>
+        <w:ind w:left="220"/>
+      </w:pPr>
+      <w:r>
+        <w:rPr>
+          <w:rFonts w:ascii="Consolas" w:cs="Consolas" w:eastAsia="Consolas" w:hAnsi="Consolas"/>
+          <w:sz w:val="19"/>
+          <w:szCs w:val="19"/>
+        </w:rPr>
+        <w:t xml:space="preserve">    }</w:t>
+      </w:r>
+    </w:p>
+    <w:p>
+      <w:pPr>
+        <w:keepLines/>
+        <w:shd w:fill="F2F2F2" w:val="clear"/>
+        <w:spacing w:after="0" w:before="0"/>
+        <w:ind w:left="220"/>
+      </w:pPr>
+      <w:r>
+        <w:rPr>
+          <w:rFonts w:ascii="Consolas" w:cs="Consolas" w:eastAsia="Consolas" w:hAnsi="Consolas"/>
+          <w:sz w:val="19"/>
+          <w:szCs w:val="19"/>
+        </w:rPr>
+        <w:t xml:space="preserve"> </w:t>
+      </w:r>
+    </w:p>
+    <w:p>
+      <w:pPr>
+        <w:keepLines/>
+        <w:shd w:fill="F2F2F2" w:val="clear"/>
+        <w:spacing w:after="0" w:before="0"/>
+        <w:ind w:left="220"/>
+      </w:pPr>
+      <w:r>
+        <w:rPr>
+          <w:rFonts w:ascii="Consolas" w:cs="Consolas" w:eastAsia="Consolas" w:hAnsi="Consolas"/>
+          <w:sz w:val="19"/>
+          <w:szCs w:val="19"/>
+        </w:rPr>
+        <w:t xml:space="preserve">    public T duSecond() {</w:t>
+      </w:r>
+    </w:p>
+    <w:p>
+      <w:pPr>
+        <w:keepLines/>
+        <w:shd w:fill="F2F2F2" w:val="clear"/>
+        <w:spacing w:after="0" w:before="0"/>
+        <w:ind w:left="220"/>
+      </w:pPr>
+      <w:r>
+        <w:rPr>
+          <w:rFonts w:ascii="Consolas" w:cs="Consolas" w:eastAsia="Consolas" w:hAnsi="Consolas"/>
+          <w:sz w:val="19"/>
+          <w:szCs w:val="19"/>
+        </w:rPr>
+        <w:t xml:space="preserve">        return duSecond;</w:t>
+      </w:r>
+    </w:p>
+    <w:p>
+      <w:pPr>
+        <w:keepLines/>
+        <w:shd w:fill="F2F2F2" w:val="clear"/>
+        <w:spacing w:after="0" w:before="0"/>
+        <w:ind w:left="220"/>
+      </w:pPr>
+      <w:r>
+        <w:rPr>
+          <w:rFonts w:ascii="Consolas" w:cs="Consolas" w:eastAsia="Consolas" w:hAnsi="Consolas"/>
+          <w:sz w:val="19"/>
+          <w:szCs w:val="19"/>
+        </w:rPr>
+        <w:t xml:space="preserve">    }</w:t>
+      </w:r>
+    </w:p>
+    <w:p>
+      <w:pPr>
+        <w:keepLines/>
+        <w:shd w:fill="F2F2F2" w:val="clear"/>
+        <w:spacing w:after="0" w:before="0"/>
+        <w:ind w:left="220"/>
+      </w:pPr>
+      <w:r>
+        <w:rPr>
+          <w:rFonts w:ascii="Consolas" w:cs="Consolas" w:eastAsia="Consolas" w:hAnsi="Consolas"/>
+          <w:sz w:val="19"/>
+          <w:szCs w:val="19"/>
+        </w:rPr>
+        <w:t xml:space="preserve"> </w:t>
+      </w:r>
+    </w:p>
+    <w:p>
+      <w:pPr>
+        <w:keepLines/>
+        <w:shd w:fill="F2F2F2" w:val="clear"/>
+        <w:spacing w:after="0" w:before="0"/>
+        <w:ind w:left="220"/>
+      </w:pPr>
+      <w:r>
+        <w:rPr>
+          <w:rFonts w:ascii="Consolas" w:cs="Consolas" w:eastAsia="Consolas" w:hAnsi="Consolas"/>
+          <w:sz w:val="19"/>
+          <w:szCs w:val="19"/>
+        </w:rPr>
+        <w:t xml:space="preserve">    public T selon(boolean auTourDuPremier) {</w:t>
+      </w:r>
+    </w:p>
+    <w:p>
+      <w:pPr>
+        <w:keepLines/>
+        <w:shd w:fill="F2F2F2" w:val="clear"/>
+        <w:spacing w:after="0" w:before="0"/>
+        <w:ind w:left="220"/>
+      </w:pPr>
+      <w:r>
+        <w:rPr>
+          <w:rFonts w:ascii="Consolas" w:cs="Consolas" w:eastAsia="Consolas" w:hAnsi="Consolas"/>
+          <w:sz w:val="19"/>
+          <w:szCs w:val="19"/>
+        </w:rPr>
+        <w:t xml:space="preserve">        return auTourDuPremier ? duPremier : duSecond;</w:t>
+      </w:r>
+    </w:p>
+    <w:p>
+      <w:pPr>
+        <w:keepLines/>
+        <w:shd w:fill="F2F2F2" w:val="clear"/>
+        <w:spacing w:after="0" w:before="0"/>
+        <w:ind w:left="220"/>
+      </w:pPr>
+      <w:r>
+        <w:rPr>
+          <w:rFonts w:ascii="Consolas" w:cs="Consolas" w:eastAsia="Consolas" w:hAnsi="Consolas"/>
+          <w:sz w:val="19"/>
+          <w:szCs w:val="19"/>
+        </w:rPr>
+        <w:t xml:space="preserve">    }</w:t>
+      </w:r>
+    </w:p>
+    <w:p>
+      <w:pPr>
+        <w:keepLines/>
+        <w:shd w:fill="F2F2F2" w:val="clear"/>
+        <w:spacing w:after="160" w:before="0"/>
+        <w:ind w:left="220"/>
+      </w:pPr>
+      <w:r>
+        <w:rPr>
+          <w:rFonts w:ascii="Consolas" w:cs="Consolas" w:eastAsia="Consolas" w:hAnsi="Consolas"/>
+          <w:sz w:val="19"/>
+          <w:szCs w:val="19"/>
+        </w:rPr>
+        <w:t xml:space="preserve">}</w:t>
+      </w:r>
+    </w:p>
+    <w:p>
+      <w:pPr>
+        <w:keepNext/>
+        <w:spacing w:after="140" w:before="320"/>
+      </w:pPr>
+      <w:r>
+        <w:rPr>
+          <w:b/>
+          <w:bCs/>
+          <w:color w:val="7B9E4B"/>
+          <w:sz w:val="28"/>
+          <w:szCs w:val="28"/>
+        </w:rPr>
+        <w:t xml:space="preserve">G.32  </w:t>
+      </w:r>
+      <w:r>
+        <w:rPr>
+          <w:b/>
+          <w:bCs/>
+          <w:color w:val="1F4E79"/>
+          <w:sz w:val="28"/>
+          <w:szCs w:val="28"/>
+        </w:rPr>
+        <w:t xml:space="preserve">Une fabrique sans switch</w:t>
+      </w:r>
+    </w:p>
+    <w:p>
+      <w:pPr>
+        <w:spacing w:after="120"/>
+      </w:pPr>
+      <w:r>
+        <w:rPr>
+          <w:b/>
+          <w:bCs/>
+          <w:sz w:val="22"/>
+          <w:szCs w:val="22"/>
+        </w:rPr>
+        <w:t xml:space="preserve">Un Supplier et non un Jeu, </w:t>
+      </w:r>
+      <w:r>
+        <w:rPr>
+          <w:sz w:val="22"/>
+          <w:szCs w:val="22"/>
+        </w:rPr>
+        <w:t xml:space="preserve">parce qu'un jeu a un état : les stratégies configurées d'un Nim. Ranger un jeu tout fait dans la Map ferait jouer la deuxième partie avec la configuration de la première.</w:t>
+      </w:r>
+    </w:p>
+    <w:p>
+      <w:pPr>
+        <w:spacing w:after="120"/>
+      </w:pPr>
+      <w:r>
+        <w:rPr>
+          <w:sz w:val="22"/>
+          <w:szCs w:val="22"/>
+        </w:rPr>
+        <w:t xml:space="preserve">Le test du null remplace le default du switch. Toutes les valeurs de TypeJeu ont un jeu, il ne sert donc à rien aujourd'hui ; il coûte trois lignes et protège le jour où une valeur s'ajoute sans sa ligne au catalogue.</w:t>
+      </w:r>
+    </w:p>
+    <w:p>
+      <w:pPr>
+        <w:spacing w:after="40" w:before="160"/>
+      </w:pPr>
+      <w:r>
+        <w:rPr>
+          <w:rFonts w:ascii="Consolas" w:cs="Consolas" w:eastAsia="Consolas" w:hAnsi="Consolas"/>
+          <w:color w:val="595959"/>
+          <w:sz w:val="17"/>
+          <w:szCs w:val="17"/>
+        </w:rPr>
+        <w:t xml:space="preserve">jeux/JeuFactory.java</w:t>
+      </w:r>
+    </w:p>
+    <w:p>
+      <w:pPr>
+        <w:keepLines/>
+        <w:shd w:fill="F2F2F2" w:val="clear"/>
+        <w:spacing w:after="0" w:before="100"/>
+        <w:ind w:left="220"/>
+      </w:pPr>
+      <w:r>
+        <w:rPr>
+          <w:rFonts w:ascii="Consolas" w:cs="Consolas" w:eastAsia="Consolas" w:hAnsi="Consolas"/>
+          <w:sz w:val="19"/>
+          <w:szCs w:val="19"/>
+        </w:rPr>
+        <w:t xml:space="preserve">//@G.15</w:t>
+      </w:r>
+    </w:p>
+    <w:p>
+      <w:pPr>
+        <w:keepLines/>
+        <w:shd w:fill="F2F2F2" w:val="clear"/>
+        <w:spacing w:after="0" w:before="0"/>
+        <w:ind w:left="220"/>
+      </w:pPr>
+      <w:r>
+        <w:rPr>
+          <w:rFonts w:ascii="Consolas" w:cs="Consolas" w:eastAsia="Consolas" w:hAnsi="Consolas"/>
+          <w:sz w:val="19"/>
+          <w:szCs w:val="19"/>
+        </w:rPr>
+        <w:t xml:space="preserve">public class JeuFactory {</w:t>
+      </w:r>
+    </w:p>
+    <w:p>
+      <w:pPr>
+        <w:keepLines/>
+        <w:shd w:fill="F2F2F2" w:val="clear"/>
+        <w:spacing w:after="0" w:before="0"/>
+        <w:ind w:left="220"/>
+      </w:pPr>
+      <w:r>
+        <w:rPr>
+          <w:rFonts w:ascii="Consolas" w:cs="Consolas" w:eastAsia="Consolas" w:hAnsi="Consolas"/>
+          <w:sz w:val="19"/>
+          <w:szCs w:val="19"/>
+        </w:rPr>
+        <w:t xml:space="preserve"> </w:t>
+      </w:r>
+    </w:p>
+    <w:p>
+      <w:pPr>
+        <w:keepLines/>
+        <w:shd w:fill="F2F2F2" w:val="clear"/>
+        <w:spacing w:after="0" w:before="0"/>
+        <w:ind w:left="220"/>
+      </w:pPr>
+      <w:r>
+        <w:rPr>
+          <w:rFonts w:ascii="Consolas" w:cs="Consolas" w:eastAsia="Consolas" w:hAnsi="Consolas"/>
+          <w:sz w:val="19"/>
+          <w:szCs w:val="19"/>
+        </w:rPr>
+        <w:t xml:space="preserve">    private static final int ALLUMETTES_NIM = 13;   //@G.18</w:t>
+      </w:r>
+    </w:p>
+    <w:p>
+      <w:pPr>
+        <w:keepLines/>
+        <w:shd w:fill="F2F2F2" w:val="clear"/>
+        <w:spacing w:after="0" w:before="0"/>
+        <w:ind w:left="220"/>
+      </w:pPr>
+      <w:r>
+        <w:rPr>
+          <w:rFonts w:ascii="Consolas" w:cs="Consolas" w:eastAsia="Consolas" w:hAnsi="Consolas"/>
+          <w:sz w:val="19"/>
+          <w:szCs w:val="19"/>
+        </w:rPr>
+        <w:t xml:space="preserve"> </w:t>
+      </w:r>
+    </w:p>
+    <w:p>
+      <w:pPr>
+        <w:keepLines/>
+        <w:shd w:fill="F2F2F2" w:val="clear"/>
+        <w:spacing w:after="0" w:before="0"/>
+        <w:ind w:left="220"/>
+      </w:pPr>
+      <w:r>
+        <w:rPr>
+          <w:rFonts w:ascii="Consolas" w:cs="Consolas" w:eastAsia="Consolas" w:hAnsi="Consolas"/>
+          <w:sz w:val="19"/>
+          <w:szCs w:val="19"/>
+        </w:rPr>
+        <w:t xml:space="preserve">    // G.32 — la facon de fabriquer chaque jeu, rangee par type. Une valeur   //@G.32</w:t>
+      </w:r>
+    </w:p>
+    <w:p>
+      <w:pPr>
+        <w:keepLines/>
+        <w:shd w:fill="F2F2F2" w:val="clear"/>
+        <w:spacing w:after="0" w:before="0"/>
+        <w:ind w:left="220"/>
+      </w:pPr>
+      <w:r>
+        <w:rPr>
+          <w:rFonts w:ascii="Consolas" w:cs="Consolas" w:eastAsia="Consolas" w:hAnsi="Consolas"/>
+          <w:sz w:val="19"/>
+          <w:szCs w:val="19"/>
+        </w:rPr>
+        <w:t xml:space="preserve">    // n'est pas un jeu, c'est de quoi en fabriquer un neuf a chaque appel.   //@G.32</w:t>
+      </w:r>
+    </w:p>
+    <w:p>
+      <w:pPr>
+        <w:keepLines/>
+        <w:shd w:fill="F2F2F2" w:val="clear"/>
+        <w:spacing w:after="0" w:before="0"/>
+        <w:ind w:left="220"/>
+      </w:pPr>
+      <w:r>
+        <w:rPr>
+          <w:rFonts w:ascii="Consolas" w:cs="Consolas" w:eastAsia="Consolas" w:hAnsi="Consolas"/>
+          <w:sz w:val="19"/>
+          <w:szCs w:val="19"/>
+        </w:rPr>
+        <w:t xml:space="preserve">    private static final Map&lt;TypeJeu, Supplier&lt;Jeu&gt;&gt; CATALOGUE = Map.of(   //@G.32</w:t>
+      </w:r>
+    </w:p>
+    <w:p>
+      <w:pPr>
+        <w:keepLines/>
+        <w:shd w:fill="F2F2F2" w:val="clear"/>
+        <w:spacing w:after="0" w:before="0"/>
+        <w:ind w:left="220"/>
+      </w:pPr>
+      <w:r>
+        <w:rPr>
+          <w:rFonts w:ascii="Consolas" w:cs="Consolas" w:eastAsia="Consolas" w:hAnsi="Consolas"/>
+          <w:sz w:val="19"/>
+          <w:szCs w:val="19"/>
+        </w:rPr>
+        <w:t xml:space="preserve">            TypeJeu.NIM, () -&gt; new JeuNim(ALLUMETTES_NIM, new ReglesNim()),   //@G.32</w:t>
+      </w:r>
+    </w:p>
+    <w:p>
+      <w:pPr>
+        <w:keepLines/>
+        <w:shd w:fill="F2F2F2" w:val="clear"/>
+        <w:spacing w:after="0" w:before="0"/>
+        <w:ind w:left="220"/>
+      </w:pPr>
+      <w:r>
+        <w:rPr>
+          <w:rFonts w:ascii="Consolas" w:cs="Consolas" w:eastAsia="Consolas" w:hAnsi="Consolas"/>
+          <w:sz w:val="19"/>
+          <w:szCs w:val="19"/>
+        </w:rPr>
+        <w:t xml:space="preserve">            TypeJeu.BATAILLE, JeuBatailleV1::new,   //@G.32</w:t>
+      </w:r>
+    </w:p>
+    <w:p>
+      <w:pPr>
+        <w:keepLines/>
+        <w:shd w:fill="F2F2F2" w:val="clear"/>
+        <w:spacing w:after="0" w:before="0"/>
+        <w:ind w:left="220"/>
+      </w:pPr>
+      <w:r>
+        <w:rPr>
+          <w:rFonts w:ascii="Consolas" w:cs="Consolas" w:eastAsia="Consolas" w:hAnsi="Consolas"/>
+          <w:sz w:val="19"/>
+          <w:szCs w:val="19"/>
+        </w:rPr>
+        <w:t xml:space="preserve">            TypeJeu.DEVINE_LE_NOMBRE, JeuDevineLeNombre::new,   //@G.32</w:t>
+      </w:r>
+    </w:p>
+    <w:p>
+      <w:pPr>
+        <w:keepLines/>
+        <w:shd w:fill="F2F2F2" w:val="clear"/>
+        <w:spacing w:after="0" w:before="0"/>
+        <w:ind w:left="220"/>
+      </w:pPr>
+      <w:r>
+        <w:rPr>
+          <w:rFonts w:ascii="Consolas" w:cs="Consolas" w:eastAsia="Consolas" w:hAnsi="Consolas"/>
+          <w:sz w:val="19"/>
+          <w:szCs w:val="19"/>
+        </w:rPr>
+        <w:t xml:space="preserve">            TypeJeu.MORPION, JeuMorpion::new,   //@G.32</w:t>
+      </w:r>
+    </w:p>
+    <w:p>
+      <w:pPr>
+        <w:keepLines/>
+        <w:shd w:fill="F2F2F2" w:val="clear"/>
+        <w:spacing w:after="0" w:before="0"/>
+        <w:ind w:left="220"/>
+      </w:pPr>
+      <w:r>
+        <w:rPr>
+          <w:rFonts w:ascii="Consolas" w:cs="Consolas" w:eastAsia="Consolas" w:hAnsi="Consolas"/>
+          <w:sz w:val="19"/>
+          <w:szCs w:val="19"/>
+        </w:rPr>
+        <w:t xml:space="preserve">            TypeJeu.PUISSANCE4, JeuPuissance4::new);   //@G.32</w:t>
+      </w:r>
+    </w:p>
+    <w:p>
+      <w:pPr>
+        <w:keepLines/>
+        <w:shd w:fill="F2F2F2" w:val="clear"/>
+        <w:spacing w:after="0" w:before="0"/>
+        <w:ind w:left="220"/>
+      </w:pPr>
+      <w:r>
+        <w:rPr>
+          <w:rFonts w:ascii="Consolas" w:cs="Consolas" w:eastAsia="Consolas" w:hAnsi="Consolas"/>
+          <w:sz w:val="19"/>
+          <w:szCs w:val="19"/>
+        </w:rPr>
+        <w:t xml:space="preserve"> </w:t>
+      </w:r>
+    </w:p>
+    <w:p>
+      <w:pPr>
+        <w:keepLines/>
+        <w:shd w:fill="F2F2F2" w:val="clear"/>
+        <w:spacing w:after="0" w:before="0"/>
+        <w:ind w:left="220"/>
+      </w:pPr>
+      <w:r>
+        <w:rPr>
+          <w:rFonts w:ascii="Consolas" w:cs="Consolas" w:eastAsia="Consolas" w:hAnsi="Consolas"/>
+          <w:sz w:val="19"/>
+          <w:szCs w:val="19"/>
+        </w:rPr>
+        <w:t xml:space="preserve">    public Jeu creer(TypeJeu type) {</w:t>
+      </w:r>
+    </w:p>
+    <w:p>
+      <w:pPr>
+        <w:keepLines/>
+        <w:shd w:fill="F2F2F2" w:val="clear"/>
+        <w:spacing w:after="0" w:before="0"/>
+        <w:ind w:left="220"/>
+      </w:pPr>
+      <w:r>
+        <w:rPr>
+          <w:rFonts w:ascii="Consolas" w:cs="Consolas" w:eastAsia="Consolas" w:hAnsi="Consolas"/>
+          <w:sz w:val="19"/>
+          <w:szCs w:val="19"/>
+        </w:rPr>
+        <w:t xml:space="preserve">        //@G.15-G.17 throw new UnsupportedOperationException("Aucun jeu n'existe encore");</w:t>
+      </w:r>
+    </w:p>
+    <w:p>
+      <w:pPr>
+        <w:keepLines/>
+        <w:shd w:fill="F2F2F2" w:val="clear"/>
+        <w:spacing w:after="0" w:before="0"/>
+        <w:ind w:left="220"/>
+      </w:pPr>
+      <w:r>
+        <w:rPr>
+          <w:rFonts w:ascii="Consolas" w:cs="Consolas" w:eastAsia="Consolas" w:hAnsi="Consolas"/>
+          <w:sz w:val="19"/>
+          <w:szCs w:val="19"/>
+        </w:rPr>
+        <w:t xml:space="preserve">        //@G.18-G.31 return switch (type) {</w:t>
+      </w:r>
+    </w:p>
+    <w:p>
+      <w:pPr>
+        <w:keepLines/>
+        <w:shd w:fill="F2F2F2" w:val="clear"/>
+        <w:spacing w:after="0" w:before="0"/>
+        <w:ind w:left="220"/>
+      </w:pPr>
+      <w:r>
+        <w:rPr>
+          <w:rFonts w:ascii="Consolas" w:cs="Consolas" w:eastAsia="Consolas" w:hAnsi="Consolas"/>
+          <w:sz w:val="19"/>
+          <w:szCs w:val="19"/>
+        </w:rPr>
+        <w:t xml:space="preserve">            //@G.18-G.31 case NIM -&gt; new JeuNim(ALLUMETTES_NIM, new ReglesNim());</w:t>
+      </w:r>
+    </w:p>
+    <w:p>
+      <w:pPr>
+        <w:keepLines/>
+        <w:shd w:fill="F2F2F2" w:val="clear"/>
+        <w:spacing w:after="0" w:before="0"/>
+        <w:ind w:left="220"/>
+      </w:pPr>
+      <w:r>
+        <w:rPr>
+          <w:rFonts w:ascii="Consolas" w:cs="Consolas" w:eastAsia="Consolas" w:hAnsi="Consolas"/>
+          <w:sz w:val="19"/>
+          <w:szCs w:val="19"/>
+        </w:rPr>
+        <w:t xml:space="preserve">            //@G.27-G.31 case BATAILLE -&gt; new JeuBatailleV1();</w:t>
+      </w:r>
+    </w:p>
+    <w:p>
+      <w:pPr>
+        <w:keepLines/>
+        <w:shd w:fill="F2F2F2" w:val="clear"/>
+        <w:spacing w:after="0" w:before="0"/>
+        <w:ind w:left="220"/>
+      </w:pPr>
+      <w:r>
+        <w:rPr>
+          <w:rFonts w:ascii="Consolas" w:cs="Consolas" w:eastAsia="Consolas" w:hAnsi="Consolas"/>
+          <w:sz w:val="19"/>
+          <w:szCs w:val="19"/>
+        </w:rPr>
+        <w:t xml:space="preserve">            //@G.28-G.31 case DEVINE_LE_NOMBRE -&gt; new JeuDevineLeNombre();</w:t>
+      </w:r>
+    </w:p>
+    <w:p>
+      <w:pPr>
+        <w:keepLines/>
+        <w:shd w:fill="F2F2F2" w:val="clear"/>
+        <w:spacing w:after="0" w:before="0"/>
+        <w:ind w:left="220"/>
+      </w:pPr>
+      <w:r>
+        <w:rPr>
+          <w:rFonts w:ascii="Consolas" w:cs="Consolas" w:eastAsia="Consolas" w:hAnsi="Consolas"/>
+          <w:sz w:val="19"/>
+          <w:szCs w:val="19"/>
+        </w:rPr>
+        <w:t xml:space="preserve">            //@G.29-G.31 case MORPION -&gt; new JeuMorpion();</w:t>
+      </w:r>
+    </w:p>
+    <w:p>
+      <w:pPr>
+        <w:keepLines/>
+        <w:shd w:fill="F2F2F2" w:val="clear"/>
+        <w:spacing w:after="0" w:before="0"/>
+        <w:ind w:left="220"/>
+      </w:pPr>
+      <w:r>
+        <w:rPr>
+          <w:rFonts w:ascii="Consolas" w:cs="Consolas" w:eastAsia="Consolas" w:hAnsi="Consolas"/>
+          <w:sz w:val="19"/>
+          <w:szCs w:val="19"/>
+        </w:rPr>
+        <w:t xml:space="preserve">            //@G.30-G.31 case PUISSANCE4 -&gt; new JeuPuissance4();</w:t>
+      </w:r>
+    </w:p>
+    <w:p>
+      <w:pPr>
+        <w:keepLines/>
+        <w:shd w:fill="F2F2F2" w:val="clear"/>
+        <w:spacing w:after="0" w:before="0"/>
+        <w:ind w:left="220"/>
+      </w:pPr>
+      <w:r>
+        <w:rPr>
+          <w:rFonts w:ascii="Consolas" w:cs="Consolas" w:eastAsia="Consolas" w:hAnsi="Consolas"/>
+          <w:sz w:val="19"/>
+          <w:szCs w:val="19"/>
+        </w:rPr>
+        <w:t xml:space="preserve">            //@G.18-G.31 // Un switch sur une enumeration doit couvrir toutes ses</w:t>
+      </w:r>
+    </w:p>
+    <w:p>
+      <w:pPr>
+        <w:keepLines/>
+        <w:shd w:fill="F2F2F2" w:val="clear"/>
+        <w:spacing w:after="0" w:before="0"/>
+        <w:ind w:left="220"/>
+      </w:pPr>
+      <w:r>
+        <w:rPr>
+          <w:rFonts w:ascii="Consolas" w:cs="Consolas" w:eastAsia="Consolas" w:hAnsi="Consolas"/>
+          <w:sz w:val="19"/>
+          <w:szCs w:val="19"/>
+        </w:rPr>
+        <w:t xml:space="preserve">            //@G.18-G.31 // valeurs. Ce cas absorbe celles qui n'ont pas encore de jeu.</w:t>
+      </w:r>
+    </w:p>
+    <w:p>
+      <w:pPr>
+        <w:keepLines/>
+        <w:shd w:fill="F2F2F2" w:val="clear"/>
+        <w:spacing w:after="0" w:before="0"/>
+        <w:ind w:left="220"/>
+      </w:pPr>
+      <w:r>
+        <w:rPr>
+          <w:rFonts w:ascii="Consolas" w:cs="Consolas" w:eastAsia="Consolas" w:hAnsi="Consolas"/>
+          <w:sz w:val="19"/>
+          <w:szCs w:val="19"/>
+        </w:rPr>
+        <w:t xml:space="preserve">            //@G.18-G.31 default -&gt; throw new UnsupportedOperationException(</w:t>
+      </w:r>
+    </w:p>
+    <w:p>
+      <w:pPr>
+        <w:keepLines/>
+        <w:shd w:fill="F2F2F2" w:val="clear"/>
+        <w:spacing w:after="0" w:before="0"/>
+        <w:ind w:left="220"/>
+      </w:pPr>
+      <w:r>
+        <w:rPr>
+          <w:rFonts w:ascii="Consolas" w:cs="Consolas" w:eastAsia="Consolas" w:hAnsi="Consolas"/>
+          <w:sz w:val="19"/>
+          <w:szCs w:val="19"/>
+        </w:rPr>
+        <w:t xml:space="preserve">                    //@G.18-G.31 type + " n'est pas encore implemente");</w:t>
+      </w:r>
+    </w:p>
+    <w:p>
+      <w:pPr>
+        <w:keepLines/>
+        <w:shd w:fill="F2F2F2" w:val="clear"/>
+        <w:spacing w:after="0" w:before="0"/>
+        <w:ind w:left="220"/>
+      </w:pPr>
+      <w:r>
+        <w:rPr>
+          <w:rFonts w:ascii="Consolas" w:cs="Consolas" w:eastAsia="Consolas" w:hAnsi="Consolas"/>
+          <w:sz w:val="19"/>
+          <w:szCs w:val="19"/>
+        </w:rPr>
+        <w:t xml:space="preserve">        //@G.18-G.31 };</w:t>
+      </w:r>
+    </w:p>
+    <w:p>
+      <w:pPr>
+        <w:keepLines/>
+        <w:shd w:fill="F2F2F2" w:val="clear"/>
+        <w:spacing w:after="0" w:before="0"/>
+        <w:ind w:left="220"/>
+      </w:pPr>
+      <w:r>
+        <w:rPr>
+          <w:rFonts w:ascii="Consolas" w:cs="Consolas" w:eastAsia="Consolas" w:hAnsi="Consolas"/>
+          <w:sz w:val="19"/>
+          <w:szCs w:val="19"/>
+        </w:rPr>
+        <w:t xml:space="preserve">        Supplier&lt;Jeu&gt; fabrication = CATALOGUE.get(type);   //@G.32</w:t>
+      </w:r>
+    </w:p>
+    <w:p>
+      <w:pPr>
+        <w:keepLines/>
+        <w:shd w:fill="F2F2F2" w:val="clear"/>
+        <w:spacing w:after="0" w:before="0"/>
+        <w:ind w:left="220"/>
+      </w:pPr>
+      <w:r>
+        <w:rPr>
+          <w:rFonts w:ascii="Consolas" w:cs="Consolas" w:eastAsia="Consolas" w:hAnsi="Consolas"/>
+          <w:sz w:val="19"/>
+          <w:szCs w:val="19"/>
+        </w:rPr>
+        <w:t xml:space="preserve">        if (fabrication == null) {   //@G.32</w:t>
+      </w:r>
+    </w:p>
+    <w:p>
+      <w:pPr>
+        <w:keepLines/>
+        <w:shd w:fill="F2F2F2" w:val="clear"/>
+        <w:spacing w:after="0" w:before="0"/>
+        <w:ind w:left="220"/>
+      </w:pPr>
+      <w:r>
+        <w:rPr>
+          <w:rFonts w:ascii="Consolas" w:cs="Consolas" w:eastAsia="Consolas" w:hAnsi="Consolas"/>
+          <w:sz w:val="19"/>
+          <w:szCs w:val="19"/>
+        </w:rPr>
+        <w:t xml:space="preserve">            throw new UnsupportedOperationException(type + " n'est pas encore implemente");   //@G.32</w:t>
+      </w:r>
+    </w:p>
+    <w:p>
+      <w:pPr>
+        <w:keepLines/>
+        <w:shd w:fill="F2F2F2" w:val="clear"/>
+        <w:spacing w:after="0" w:before="0"/>
+        <w:ind w:left="220"/>
+      </w:pPr>
+      <w:r>
+        <w:rPr>
+          <w:rFonts w:ascii="Consolas" w:cs="Consolas" w:eastAsia="Consolas" w:hAnsi="Consolas"/>
+          <w:sz w:val="19"/>
+          <w:szCs w:val="19"/>
+        </w:rPr>
+        <w:t xml:space="preserve">        }   //@G.32</w:t>
+      </w:r>
+    </w:p>
+    <w:p>
+      <w:pPr>
+        <w:keepLines/>
+        <w:shd w:fill="F2F2F2" w:val="clear"/>
+        <w:spacing w:after="0" w:before="0"/>
+        <w:ind w:left="220"/>
+      </w:pPr>
+      <w:r>
+        <w:rPr>
+          <w:rFonts w:ascii="Consolas" w:cs="Consolas" w:eastAsia="Consolas" w:hAnsi="Consolas"/>
+          <w:sz w:val="19"/>
+          <w:szCs w:val="19"/>
+        </w:rPr>
+        <w:t xml:space="preserve">        return fabrication.get();   //@G.32</w:t>
+      </w:r>
+    </w:p>
+    <w:p>
+      <w:pPr>
+        <w:keepLines/>
+        <w:shd w:fill="F2F2F2" w:val="clear"/>
+        <w:spacing w:after="0" w:before="0"/>
+        <w:ind w:left="220"/>
+      </w:pPr>
+      <w:r>
+        <w:rPr>
+          <w:rFonts w:ascii="Consolas" w:cs="Consolas" w:eastAsia="Consolas" w:hAnsi="Consolas"/>
+          <w:sz w:val="19"/>
+          <w:szCs w:val="19"/>
+        </w:rPr>
+        <w:t xml:space="preserve">    }</w:t>
+      </w:r>
+    </w:p>
+    <w:p>
+      <w:pPr>
+        <w:keepLines/>
+        <w:shd w:fill="F2F2F2" w:val="clear"/>
+        <w:spacing w:after="160" w:before="0"/>
+        <w:ind w:left="220"/>
+      </w:pPr>
+      <w:r>
+        <w:rPr>
+          <w:rFonts w:ascii="Consolas" w:cs="Consolas" w:eastAsia="Consolas" w:hAnsi="Consolas"/>
+          <w:sz w:val="19"/>
+          <w:szCs w:val="19"/>
+        </w:rPr>
+        <w:t xml:space="preserve">}</w:t>
+      </w:r>
+    </w:p>
+    <w:p>
+      <w:r>
+        <w:br w:type="page"/>
+      </w:r>
+    </w:p>
+    <w:p>
+      <w:pPr>
+        <w:pStyle w:val="Heading1"/>
+        <w:keepNext/>
+        <w:spacing w:after="160" w:before="360"/>
+      </w:pPr>
+      <w:r>
+        <w:rPr>
+          <w:b/>
+          <w:bCs/>
+          <w:color w:val="1F4E79"/>
+          <w:sz w:val="30"/>
+          <w:szCs w:val="30"/>
+        </w:rPr>
+        <w:t xml:space="preserve">Huitième partie — une fenêtre</w:t>
+      </w:r>
+    </w:p>
+    <w:p>
+      <w:pPr>
+        <w:keepNext/>
+        <w:spacing w:after="140" w:before="320"/>
+      </w:pPr>
+      <w:r>
+        <w:rPr>
+          <w:b/>
+          <w:bCs/>
+          <w:color w:val="7B9E4B"/>
+          <w:sz w:val="28"/>
+          <w:szCs w:val="28"/>
+        </w:rPr>
+        <w:t xml:space="preserve">G.33 et G.34  </w:t>
+      </w:r>
+      <w:r>
+        <w:rPr>
+          <w:b/>
+          <w:bCs/>
+          <w:color w:val="1F4E79"/>
+          <w:sz w:val="28"/>
+          <w:szCs w:val="28"/>
+        </w:rPr>
+        <w:t xml:space="preserve">Le Nim dans une fenêtre, et des boutons liés à la pile</w:t>
+      </w:r>
+    </w:p>
+    <w:p>
+      <w:pPr>
+        <w:spacing w:after="120"/>
+      </w:pPr>
+      <w:r>
+        <w:rPr>
+          <w:b/>
+          <w:bCs/>
+          <w:sz w:val="22"/>
+          <w:szCs w:val="22"/>
+        </w:rPr>
+        <w:t xml:space="preserve">Une deuxième porte d'entrée. </w:t>
+      </w:r>
+      <w:r>
+        <w:rPr>
+          <w:sz w:val="22"/>
+          <w:szCs w:val="22"/>
+        </w:rPr>
+        <w:t xml:space="preserve">La fenêtre ne s'ouvre pas depuis le menu du hub : il faudrait démarrer JavaFX à la main, sur un autre fil. C'est une application à part, avec son lanceur.</w:t>
+      </w:r>
+    </w:p>
+    <w:p>
+      <w:pPr>
+        <w:spacing w:after="120"/>
+      </w:pPr>
+      <w:r>
+        <w:rPr>
+          <w:b/>
+          <w:bCs/>
+          <w:sz w:val="22"/>
+          <w:szCs w:val="22"/>
+        </w:rPr>
+        <w:t xml:space="preserve">Quatorze allumettes et non treize. </w:t>
+      </w:r>
+      <w:r>
+        <w:rPr>
+          <w:sz w:val="22"/>
+          <w:szCs w:val="22"/>
+        </w:rPr>
+        <w:t xml:space="preserve">Contre la stratégie maligne, celui qui commence à treize perd toujours ; à quatorze, le joueur peut gagner en jouant juste.</w:t>
+      </w:r>
+    </w:p>
+    <w:p>
+      <w:pPr>
+        <w:spacing w:after="120"/>
+      </w:pPr>
+      <w:r>
+        <w:rPr>
+          <w:sz w:val="22"/>
+          <w:szCs w:val="22"/>
+        </w:rPr>
+        <w:t xml:space="preserve">La méthode pileAChange est le seul endroit où l'écran apprend que la pile a changé. En G.33 elle écrit le libellé ; en G.34 elle met à jour la propriété, et c'est tout ce qui change dans la logique. Les touches du clavier contournent les boutons grisés : c'est le test des règles, au début du tour, qui garde le programme juste.</w:t>
+      </w:r>
+    </w:p>
+    <w:p>
+      <w:pPr>
+        <w:spacing w:after="40" w:before="160"/>
+      </w:pPr>
+      <w:r>
+        <w:rPr>
+          <w:rFonts w:ascii="Consolas" w:cs="Consolas" w:eastAsia="Consolas" w:hAnsi="Consolas"/>
+          <w:color w:val="595959"/>
+          <w:sz w:val="17"/>
+          <w:szCs w:val="17"/>
+        </w:rPr>
+        <w:t xml:space="preserve">fenetre/FenetreNim.java</w:t>
+      </w:r>
+    </w:p>
+    <w:p>
+      <w:pPr>
+        <w:keepLines/>
+        <w:shd w:fill="F2F2F2" w:val="clear"/>
+        <w:spacing w:after="0" w:before="100"/>
+        <w:ind w:left="220"/>
+      </w:pPr>
+      <w:r>
+        <w:rPr>
+          <w:rFonts w:ascii="Consolas" w:cs="Consolas" w:eastAsia="Consolas" w:hAnsi="Consolas"/>
+          <w:sz w:val="19"/>
+          <w:szCs w:val="19"/>
+        </w:rPr>
+        <w:t xml:space="preserve">//@G.33</w:t>
+      </w:r>
+    </w:p>
+    <w:p>
+      <w:pPr>
+        <w:keepLines/>
+        <w:shd w:fill="F2F2F2" w:val="clear"/>
+        <w:spacing w:after="0" w:before="0"/>
+        <w:ind w:left="220"/>
+      </w:pPr>
+      <w:r>
+        <w:rPr>
+          <w:rFonts w:ascii="Consolas" w:cs="Consolas" w:eastAsia="Consolas" w:hAnsi="Consolas"/>
+          <w:sz w:val="19"/>
+          <w:szCs w:val="19"/>
+        </w:rPr>
+        <w:t xml:space="preserve">public class FenetreNim extends Application {</w:t>
+      </w:r>
+    </w:p>
+    <w:p>
+      <w:pPr>
+        <w:keepLines/>
+        <w:shd w:fill="F2F2F2" w:val="clear"/>
+        <w:spacing w:after="0" w:before="0"/>
+        <w:ind w:left="220"/>
+      </w:pPr>
+      <w:r>
+        <w:rPr>
+          <w:rFonts w:ascii="Consolas" w:cs="Consolas" w:eastAsia="Consolas" w:hAnsi="Consolas"/>
+          <w:sz w:val="19"/>
+          <w:szCs w:val="19"/>
+        </w:rPr>
+        <w:t xml:space="preserve"> </w:t>
+      </w:r>
+    </w:p>
+    <w:p>
+      <w:pPr>
+        <w:keepLines/>
+        <w:shd w:fill="F2F2F2" w:val="clear"/>
+        <w:spacing w:after="0" w:before="0"/>
+        <w:ind w:left="220"/>
+      </w:pPr>
+      <w:r>
+        <w:rPr>
+          <w:rFonts w:ascii="Consolas" w:cs="Consolas" w:eastAsia="Consolas" w:hAnsi="Consolas"/>
+          <w:sz w:val="19"/>
+          <w:szCs w:val="19"/>
+        </w:rPr>
+        <w:t xml:space="preserve">    private static final int ALLUMETTES = 14;</w:t>
+      </w:r>
+    </w:p>
+    <w:p>
+      <w:pPr>
+        <w:keepLines/>
+        <w:shd w:fill="F2F2F2" w:val="clear"/>
+        <w:spacing w:after="0" w:before="0"/>
+        <w:ind w:left="220"/>
+      </w:pPr>
+      <w:r>
+        <w:rPr>
+          <w:rFonts w:ascii="Consolas" w:cs="Consolas" w:eastAsia="Consolas" w:hAnsi="Consolas"/>
+          <w:sz w:val="19"/>
+          <w:szCs w:val="19"/>
+        </w:rPr>
+        <w:t xml:space="preserve"> </w:t>
+      </w:r>
+    </w:p>
+    <w:p>
+      <w:pPr>
+        <w:keepLines/>
+        <w:shd w:fill="F2F2F2" w:val="clear"/>
+        <w:spacing w:after="0" w:before="0"/>
+        <w:ind w:left="220"/>
+      </w:pPr>
+      <w:r>
+        <w:rPr>
+          <w:rFonts w:ascii="Consolas" w:cs="Consolas" w:eastAsia="Consolas" w:hAnsi="Consolas"/>
+          <w:sz w:val="19"/>
+          <w:szCs w:val="19"/>
+        </w:rPr>
+        <w:t xml:space="preserve">    private final ReglesNim regles = new ReglesNim();</w:t>
+      </w:r>
+    </w:p>
+    <w:p>
+      <w:pPr>
+        <w:keepLines/>
+        <w:shd w:fill="F2F2F2" w:val="clear"/>
+        <w:spacing w:after="0" w:before="0"/>
+        <w:ind w:left="220"/>
+      </w:pPr>
+      <w:r>
+        <w:rPr>
+          <w:rFonts w:ascii="Consolas" w:cs="Consolas" w:eastAsia="Consolas" w:hAnsi="Consolas"/>
+          <w:sz w:val="19"/>
+          <w:szCs w:val="19"/>
+        </w:rPr>
+        <w:t xml:space="preserve">    private final StrategieNim machine = new StrategieMaligne();</w:t>
+      </w:r>
+    </w:p>
+    <w:p>
+      <w:pPr>
+        <w:keepLines/>
+        <w:shd w:fill="F2F2F2" w:val="clear"/>
+        <w:spacing w:after="0" w:before="0"/>
+        <w:ind w:left="220"/>
+      </w:pPr>
+      <w:r>
+        <w:rPr>
+          <w:rFonts w:ascii="Consolas" w:cs="Consolas" w:eastAsia="Consolas" w:hAnsi="Consolas"/>
+          <w:sz w:val="19"/>
+          <w:szCs w:val="19"/>
+        </w:rPr>
+        <w:t xml:space="preserve">    private final Pile pile = new Pile(ALLUMETTES);</w:t>
+      </w:r>
+    </w:p>
+    <w:p>
+      <w:pPr>
+        <w:keepLines/>
+        <w:shd w:fill="F2F2F2" w:val="clear"/>
+        <w:spacing w:after="0" w:before="0"/>
+        <w:ind w:left="220"/>
+      </w:pPr>
+      <w:r>
+        <w:rPr>
+          <w:rFonts w:ascii="Consolas" w:cs="Consolas" w:eastAsia="Consolas" w:hAnsi="Consolas"/>
+          <w:sz w:val="19"/>
+          <w:szCs w:val="19"/>
+        </w:rPr>
+        <w:t xml:space="preserve">    private final IntegerProperty restantes = new SimpleIntegerProperty(ALLUMETTES);   //@G.34</w:t>
+      </w:r>
+    </w:p>
+    <w:p>
+      <w:pPr>
+        <w:keepLines/>
+        <w:shd w:fill="F2F2F2" w:val="clear"/>
+        <w:spacing w:after="0" w:before="0"/>
+        <w:ind w:left="220"/>
+      </w:pPr>
+      <w:r>
+        <w:rPr>
+          <w:rFonts w:ascii="Consolas" w:cs="Consolas" w:eastAsia="Consolas" w:hAnsi="Consolas"/>
+          <w:sz w:val="19"/>
+          <w:szCs w:val="19"/>
+        </w:rPr>
+        <w:t xml:space="preserve"> </w:t>
+      </w:r>
+    </w:p>
+    <w:p>
+      <w:pPr>
+        <w:keepLines/>
+        <w:shd w:fill="F2F2F2" w:val="clear"/>
+        <w:spacing w:after="0" w:before="0"/>
+        <w:ind w:left="220"/>
+      </w:pPr>
+      <w:r>
+        <w:rPr>
+          <w:rFonts w:ascii="Consolas" w:cs="Consolas" w:eastAsia="Consolas" w:hAnsi="Consolas"/>
+          <w:sz w:val="19"/>
+          <w:szCs w:val="19"/>
+        </w:rPr>
+        <w:t xml:space="preserve">    private Label etat;</w:t>
+      </w:r>
+    </w:p>
+    <w:p>
+      <w:pPr>
+        <w:keepLines/>
+        <w:shd w:fill="F2F2F2" w:val="clear"/>
+        <w:spacing w:after="0" w:before="0"/>
+        <w:ind w:left="220"/>
+      </w:pPr>
+      <w:r>
+        <w:rPr>
+          <w:rFonts w:ascii="Consolas" w:cs="Consolas" w:eastAsia="Consolas" w:hAnsi="Consolas"/>
+          <w:sz w:val="19"/>
+          <w:szCs w:val="19"/>
+        </w:rPr>
+        <w:t xml:space="preserve">    private Label message;</w:t>
+      </w:r>
+    </w:p>
+    <w:p>
+      <w:pPr>
+        <w:keepLines/>
+        <w:shd w:fill="F2F2F2" w:val="clear"/>
+        <w:spacing w:after="0" w:before="0"/>
+        <w:ind w:left="220"/>
+      </w:pPr>
+      <w:r>
+        <w:rPr>
+          <w:rFonts w:ascii="Consolas" w:cs="Consolas" w:eastAsia="Consolas" w:hAnsi="Consolas"/>
+          <w:sz w:val="19"/>
+          <w:szCs w:val="19"/>
+        </w:rPr>
+        <w:t xml:space="preserve"> </w:t>
+      </w:r>
+    </w:p>
+    <w:p>
+      <w:pPr>
+        <w:keepLines/>
+        <w:shd w:fill="F2F2F2" w:val="clear"/>
+        <w:spacing w:after="0" w:before="0"/>
+        <w:ind w:left="220"/>
+      </w:pPr>
+      <w:r>
+        <w:rPr>
+          <w:rFonts w:ascii="Consolas" w:cs="Consolas" w:eastAsia="Consolas" w:hAnsi="Consolas"/>
+          <w:sz w:val="19"/>
+          <w:szCs w:val="19"/>
+        </w:rPr>
+        <w:t xml:space="preserve">    // Le main est dans LanceurFenetreNim. Voir TEC-FX.4.</w:t>
+      </w:r>
+    </w:p>
+    <w:p>
+      <w:pPr>
+        <w:keepLines/>
+        <w:shd w:fill="F2F2F2" w:val="clear"/>
+        <w:spacing w:after="0" w:before="0"/>
+        <w:ind w:left="220"/>
+      </w:pPr>
+      <w:r>
+        <w:rPr>
+          <w:rFonts w:ascii="Consolas" w:cs="Consolas" w:eastAsia="Consolas" w:hAnsi="Consolas"/>
+          <w:sz w:val="19"/>
+          <w:szCs w:val="19"/>
+        </w:rPr>
+        <w:t xml:space="preserve"> </w:t>
+      </w:r>
+    </w:p>
+    <w:p>
+      <w:pPr>
+        <w:keepLines/>
+        <w:shd w:fill="F2F2F2" w:val="clear"/>
+        <w:spacing w:after="0" w:before="0"/>
+        <w:ind w:left="220"/>
+      </w:pPr>
+      <w:r>
+        <w:rPr>
+          <w:rFonts w:ascii="Consolas" w:cs="Consolas" w:eastAsia="Consolas" w:hAnsi="Consolas"/>
+          <w:sz w:val="19"/>
+          <w:szCs w:val="19"/>
+        </w:rPr>
+        <w:t xml:space="preserve">    @Override</w:t>
+      </w:r>
+    </w:p>
+    <w:p>
+      <w:pPr>
+        <w:keepLines/>
+        <w:shd w:fill="F2F2F2" w:val="clear"/>
+        <w:spacing w:after="0" w:before="0"/>
+        <w:ind w:left="220"/>
+      </w:pPr>
+      <w:r>
+        <w:rPr>
+          <w:rFonts w:ascii="Consolas" w:cs="Consolas" w:eastAsia="Consolas" w:hAnsi="Consolas"/>
+          <w:sz w:val="19"/>
+          <w:szCs w:val="19"/>
+        </w:rPr>
+        <w:t xml:space="preserve">    public void start(Stage fenetre) {</w:t>
+      </w:r>
+    </w:p>
+    <w:p>
+      <w:pPr>
+        <w:keepLines/>
+        <w:shd w:fill="F2F2F2" w:val="clear"/>
+        <w:spacing w:after="0" w:before="0"/>
+        <w:ind w:left="220"/>
+      </w:pPr>
+      <w:r>
+        <w:rPr>
+          <w:rFonts w:ascii="Consolas" w:cs="Consolas" w:eastAsia="Consolas" w:hAnsi="Consolas"/>
+          <w:sz w:val="19"/>
+          <w:szCs w:val="19"/>
+        </w:rPr>
+        <w:t xml:space="preserve">        etat = new Label();</w:t>
+      </w:r>
+    </w:p>
+    <w:p>
+      <w:pPr>
+        <w:keepLines/>
+        <w:shd w:fill="F2F2F2" w:val="clear"/>
+        <w:spacing w:after="0" w:before="0"/>
+        <w:ind w:left="220"/>
+      </w:pPr>
+      <w:r>
+        <w:rPr>
+          <w:rFonts w:ascii="Consolas" w:cs="Consolas" w:eastAsia="Consolas" w:hAnsi="Consolas"/>
+          <w:sz w:val="19"/>
+          <w:szCs w:val="19"/>
+        </w:rPr>
+        <w:t xml:space="preserve">        message = new Label("A vous de jouer : cliquez, ou tapez 1, 2 ou 3.");</w:t>
+      </w:r>
+    </w:p>
+    <w:p>
+      <w:pPr>
+        <w:keepLines/>
+        <w:shd w:fill="F2F2F2" w:val="clear"/>
+        <w:spacing w:after="0" w:before="0"/>
+        <w:ind w:left="220"/>
+      </w:pPr>
+      <w:r>
+        <w:rPr>
+          <w:rFonts w:ascii="Consolas" w:cs="Consolas" w:eastAsia="Consolas" w:hAnsi="Consolas"/>
+          <w:sz w:val="19"/>
+          <w:szCs w:val="19"/>
+        </w:rPr>
+        <w:t xml:space="preserve"> </w:t>
+      </w:r>
+    </w:p>
+    <w:p>
+      <w:pPr>
+        <w:keepLines/>
+        <w:shd w:fill="F2F2F2" w:val="clear"/>
+        <w:spacing w:after="0" w:before="0"/>
+        <w:ind w:left="220"/>
+      </w:pPr>
+      <w:r>
+        <w:rPr>
+          <w:rFonts w:ascii="Consolas" w:cs="Consolas" w:eastAsia="Consolas" w:hAnsi="Consolas"/>
+          <w:sz w:val="19"/>
+          <w:szCs w:val="19"/>
+        </w:rPr>
+        <w:t xml:space="preserve">        HBox boutons = new HBox(10);</w:t>
+      </w:r>
+    </w:p>
+    <w:p>
+      <w:pPr>
+        <w:keepLines/>
+        <w:shd w:fill="F2F2F2" w:val="clear"/>
+        <w:spacing w:after="0" w:before="0"/>
+        <w:ind w:left="220"/>
+      </w:pPr>
+      <w:r>
+        <w:rPr>
+          <w:rFonts w:ascii="Consolas" w:cs="Consolas" w:eastAsia="Consolas" w:hAnsi="Consolas"/>
+          <w:sz w:val="19"/>
+          <w:szCs w:val="19"/>
+        </w:rPr>
+        <w:t xml:space="preserve">        for (int nombre = 1; nombre &lt;= regles.getMaximumParTour(); nombre++) {</w:t>
+      </w:r>
+    </w:p>
+    <w:p>
+      <w:pPr>
+        <w:keepLines/>
+        <w:shd w:fill="F2F2F2" w:val="clear"/>
+        <w:spacing w:after="0" w:before="0"/>
+        <w:ind w:left="220"/>
+      </w:pPr>
+      <w:r>
+        <w:rPr>
+          <w:rFonts w:ascii="Consolas" w:cs="Consolas" w:eastAsia="Consolas" w:hAnsi="Consolas"/>
+          <w:sz w:val="19"/>
+          <w:szCs w:val="19"/>
+        </w:rPr>
+        <w:t xml:space="preserve">            boutons.getChildren().add(bouton(nombre));</w:t>
+      </w:r>
+    </w:p>
+    <w:p>
+      <w:pPr>
+        <w:keepLines/>
+        <w:shd w:fill="F2F2F2" w:val="clear"/>
+        <w:spacing w:after="0" w:before="0"/>
+        <w:ind w:left="220"/>
+      </w:pPr>
+      <w:r>
+        <w:rPr>
+          <w:rFonts w:ascii="Consolas" w:cs="Consolas" w:eastAsia="Consolas" w:hAnsi="Consolas"/>
+          <w:sz w:val="19"/>
+          <w:szCs w:val="19"/>
+        </w:rPr>
+        <w:t xml:space="preserve">        }</w:t>
+      </w:r>
+    </w:p>
+    <w:p>
+      <w:pPr>
+        <w:keepLines/>
+        <w:shd w:fill="F2F2F2" w:val="clear"/>
+        <w:spacing w:after="0" w:before="0"/>
+        <w:ind w:left="220"/>
+      </w:pPr>
+      <w:r>
+        <w:rPr>
+          <w:rFonts w:ascii="Consolas" w:cs="Consolas" w:eastAsia="Consolas" w:hAnsi="Consolas"/>
+          <w:sz w:val="19"/>
+          <w:szCs w:val="19"/>
+        </w:rPr>
+        <w:t xml:space="preserve">        boutons.setAlignment(Pos.CENTER);</w:t>
+      </w:r>
+    </w:p>
+    <w:p>
+      <w:pPr>
+        <w:keepLines/>
+        <w:shd w:fill="F2F2F2" w:val="clear"/>
+        <w:spacing w:after="0" w:before="0"/>
+        <w:ind w:left="220"/>
+      </w:pPr>
+      <w:r>
+        <w:rPr>
+          <w:rFonts w:ascii="Consolas" w:cs="Consolas" w:eastAsia="Consolas" w:hAnsi="Consolas"/>
+          <w:sz w:val="19"/>
+          <w:szCs w:val="19"/>
+        </w:rPr>
+        <w:t xml:space="preserve"> </w:t>
+      </w:r>
+    </w:p>
+    <w:p>
+      <w:pPr>
+        <w:keepLines/>
+        <w:shd w:fill="F2F2F2" w:val="clear"/>
+        <w:spacing w:after="0" w:before="0"/>
+        <w:ind w:left="220"/>
+      </w:pPr>
+      <w:r>
+        <w:rPr>
+          <w:rFonts w:ascii="Consolas" w:cs="Consolas" w:eastAsia="Consolas" w:hAnsi="Consolas"/>
+          <w:sz w:val="19"/>
+          <w:szCs w:val="19"/>
+        </w:rPr>
+        <w:t xml:space="preserve">        VBox racine = new VBox(15, etat, boutons, message);</w:t>
+      </w:r>
+    </w:p>
+    <w:p>
+      <w:pPr>
+        <w:keepLines/>
+        <w:shd w:fill="F2F2F2" w:val="clear"/>
+        <w:spacing w:after="0" w:before="0"/>
+        <w:ind w:left="220"/>
+      </w:pPr>
+      <w:r>
+        <w:rPr>
+          <w:rFonts w:ascii="Consolas" w:cs="Consolas" w:eastAsia="Consolas" w:hAnsi="Consolas"/>
+          <w:sz w:val="19"/>
+          <w:szCs w:val="19"/>
+        </w:rPr>
+        <w:t xml:space="preserve">        racine.setAlignment(Pos.CENTER);</w:t>
+      </w:r>
+    </w:p>
+    <w:p>
+      <w:pPr>
+        <w:keepLines/>
+        <w:shd w:fill="F2F2F2" w:val="clear"/>
+        <w:spacing w:after="0" w:before="0"/>
+        <w:ind w:left="220"/>
+      </w:pPr>
+      <w:r>
+        <w:rPr>
+          <w:rFonts w:ascii="Consolas" w:cs="Consolas" w:eastAsia="Consolas" w:hAnsi="Consolas"/>
+          <w:sz w:val="19"/>
+          <w:szCs w:val="19"/>
+        </w:rPr>
+        <w:t xml:space="preserve">        racine.setStyle("-fx-padding: 20;");</w:t>
+      </w:r>
+    </w:p>
+    <w:p>
+      <w:pPr>
+        <w:keepLines/>
+        <w:shd w:fill="F2F2F2" w:val="clear"/>
+        <w:spacing w:after="0" w:before="0"/>
+        <w:ind w:left="220"/>
+      </w:pPr>
+      <w:r>
+        <w:rPr>
+          <w:rFonts w:ascii="Consolas" w:cs="Consolas" w:eastAsia="Consolas" w:hAnsi="Consolas"/>
+          <w:sz w:val="19"/>
+          <w:szCs w:val="19"/>
+        </w:rPr>
+        <w:t xml:space="preserve">        racine.addEventHandler(KeyEvent.KEY_TYPED, this::toucheFrappee);</w:t>
+      </w:r>
+    </w:p>
+    <w:p>
+      <w:pPr>
+        <w:keepLines/>
+        <w:shd w:fill="F2F2F2" w:val="clear"/>
+        <w:spacing w:after="0" w:before="0"/>
+        <w:ind w:left="220"/>
+      </w:pPr>
+      <w:r>
+        <w:rPr>
+          <w:rFonts w:ascii="Consolas" w:cs="Consolas" w:eastAsia="Consolas" w:hAnsi="Consolas"/>
+          <w:sz w:val="19"/>
+          <w:szCs w:val="19"/>
+        </w:rPr>
+        <w:t xml:space="preserve"> </w:t>
+      </w:r>
+    </w:p>
+    <w:p>
+      <w:pPr>
+        <w:keepLines/>
+        <w:shd w:fill="F2F2F2" w:val="clear"/>
+        <w:spacing w:after="0" w:before="0"/>
+        <w:ind w:left="220"/>
+      </w:pPr>
+      <w:r>
+        <w:rPr>
+          <w:rFonts w:ascii="Consolas" w:cs="Consolas" w:eastAsia="Consolas" w:hAnsi="Consolas"/>
+          <w:sz w:val="19"/>
+          <w:szCs w:val="19"/>
+        </w:rPr>
+        <w:t xml:space="preserve">        etat.textProperty().bind(restantes.asString("%d allumettes"));   //@G.34</w:t>
+      </w:r>
+    </w:p>
+    <w:p>
+      <w:pPr>
+        <w:keepLines/>
+        <w:shd w:fill="F2F2F2" w:val="clear"/>
+        <w:spacing w:after="0" w:before="0"/>
+        <w:ind w:left="220"/>
+      </w:pPr>
+      <w:r>
+        <w:rPr>
+          <w:rFonts w:ascii="Consolas" w:cs="Consolas" w:eastAsia="Consolas" w:hAnsi="Consolas"/>
+          <w:sz w:val="19"/>
+          <w:szCs w:val="19"/>
+        </w:rPr>
+        <w:t xml:space="preserve">        pileAChange();</w:t>
+      </w:r>
+    </w:p>
+    <w:p>
+      <w:pPr>
+        <w:keepLines/>
+        <w:shd w:fill="F2F2F2" w:val="clear"/>
+        <w:spacing w:after="0" w:before="0"/>
+        <w:ind w:left="220"/>
+      </w:pPr>
+      <w:r>
+        <w:rPr>
+          <w:rFonts w:ascii="Consolas" w:cs="Consolas" w:eastAsia="Consolas" w:hAnsi="Consolas"/>
+          <w:sz w:val="19"/>
+          <w:szCs w:val="19"/>
+        </w:rPr>
+        <w:t xml:space="preserve"> </w:t>
+      </w:r>
+    </w:p>
+    <w:p>
+      <w:pPr>
+        <w:keepLines/>
+        <w:shd w:fill="F2F2F2" w:val="clear"/>
+        <w:spacing w:after="0" w:before="0"/>
+        <w:ind w:left="220"/>
+      </w:pPr>
+      <w:r>
+        <w:rPr>
+          <w:rFonts w:ascii="Consolas" w:cs="Consolas" w:eastAsia="Consolas" w:hAnsi="Consolas"/>
+          <w:sz w:val="19"/>
+          <w:szCs w:val="19"/>
+        </w:rPr>
+        <w:t xml:space="preserve">        fenetre.setScene(new Scene(racine, 460, 180));</w:t>
+      </w:r>
+    </w:p>
+    <w:p>
+      <w:pPr>
+        <w:keepLines/>
+        <w:shd w:fill="F2F2F2" w:val="clear"/>
+        <w:spacing w:after="0" w:before="0"/>
+        <w:ind w:left="220"/>
+      </w:pPr>
+      <w:r>
+        <w:rPr>
+          <w:rFonts w:ascii="Consolas" w:cs="Consolas" w:eastAsia="Consolas" w:hAnsi="Consolas"/>
+          <w:sz w:val="19"/>
+          <w:szCs w:val="19"/>
+        </w:rPr>
+        <w:t xml:space="preserve">        fenetre.setTitle("GameHub - le Nim");</w:t>
+      </w:r>
+    </w:p>
+    <w:p>
+      <w:pPr>
+        <w:keepLines/>
+        <w:shd w:fill="F2F2F2" w:val="clear"/>
+        <w:spacing w:after="0" w:before="0"/>
+        <w:ind w:left="220"/>
+      </w:pPr>
+      <w:r>
+        <w:rPr>
+          <w:rFonts w:ascii="Consolas" w:cs="Consolas" w:eastAsia="Consolas" w:hAnsi="Consolas"/>
+          <w:sz w:val="19"/>
+          <w:szCs w:val="19"/>
+        </w:rPr>
+        <w:t xml:space="preserve">        fenetre.show();</w:t>
+      </w:r>
+    </w:p>
+    <w:p>
+      <w:pPr>
+        <w:keepLines/>
+        <w:shd w:fill="F2F2F2" w:val="clear"/>
+        <w:spacing w:after="0" w:before="0"/>
+        <w:ind w:left="220"/>
+      </w:pPr>
+      <w:r>
+        <w:rPr>
+          <w:rFonts w:ascii="Consolas" w:cs="Consolas" w:eastAsia="Consolas" w:hAnsi="Consolas"/>
+          <w:sz w:val="19"/>
+          <w:szCs w:val="19"/>
+        </w:rPr>
+        <w:t xml:space="preserve">    }</w:t>
+      </w:r>
+    </w:p>
+    <w:p>
+      <w:pPr>
+        <w:keepLines/>
+        <w:shd w:fill="F2F2F2" w:val="clear"/>
+        <w:spacing w:after="0" w:before="0"/>
+        <w:ind w:left="220"/>
+      </w:pPr>
+      <w:r>
+        <w:rPr>
+          <w:rFonts w:ascii="Consolas" w:cs="Consolas" w:eastAsia="Consolas" w:hAnsi="Consolas"/>
+          <w:sz w:val="19"/>
+          <w:szCs w:val="19"/>
+        </w:rPr>
+        <w:t xml:space="preserve"> </w:t>
+      </w:r>
+    </w:p>
+    <w:p>
+      <w:pPr>
+        <w:keepLines/>
+        <w:shd w:fill="F2F2F2" w:val="clear"/>
+        <w:spacing w:after="0" w:before="0"/>
+        <w:ind w:left="220"/>
+      </w:pPr>
+      <w:r>
+        <w:rPr>
+          <w:rFonts w:ascii="Consolas" w:cs="Consolas" w:eastAsia="Consolas" w:hAnsi="Consolas"/>
+          <w:sz w:val="19"/>
+          <w:szCs w:val="19"/>
+        </w:rPr>
+        <w:t xml:space="preserve">    private Button bouton(int nombre) {</w:t>
+      </w:r>
+    </w:p>
+    <w:p>
+      <w:pPr>
+        <w:keepLines/>
+        <w:shd w:fill="F2F2F2" w:val="clear"/>
+        <w:spacing w:after="0" w:before="0"/>
+        <w:ind w:left="220"/>
+      </w:pPr>
+      <w:r>
+        <w:rPr>
+          <w:rFonts w:ascii="Consolas" w:cs="Consolas" w:eastAsia="Consolas" w:hAnsi="Consolas"/>
+          <w:sz w:val="19"/>
+          <w:szCs w:val="19"/>
+        </w:rPr>
+        <w:t xml:space="preserve">        Button bouton = new Button("Prendre " + nombre);</w:t>
+      </w:r>
+    </w:p>
+    <w:p>
+      <w:pPr>
+        <w:keepLines/>
+        <w:shd w:fill="F2F2F2" w:val="clear"/>
+        <w:spacing w:after="0" w:before="0"/>
+        <w:ind w:left="220"/>
+      </w:pPr>
+      <w:r>
+        <w:rPr>
+          <w:rFonts w:ascii="Consolas" w:cs="Consolas" w:eastAsia="Consolas" w:hAnsi="Consolas"/>
+          <w:sz w:val="19"/>
+          <w:szCs w:val="19"/>
+        </w:rPr>
+        <w:t xml:space="preserve">        bouton.setOnAction(evenement -&gt; joueurRetire(nombre));</w:t>
+      </w:r>
+    </w:p>
+    <w:p>
+      <w:pPr>
+        <w:keepLines/>
+        <w:shd w:fill="F2F2F2" w:val="clear"/>
+        <w:spacing w:after="0" w:before="0"/>
+        <w:ind w:left="220"/>
+      </w:pPr>
+      <w:r>
+        <w:rPr>
+          <w:rFonts w:ascii="Consolas" w:cs="Consolas" w:eastAsia="Consolas" w:hAnsi="Consolas"/>
+          <w:sz w:val="19"/>
+          <w:szCs w:val="19"/>
+        </w:rPr>
+        <w:t xml:space="preserve">        bouton.disableProperty().bind(restantes.lessThan(nombre));   //@G.34</w:t>
+      </w:r>
+    </w:p>
+    <w:p>
+      <w:pPr>
+        <w:keepLines/>
+        <w:shd w:fill="F2F2F2" w:val="clear"/>
+        <w:spacing w:after="0" w:before="0"/>
+        <w:ind w:left="220"/>
+      </w:pPr>
+      <w:r>
+        <w:rPr>
+          <w:rFonts w:ascii="Consolas" w:cs="Consolas" w:eastAsia="Consolas" w:hAnsi="Consolas"/>
+          <w:sz w:val="19"/>
+          <w:szCs w:val="19"/>
+        </w:rPr>
+        <w:t xml:space="preserve">        return bouton;</w:t>
+      </w:r>
+    </w:p>
+    <w:p>
+      <w:pPr>
+        <w:keepLines/>
+        <w:shd w:fill="F2F2F2" w:val="clear"/>
+        <w:spacing w:after="0" w:before="0"/>
+        <w:ind w:left="220"/>
+      </w:pPr>
+      <w:r>
+        <w:rPr>
+          <w:rFonts w:ascii="Consolas" w:cs="Consolas" w:eastAsia="Consolas" w:hAnsi="Consolas"/>
+          <w:sz w:val="19"/>
+          <w:szCs w:val="19"/>
+        </w:rPr>
+        <w:t xml:space="preserve">    }</w:t>
+      </w:r>
+    </w:p>
+    <w:p>
+      <w:pPr>
+        <w:keepLines/>
+        <w:shd w:fill="F2F2F2" w:val="clear"/>
+        <w:spacing w:after="0" w:before="0"/>
+        <w:ind w:left="220"/>
+      </w:pPr>
+      <w:r>
+        <w:rPr>
+          <w:rFonts w:ascii="Consolas" w:cs="Consolas" w:eastAsia="Consolas" w:hAnsi="Consolas"/>
+          <w:sz w:val="19"/>
+          <w:szCs w:val="19"/>
+        </w:rPr>
+        <w:t xml:space="preserve"> </w:t>
+      </w:r>
+    </w:p>
+    <w:p>
+      <w:pPr>
+        <w:keepLines/>
+        <w:shd w:fill="F2F2F2" w:val="clear"/>
+        <w:spacing w:after="0" w:before="0"/>
+        <w:ind w:left="220"/>
+      </w:pPr>
+      <w:r>
+        <w:rPr>
+          <w:rFonts w:ascii="Consolas" w:cs="Consolas" w:eastAsia="Consolas" w:hAnsi="Consolas"/>
+          <w:sz w:val="19"/>
+          <w:szCs w:val="19"/>
+        </w:rPr>
+        <w:t xml:space="preserve">    private void toucheFrappee(KeyEvent evenement) {</w:t>
+      </w:r>
+    </w:p>
+    <w:p>
+      <w:pPr>
+        <w:keepLines/>
+        <w:shd w:fill="F2F2F2" w:val="clear"/>
+        <w:spacing w:after="0" w:before="0"/>
+        <w:ind w:left="220"/>
+      </w:pPr>
+      <w:r>
+        <w:rPr>
+          <w:rFonts w:ascii="Consolas" w:cs="Consolas" w:eastAsia="Consolas" w:hAnsi="Consolas"/>
+          <w:sz w:val="19"/>
+          <w:szCs w:val="19"/>
+        </w:rPr>
+        <w:t xml:space="preserve">        String touche = evenement.getCharacter();</w:t>
+      </w:r>
+    </w:p>
+    <w:p>
+      <w:pPr>
+        <w:keepLines/>
+        <w:shd w:fill="F2F2F2" w:val="clear"/>
+        <w:spacing w:after="0" w:before="0"/>
+        <w:ind w:left="220"/>
+      </w:pPr>
+      <w:r>
+        <w:rPr>
+          <w:rFonts w:ascii="Consolas" w:cs="Consolas" w:eastAsia="Consolas" w:hAnsi="Consolas"/>
+          <w:sz w:val="19"/>
+          <w:szCs w:val="19"/>
+        </w:rPr>
+        <w:t xml:space="preserve">        if (touche.length() == 1 &amp;&amp; Character.isDigit(touche.charAt(0))) {</w:t>
+      </w:r>
+    </w:p>
+    <w:p>
+      <w:pPr>
+        <w:keepLines/>
+        <w:shd w:fill="F2F2F2" w:val="clear"/>
+        <w:spacing w:after="0" w:before="0"/>
+        <w:ind w:left="220"/>
+      </w:pPr>
+      <w:r>
+        <w:rPr>
+          <w:rFonts w:ascii="Consolas" w:cs="Consolas" w:eastAsia="Consolas" w:hAnsi="Consolas"/>
+          <w:sz w:val="19"/>
+          <w:szCs w:val="19"/>
+        </w:rPr>
+        <w:t xml:space="preserve">            int nombre = touche.charAt(0) - '0';</w:t>
+      </w:r>
+    </w:p>
+    <w:p>
+      <w:pPr>
+        <w:keepLines/>
+        <w:shd w:fill="F2F2F2" w:val="clear"/>
+        <w:spacing w:after="0" w:before="0"/>
+        <w:ind w:left="220"/>
+      </w:pPr>
+      <w:r>
+        <w:rPr>
+          <w:rFonts w:ascii="Consolas" w:cs="Consolas" w:eastAsia="Consolas" w:hAnsi="Consolas"/>
+          <w:sz w:val="19"/>
+          <w:szCs w:val="19"/>
+        </w:rPr>
+        <w:t xml:space="preserve">            if (nombre &gt;= 1 &amp;&amp; nombre &lt;= regles.getMaximumParTour()) {</w:t>
+      </w:r>
+    </w:p>
+    <w:p>
+      <w:pPr>
+        <w:keepLines/>
+        <w:shd w:fill="F2F2F2" w:val="clear"/>
+        <w:spacing w:after="0" w:before="0"/>
+        <w:ind w:left="220"/>
+      </w:pPr>
+      <w:r>
+        <w:rPr>
+          <w:rFonts w:ascii="Consolas" w:cs="Consolas" w:eastAsia="Consolas" w:hAnsi="Consolas"/>
+          <w:sz w:val="19"/>
+          <w:szCs w:val="19"/>
+        </w:rPr>
+        <w:t xml:space="preserve">                joueurRetire(nombre);</w:t>
+      </w:r>
+    </w:p>
+    <w:p>
+      <w:pPr>
+        <w:keepLines/>
+        <w:shd w:fill="F2F2F2" w:val="clear"/>
+        <w:spacing w:after="0" w:before="0"/>
+        <w:ind w:left="220"/>
+      </w:pPr>
+      <w:r>
+        <w:rPr>
+          <w:rFonts w:ascii="Consolas" w:cs="Consolas" w:eastAsia="Consolas" w:hAnsi="Consolas"/>
+          <w:sz w:val="19"/>
+          <w:szCs w:val="19"/>
+        </w:rPr>
+        <w:t xml:space="preserve">            }</w:t>
+      </w:r>
+    </w:p>
+    <w:p>
+      <w:pPr>
+        <w:keepLines/>
+        <w:shd w:fill="F2F2F2" w:val="clear"/>
+        <w:spacing w:after="0" w:before="0"/>
+        <w:ind w:left="220"/>
+      </w:pPr>
+      <w:r>
+        <w:rPr>
+          <w:rFonts w:ascii="Consolas" w:cs="Consolas" w:eastAsia="Consolas" w:hAnsi="Consolas"/>
+          <w:sz w:val="19"/>
+          <w:szCs w:val="19"/>
+        </w:rPr>
+        <w:t xml:space="preserve">        }</w:t>
+      </w:r>
+    </w:p>
+    <w:p>
+      <w:pPr>
+        <w:keepLines/>
+        <w:shd w:fill="F2F2F2" w:val="clear"/>
+        <w:spacing w:after="0" w:before="0"/>
+        <w:ind w:left="220"/>
+      </w:pPr>
+      <w:r>
+        <w:rPr>
+          <w:rFonts w:ascii="Consolas" w:cs="Consolas" w:eastAsia="Consolas" w:hAnsi="Consolas"/>
+          <w:sz w:val="19"/>
+          <w:szCs w:val="19"/>
+        </w:rPr>
+        <w:t xml:space="preserve">    }</w:t>
+      </w:r>
+    </w:p>
+    <w:p>
+      <w:pPr>
+        <w:keepLines/>
+        <w:shd w:fill="F2F2F2" w:val="clear"/>
+        <w:spacing w:after="0" w:before="0"/>
+        <w:ind w:left="220"/>
+      </w:pPr>
+      <w:r>
+        <w:rPr>
+          <w:rFonts w:ascii="Consolas" w:cs="Consolas" w:eastAsia="Consolas" w:hAnsi="Consolas"/>
+          <w:sz w:val="19"/>
+          <w:szCs w:val="19"/>
+        </w:rPr>
+        <w:t xml:space="preserve"> </w:t>
+      </w:r>
+    </w:p>
+    <w:p>
+      <w:pPr>
+        <w:keepLines/>
+        <w:shd w:fill="F2F2F2" w:val="clear"/>
+        <w:spacing w:after="0" w:before="0"/>
+        <w:ind w:left="220"/>
+      </w:pPr>
+      <w:r>
+        <w:rPr>
+          <w:rFonts w:ascii="Consolas" w:cs="Consolas" w:eastAsia="Consolas" w:hAnsi="Consolas"/>
+          <w:sz w:val="19"/>
+          <w:szCs w:val="19"/>
+        </w:rPr>
+        <w:t xml:space="preserve">    private void joueurRetire(int nombre) {</w:t>
+      </w:r>
+    </w:p>
+    <w:p>
+      <w:pPr>
+        <w:keepLines/>
+        <w:shd w:fill="F2F2F2" w:val="clear"/>
+        <w:spacing w:after="0" w:before="0"/>
+        <w:ind w:left="220"/>
+      </w:pPr>
+      <w:r>
+        <w:rPr>
+          <w:rFonts w:ascii="Consolas" w:cs="Consolas" w:eastAsia="Consolas" w:hAnsi="Consolas"/>
+          <w:sz w:val="19"/>
+          <w:szCs w:val="19"/>
+        </w:rPr>
+        <w:t xml:space="preserve">        if (!regles.coupValide(pile, nombre)) {</w:t>
+      </w:r>
+    </w:p>
+    <w:p>
+      <w:pPr>
+        <w:keepLines/>
+        <w:shd w:fill="F2F2F2" w:val="clear"/>
+        <w:spacing w:after="0" w:before="0"/>
+        <w:ind w:left="220"/>
+      </w:pPr>
+      <w:r>
+        <w:rPr>
+          <w:rFonts w:ascii="Consolas" w:cs="Consolas" w:eastAsia="Consolas" w:hAnsi="Consolas"/>
+          <w:sz w:val="19"/>
+          <w:szCs w:val="19"/>
+        </w:rPr>
+        <w:t xml:space="preserve">            message.setText("Coup impossible : il reste " + pile.restantes() + " allumette(s).");</w:t>
+      </w:r>
+    </w:p>
+    <w:p>
+      <w:pPr>
+        <w:keepLines/>
+        <w:shd w:fill="F2F2F2" w:val="clear"/>
+        <w:spacing w:after="0" w:before="0"/>
+        <w:ind w:left="220"/>
+      </w:pPr>
+      <w:r>
+        <w:rPr>
+          <w:rFonts w:ascii="Consolas" w:cs="Consolas" w:eastAsia="Consolas" w:hAnsi="Consolas"/>
+          <w:sz w:val="19"/>
+          <w:szCs w:val="19"/>
+        </w:rPr>
+        <w:t xml:space="preserve">            return;</w:t>
+      </w:r>
+    </w:p>
+    <w:p>
+      <w:pPr>
+        <w:keepLines/>
+        <w:shd w:fill="F2F2F2" w:val="clear"/>
+        <w:spacing w:after="0" w:before="0"/>
+        <w:ind w:left="220"/>
+      </w:pPr>
+      <w:r>
+        <w:rPr>
+          <w:rFonts w:ascii="Consolas" w:cs="Consolas" w:eastAsia="Consolas" w:hAnsi="Consolas"/>
+          <w:sz w:val="19"/>
+          <w:szCs w:val="19"/>
+        </w:rPr>
+        <w:t xml:space="preserve">        }</w:t>
+      </w:r>
+    </w:p>
+    <w:p>
+      <w:pPr>
+        <w:keepLines/>
+        <w:shd w:fill="F2F2F2" w:val="clear"/>
+        <w:spacing w:after="0" w:before="0"/>
+        <w:ind w:left="220"/>
+      </w:pPr>
+      <w:r>
+        <w:rPr>
+          <w:rFonts w:ascii="Consolas" w:cs="Consolas" w:eastAsia="Consolas" w:hAnsi="Consolas"/>
+          <w:sz w:val="19"/>
+          <w:szCs w:val="19"/>
+        </w:rPr>
+        <w:t xml:space="preserve">        retirer(nombre);</w:t>
+      </w:r>
+    </w:p>
+    <w:p>
+      <w:pPr>
+        <w:keepLines/>
+        <w:shd w:fill="F2F2F2" w:val="clear"/>
+        <w:spacing w:after="0" w:before="0"/>
+        <w:ind w:left="220"/>
+      </w:pPr>
+      <w:r>
+        <w:rPr>
+          <w:rFonts w:ascii="Consolas" w:cs="Consolas" w:eastAsia="Consolas" w:hAnsi="Consolas"/>
+          <w:sz w:val="19"/>
+          <w:szCs w:val="19"/>
+        </w:rPr>
+        <w:t xml:space="preserve">        if (pile.estVide()) {</w:t>
+      </w:r>
+    </w:p>
+    <w:p>
+      <w:pPr>
+        <w:keepLines/>
+        <w:shd w:fill="F2F2F2" w:val="clear"/>
+        <w:spacing w:after="0" w:before="0"/>
+        <w:ind w:left="220"/>
+      </w:pPr>
+      <w:r>
+        <w:rPr>
+          <w:rFonts w:ascii="Consolas" w:cs="Consolas" w:eastAsia="Consolas" w:hAnsi="Consolas"/>
+          <w:sz w:val="19"/>
+          <w:szCs w:val="19"/>
+        </w:rPr>
+        <w:t xml:space="preserve">            message.setText("Vous avez pris la derniere allumette : vous avez perdu.");</w:t>
+      </w:r>
+    </w:p>
+    <w:p>
+      <w:pPr>
+        <w:keepLines/>
+        <w:shd w:fill="F2F2F2" w:val="clear"/>
+        <w:spacing w:after="0" w:before="0"/>
+        <w:ind w:left="220"/>
+      </w:pPr>
+      <w:r>
+        <w:rPr>
+          <w:rFonts w:ascii="Consolas" w:cs="Consolas" w:eastAsia="Consolas" w:hAnsi="Consolas"/>
+          <w:sz w:val="19"/>
+          <w:szCs w:val="19"/>
+        </w:rPr>
+        <w:t xml:space="preserve">            return;</w:t>
+      </w:r>
+    </w:p>
+    <w:p>
+      <w:pPr>
+        <w:keepLines/>
+        <w:shd w:fill="F2F2F2" w:val="clear"/>
+        <w:spacing w:after="0" w:before="0"/>
+        <w:ind w:left="220"/>
+      </w:pPr>
+      <w:r>
+        <w:rPr>
+          <w:rFonts w:ascii="Consolas" w:cs="Consolas" w:eastAsia="Consolas" w:hAnsi="Consolas"/>
+          <w:sz w:val="19"/>
+          <w:szCs w:val="19"/>
+        </w:rPr>
+        <w:t xml:space="preserve">        }</w:t>
+      </w:r>
+    </w:p>
+    <w:p>
+      <w:pPr>
+        <w:keepLines/>
+        <w:shd w:fill="F2F2F2" w:val="clear"/>
+        <w:spacing w:after="0" w:before="0"/>
+        <w:ind w:left="220"/>
+      </w:pPr>
+      <w:r>
+        <w:rPr>
+          <w:rFonts w:ascii="Consolas" w:cs="Consolas" w:eastAsia="Consolas" w:hAnsi="Consolas"/>
+          <w:sz w:val="19"/>
+          <w:szCs w:val="19"/>
+        </w:rPr>
+        <w:t xml:space="preserve"> </w:t>
+      </w:r>
+    </w:p>
+    <w:p>
+      <w:pPr>
+        <w:keepLines/>
+        <w:shd w:fill="F2F2F2" w:val="clear"/>
+        <w:spacing w:after="0" w:before="0"/>
+        <w:ind w:left="220"/>
+      </w:pPr>
+      <w:r>
+        <w:rPr>
+          <w:rFonts w:ascii="Consolas" w:cs="Consolas" w:eastAsia="Consolas" w:hAnsi="Consolas"/>
+          <w:sz w:val="19"/>
+          <w:szCs w:val="19"/>
+        </w:rPr>
+        <w:t xml:space="preserve">        int coup = coupDeLaMachine();</w:t>
+      </w:r>
+    </w:p>
+    <w:p>
+      <w:pPr>
+        <w:keepLines/>
+        <w:shd w:fill="F2F2F2" w:val="clear"/>
+        <w:spacing w:after="0" w:before="0"/>
+        <w:ind w:left="220"/>
+      </w:pPr>
+      <w:r>
+        <w:rPr>
+          <w:rFonts w:ascii="Consolas" w:cs="Consolas" w:eastAsia="Consolas" w:hAnsi="Consolas"/>
+          <w:sz w:val="19"/>
+          <w:szCs w:val="19"/>
+        </w:rPr>
+        <w:t xml:space="preserve">        retirer(coup);</w:t>
+      </w:r>
+    </w:p>
+    <w:p>
+      <w:pPr>
+        <w:keepLines/>
+        <w:shd w:fill="F2F2F2" w:val="clear"/>
+        <w:spacing w:after="0" w:before="0"/>
+        <w:ind w:left="220"/>
+      </w:pPr>
+      <w:r>
+        <w:rPr>
+          <w:rFonts w:ascii="Consolas" w:cs="Consolas" w:eastAsia="Consolas" w:hAnsi="Consolas"/>
+          <w:sz w:val="19"/>
+          <w:szCs w:val="19"/>
+        </w:rPr>
+        <w:t xml:space="preserve">        if (pile.estVide()) {</w:t>
+      </w:r>
+    </w:p>
+    <w:p>
+      <w:pPr>
+        <w:keepLines/>
+        <w:shd w:fill="F2F2F2" w:val="clear"/>
+        <w:spacing w:after="0" w:before="0"/>
+        <w:ind w:left="220"/>
+      </w:pPr>
+      <w:r>
+        <w:rPr>
+          <w:rFonts w:ascii="Consolas" w:cs="Consolas" w:eastAsia="Consolas" w:hAnsi="Consolas"/>
+          <w:sz w:val="19"/>
+          <w:szCs w:val="19"/>
+        </w:rPr>
+        <w:t xml:space="preserve">            message.setText("La machine retire " + coup + " et prend la derniere : vous avez gagne !");</w:t>
+      </w:r>
+    </w:p>
+    <w:p>
+      <w:pPr>
+        <w:keepLines/>
+        <w:shd w:fill="F2F2F2" w:val="clear"/>
+        <w:spacing w:after="0" w:before="0"/>
+        <w:ind w:left="220"/>
+      </w:pPr>
+      <w:r>
+        <w:rPr>
+          <w:rFonts w:ascii="Consolas" w:cs="Consolas" w:eastAsia="Consolas" w:hAnsi="Consolas"/>
+          <w:sz w:val="19"/>
+          <w:szCs w:val="19"/>
+        </w:rPr>
+        <w:t xml:space="preserve">        } else {</w:t>
+      </w:r>
+    </w:p>
+    <w:p>
+      <w:pPr>
+        <w:keepLines/>
+        <w:shd w:fill="F2F2F2" w:val="clear"/>
+        <w:spacing w:after="0" w:before="0"/>
+        <w:ind w:left="220"/>
+      </w:pPr>
+      <w:r>
+        <w:rPr>
+          <w:rFonts w:ascii="Consolas" w:cs="Consolas" w:eastAsia="Consolas" w:hAnsi="Consolas"/>
+          <w:sz w:val="19"/>
+          <w:szCs w:val="19"/>
+        </w:rPr>
+        <w:t xml:space="preserve">            message.setText("La machine retire " + coup + ". A vous.");</w:t>
+      </w:r>
+    </w:p>
+    <w:p>
+      <w:pPr>
+        <w:keepLines/>
+        <w:shd w:fill="F2F2F2" w:val="clear"/>
+        <w:spacing w:after="0" w:before="0"/>
+        <w:ind w:left="220"/>
+      </w:pPr>
+      <w:r>
+        <w:rPr>
+          <w:rFonts w:ascii="Consolas" w:cs="Consolas" w:eastAsia="Consolas" w:hAnsi="Consolas"/>
+          <w:sz w:val="19"/>
+          <w:szCs w:val="19"/>
+        </w:rPr>
+        <w:t xml:space="preserve">        }</w:t>
+      </w:r>
+    </w:p>
+    <w:p>
+      <w:pPr>
+        <w:keepLines/>
+        <w:shd w:fill="F2F2F2" w:val="clear"/>
+        <w:spacing w:after="0" w:before="0"/>
+        <w:ind w:left="220"/>
+      </w:pPr>
+      <w:r>
+        <w:rPr>
+          <w:rFonts w:ascii="Consolas" w:cs="Consolas" w:eastAsia="Consolas" w:hAnsi="Consolas"/>
+          <w:sz w:val="19"/>
+          <w:szCs w:val="19"/>
+        </w:rPr>
+        <w:t xml:space="preserve">    }</w:t>
+      </w:r>
+    </w:p>
+    <w:p>
+      <w:pPr>
+        <w:keepLines/>
+        <w:shd w:fill="F2F2F2" w:val="clear"/>
+        <w:spacing w:after="0" w:before="0"/>
+        <w:ind w:left="220"/>
+      </w:pPr>
+      <w:r>
+        <w:rPr>
+          <w:rFonts w:ascii="Consolas" w:cs="Consolas" w:eastAsia="Consolas" w:hAnsi="Consolas"/>
+          <w:sz w:val="19"/>
+          <w:szCs w:val="19"/>
+        </w:rPr>
+        <w:t xml:space="preserve"> </w:t>
+      </w:r>
+    </w:p>
+    <w:p>
+      <w:pPr>
+        <w:keepLines/>
+        <w:shd w:fill="F2F2F2" w:val="clear"/>
+        <w:spacing w:after="0" w:before="0"/>
+        <w:ind w:left="220"/>
+      </w:pPr>
+      <w:r>
+        <w:rPr>
+          <w:rFonts w:ascii="Consolas" w:cs="Consolas" w:eastAsia="Consolas" w:hAnsi="Consolas"/>
+          <w:sz w:val="19"/>
+          <w:szCs w:val="19"/>
+        </w:rPr>
+        <w:t xml:space="preserve">    private int coupDeLaMachine() {</w:t>
+      </w:r>
+    </w:p>
+    <w:p>
+      <w:pPr>
+        <w:keepLines/>
+        <w:shd w:fill="F2F2F2" w:val="clear"/>
+        <w:spacing w:after="0" w:before="0"/>
+        <w:ind w:left="220"/>
+      </w:pPr>
+      <w:r>
+        <w:rPr>
+          <w:rFonts w:ascii="Consolas" w:cs="Consolas" w:eastAsia="Consolas" w:hAnsi="Consolas"/>
+          <w:sz w:val="19"/>
+          <w:szCs w:val="19"/>
+        </w:rPr>
+        <w:t xml:space="preserve">        int propose = machine.combienRetirer(pile, regles);</w:t>
+      </w:r>
+    </w:p>
+    <w:p>
+      <w:pPr>
+        <w:keepLines/>
+        <w:shd w:fill="F2F2F2" w:val="clear"/>
+        <w:spacing w:after="0" w:before="0"/>
+        <w:ind w:left="220"/>
+      </w:pPr>
+      <w:r>
+        <w:rPr>
+          <w:rFonts w:ascii="Consolas" w:cs="Consolas" w:eastAsia="Consolas" w:hAnsi="Consolas"/>
+          <w:sz w:val="19"/>
+          <w:szCs w:val="19"/>
+        </w:rPr>
+        <w:t xml:space="preserve">        return regles.coupValide(pile, propose) ? propose : 1;</w:t>
+      </w:r>
+    </w:p>
+    <w:p>
+      <w:pPr>
+        <w:keepLines/>
+        <w:shd w:fill="F2F2F2" w:val="clear"/>
+        <w:spacing w:after="0" w:before="0"/>
+        <w:ind w:left="220"/>
+      </w:pPr>
+      <w:r>
+        <w:rPr>
+          <w:rFonts w:ascii="Consolas" w:cs="Consolas" w:eastAsia="Consolas" w:hAnsi="Consolas"/>
+          <w:sz w:val="19"/>
+          <w:szCs w:val="19"/>
+        </w:rPr>
+        <w:t xml:space="preserve">    }</w:t>
+      </w:r>
+    </w:p>
+    <w:p>
+      <w:pPr>
+        <w:keepLines/>
+        <w:shd w:fill="F2F2F2" w:val="clear"/>
+        <w:spacing w:after="0" w:before="0"/>
+        <w:ind w:left="220"/>
+      </w:pPr>
+      <w:r>
+        <w:rPr>
+          <w:rFonts w:ascii="Consolas" w:cs="Consolas" w:eastAsia="Consolas" w:hAnsi="Consolas"/>
+          <w:sz w:val="19"/>
+          <w:szCs w:val="19"/>
+        </w:rPr>
+        <w:t xml:space="preserve"> </w:t>
+      </w:r>
+    </w:p>
+    <w:p>
+      <w:pPr>
+        <w:keepLines/>
+        <w:shd w:fill="F2F2F2" w:val="clear"/>
+        <w:spacing w:after="0" w:before="0"/>
+        <w:ind w:left="220"/>
+      </w:pPr>
+      <w:r>
+        <w:rPr>
+          <w:rFonts w:ascii="Consolas" w:cs="Consolas" w:eastAsia="Consolas" w:hAnsi="Consolas"/>
+          <w:sz w:val="19"/>
+          <w:szCs w:val="19"/>
+        </w:rPr>
+        <w:t xml:space="preserve">    private void retirer(int nombre) {</w:t>
+      </w:r>
+    </w:p>
+    <w:p>
+      <w:pPr>
+        <w:keepLines/>
+        <w:shd w:fill="F2F2F2" w:val="clear"/>
+        <w:spacing w:after="0" w:before="0"/>
+        <w:ind w:left="220"/>
+      </w:pPr>
+      <w:r>
+        <w:rPr>
+          <w:rFonts w:ascii="Consolas" w:cs="Consolas" w:eastAsia="Consolas" w:hAnsi="Consolas"/>
+          <w:sz w:val="19"/>
+          <w:szCs w:val="19"/>
+        </w:rPr>
+        <w:t xml:space="preserve">        pile.retirer(nombre);</w:t>
+      </w:r>
+    </w:p>
+    <w:p>
+      <w:pPr>
+        <w:keepLines/>
+        <w:shd w:fill="F2F2F2" w:val="clear"/>
+        <w:spacing w:after="0" w:before="0"/>
+        <w:ind w:left="220"/>
+      </w:pPr>
+      <w:r>
+        <w:rPr>
+          <w:rFonts w:ascii="Consolas" w:cs="Consolas" w:eastAsia="Consolas" w:hAnsi="Consolas"/>
+          <w:sz w:val="19"/>
+          <w:szCs w:val="19"/>
+        </w:rPr>
+        <w:t xml:space="preserve">        pileAChange();</w:t>
+      </w:r>
+    </w:p>
+    <w:p>
+      <w:pPr>
+        <w:keepLines/>
+        <w:shd w:fill="F2F2F2" w:val="clear"/>
+        <w:spacing w:after="0" w:before="0"/>
+        <w:ind w:left="220"/>
+      </w:pPr>
+      <w:r>
+        <w:rPr>
+          <w:rFonts w:ascii="Consolas" w:cs="Consolas" w:eastAsia="Consolas" w:hAnsi="Consolas"/>
+          <w:sz w:val="19"/>
+          <w:szCs w:val="19"/>
+        </w:rPr>
+        <w:t xml:space="preserve">    }</w:t>
+      </w:r>
+    </w:p>
+    <w:p>
+      <w:pPr>
+        <w:keepLines/>
+        <w:shd w:fill="F2F2F2" w:val="clear"/>
+        <w:spacing w:after="0" w:before="0"/>
+        <w:ind w:left="220"/>
+      </w:pPr>
+      <w:r>
+        <w:rPr>
+          <w:rFonts w:ascii="Consolas" w:cs="Consolas" w:eastAsia="Consolas" w:hAnsi="Consolas"/>
+          <w:sz w:val="19"/>
+          <w:szCs w:val="19"/>
+        </w:rPr>
+        <w:t xml:space="preserve"> </w:t>
+      </w:r>
+    </w:p>
+    <w:p>
+      <w:pPr>
+        <w:keepLines/>
+        <w:shd w:fill="F2F2F2" w:val="clear"/>
+        <w:spacing w:after="0" w:before="0"/>
+        <w:ind w:left="220"/>
+      </w:pPr>
+      <w:r>
+        <w:rPr>
+          <w:rFonts w:ascii="Consolas" w:cs="Consolas" w:eastAsia="Consolas" w:hAnsi="Consolas"/>
+          <w:sz w:val="19"/>
+          <w:szCs w:val="19"/>
+        </w:rPr>
+        <w:t xml:space="preserve">    private void pileAChange() {</w:t>
+      </w:r>
+    </w:p>
+    <w:p>
+      <w:pPr>
+        <w:keepLines/>
+        <w:shd w:fill="F2F2F2" w:val="clear"/>
+        <w:spacing w:after="0" w:before="0"/>
+        <w:ind w:left="220"/>
+      </w:pPr>
+      <w:r>
+        <w:rPr>
+          <w:rFonts w:ascii="Consolas" w:cs="Consolas" w:eastAsia="Consolas" w:hAnsi="Consolas"/>
+          <w:sz w:val="19"/>
+          <w:szCs w:val="19"/>
+        </w:rPr>
+        <w:t xml:space="preserve">        //@G.33-G.33 etat.setText(pile.restantes() + " allumettes");</w:t>
+      </w:r>
+    </w:p>
+    <w:p>
+      <w:pPr>
+        <w:keepLines/>
+        <w:shd w:fill="F2F2F2" w:val="clear"/>
+        <w:spacing w:after="0" w:before="0"/>
+        <w:ind w:left="220"/>
+      </w:pPr>
+      <w:r>
+        <w:rPr>
+          <w:rFonts w:ascii="Consolas" w:cs="Consolas" w:eastAsia="Consolas" w:hAnsi="Consolas"/>
+          <w:sz w:val="19"/>
+          <w:szCs w:val="19"/>
+        </w:rPr>
+        <w:t xml:space="preserve">        restantes.set(pile.restantes());   //@G.34</w:t>
+      </w:r>
+    </w:p>
+    <w:p>
+      <w:pPr>
+        <w:keepLines/>
+        <w:shd w:fill="F2F2F2" w:val="clear"/>
+        <w:spacing w:after="0" w:before="0"/>
+        <w:ind w:left="220"/>
+      </w:pPr>
+      <w:r>
+        <w:rPr>
+          <w:rFonts w:ascii="Consolas" w:cs="Consolas" w:eastAsia="Consolas" w:hAnsi="Consolas"/>
+          <w:sz w:val="19"/>
+          <w:szCs w:val="19"/>
+        </w:rPr>
+        <w:t xml:space="preserve">    }</w:t>
+      </w:r>
+    </w:p>
+    <w:p>
+      <w:pPr>
+        <w:keepLines/>
+        <w:shd w:fill="F2F2F2" w:val="clear"/>
+        <w:spacing w:after="160" w:before="0"/>
+        <w:ind w:left="220"/>
+      </w:pPr>
+      <w:r>
+        <w:rPr>
+          <w:rFonts w:ascii="Consolas" w:cs="Consolas" w:eastAsia="Consolas" w:hAnsi="Consolas"/>
+          <w:sz w:val="19"/>
+          <w:szCs w:val="19"/>
+        </w:rPr>
+        <w:t xml:space="preserve">}</w:t>
+      </w:r>
+    </w:p>
+    <w:p>
+      <w:pPr>
+        <w:spacing w:after="40" w:before="160"/>
+      </w:pPr>
+      <w:r>
+        <w:rPr>
+          <w:rFonts w:ascii="Consolas" w:cs="Consolas" w:eastAsia="Consolas" w:hAnsi="Consolas"/>
+          <w:color w:val="595959"/>
+          <w:sz w:val="17"/>
+          <w:szCs w:val="17"/>
+        </w:rPr>
+        <w:t xml:space="preserve">fenetre/LanceurFenetreNim.java</w:t>
+      </w:r>
+    </w:p>
+    <w:p>
+      <w:pPr>
+        <w:keepLines/>
+        <w:shd w:fill="F2F2F2" w:val="clear"/>
+        <w:spacing w:after="0" w:before="100"/>
+        <w:ind w:left="220"/>
+      </w:pPr>
+      <w:r>
+        <w:rPr>
+          <w:rFonts w:ascii="Consolas" w:cs="Consolas" w:eastAsia="Consolas" w:hAnsi="Consolas"/>
+          <w:sz w:val="19"/>
+          <w:szCs w:val="19"/>
+        </w:rPr>
+        <w:t xml:space="preserve">//@G.33</w:t>
+      </w:r>
+    </w:p>
+    <w:p>
+      <w:pPr>
+        <w:keepLines/>
+        <w:shd w:fill="F2F2F2" w:val="clear"/>
+        <w:spacing w:after="0" w:before="0"/>
+        <w:ind w:left="220"/>
+      </w:pPr>
+      <w:r>
+        <w:rPr>
+          <w:rFonts w:ascii="Consolas" w:cs="Consolas" w:eastAsia="Consolas" w:hAnsi="Consolas"/>
+          <w:sz w:val="19"/>
+          <w:szCs w:val="19"/>
+        </w:rPr>
+        <w:t xml:space="preserve">public class LanceurFenetreNim {</w:t>
+      </w:r>
+    </w:p>
+    <w:p>
+      <w:pPr>
+        <w:keepLines/>
+        <w:shd w:fill="F2F2F2" w:val="clear"/>
+        <w:spacing w:after="0" w:before="0"/>
+        <w:ind w:left="220"/>
+      </w:pPr>
+      <w:r>
+        <w:rPr>
+          <w:rFonts w:ascii="Consolas" w:cs="Consolas" w:eastAsia="Consolas" w:hAnsi="Consolas"/>
+          <w:sz w:val="19"/>
+          <w:szCs w:val="19"/>
+        </w:rPr>
+        <w:t xml:space="preserve"> </w:t>
+      </w:r>
+    </w:p>
+    <w:p>
+      <w:pPr>
+        <w:keepLines/>
+        <w:shd w:fill="F2F2F2" w:val="clear"/>
+        <w:spacing w:after="0" w:before="0"/>
+        <w:ind w:left="220"/>
+      </w:pPr>
+      <w:r>
+        <w:rPr>
+          <w:rFonts w:ascii="Consolas" w:cs="Consolas" w:eastAsia="Consolas" w:hAnsi="Consolas"/>
+          <w:sz w:val="19"/>
+          <w:szCs w:val="19"/>
+        </w:rPr>
+        <w:t xml:space="preserve">    public static void main(String[] args) {</w:t>
+      </w:r>
+    </w:p>
+    <w:p>
+      <w:pPr>
+        <w:keepLines/>
+        <w:shd w:fill="F2F2F2" w:val="clear"/>
+        <w:spacing w:after="0" w:before="0"/>
+        <w:ind w:left="220"/>
+      </w:pPr>
+      <w:r>
+        <w:rPr>
+          <w:rFonts w:ascii="Consolas" w:cs="Consolas" w:eastAsia="Consolas" w:hAnsi="Consolas"/>
+          <w:sz w:val="19"/>
+          <w:szCs w:val="19"/>
+        </w:rPr>
+        <w:t xml:space="preserve">        Application.launch(FenetreNim.class, args);</w:t>
+      </w:r>
+    </w:p>
+    <w:p>
+      <w:pPr>
+        <w:keepLines/>
+        <w:shd w:fill="F2F2F2" w:val="clear"/>
+        <w:spacing w:after="0" w:before="0"/>
+        <w:ind w:left="220"/>
+      </w:pPr>
+      <w:r>
+        <w:rPr>
+          <w:rFonts w:ascii="Consolas" w:cs="Consolas" w:eastAsia="Consolas" w:hAnsi="Consolas"/>
+          <w:sz w:val="19"/>
+          <w:szCs w:val="19"/>
+        </w:rPr>
+        <w:t xml:space="preserve">    }</w:t>
+      </w:r>
+    </w:p>
+    <w:p>
+      <w:pPr>
+        <w:keepLines/>
+        <w:shd w:fill="F2F2F2" w:val="clear"/>
+        <w:spacing w:after="160" w:before="0"/>
+        <w:ind w:left="220"/>
+      </w:pPr>
+      <w:r>
+        <w:rPr>
+          <w:rFonts w:ascii="Consolas" w:cs="Consolas" w:eastAsia="Consolas" w:hAnsi="Consolas"/>
+          <w:sz w:val="19"/>
+          <w:szCs w:val="19"/>
+        </w:rPr>
+        <w:t xml:space="preserve">}</w:t>
       </w:r>
     </w:p>
     <w:p>
@@ -19200,7 +22282,7 @@
       <w:fldChar w:fldCharType="separate"/>
     </w:r>
     <w:r>
-      <w:t>27</w:t>
+      <w:t>33</w:t>
     </w:r>
     <w:r>
       <w:fldChar w:fldCharType="end"/>

</xml_diff>

<commit_message>
Livraisons des modules GameHub
</commit_message>
<xml_diff>
--- a/_documents/GameHub_Solution_Finale.docx
+++ b/_documents/GameHub_Solution_Finale.docx
@@ -61,14 +61,9 @@
       </w:r>
     </w:p>
     <w:p>
-      <w:pPr>
-        <w:sectPr>
-          <w:pgSz w:w="11906" w:h="16838" w:orient="portrait"/>
-          <w:pgMar w:top="1440" w:right="1440" w:bottom="1440" w:left="1440" w:header="708" w:footer="708" w:gutter="0"/>
-          <w:pgNumType/>
-          <w:docGrid w:linePitch="360"/>
-        </w:sectPr>
-      </w:pPr>
+      <w:r>
+        <w:br w:type="page"/>
+      </w:r>
     </w:p>
     <w:p>
       <w:pPr>
@@ -96,7 +91,7 @@
           <w:sz w:val="22"/>
           <w:szCs w:val="22"/>
         </w:rPr>
-        <w:t xml:space="preserve">Le code reproduit ici est celui du module solutions, sous be.ephec.gamehub. Il en est extrait automatiquement : les deux ne peuvent pas diverger.</w:t>
+        <w:t xml:space="preserve">Le code reproduit ici est celui du module solutions, sous be.ephec.gamehub. Il en est extrait automatiquement : les deux ne peuvent pas diverger.</w:t>
       </w:r>
     </w:p>
     <w:p>
@@ -124,7 +119,7 @@
           <w:sz w:val="22"/>
           <w:szCs w:val="22"/>
         </w:rPr>
-        <w:t xml:space="preserve"> dans ce document plutôt que recopiées, pour qu'il reste lisible. Les commentaires d'une seule ligne, eux, sont conservés : ce sont ceux qui expliquent une ligne à l'endroit où elle se lit.</w:t>
+        <w:t xml:space="preserve"> dans ce document plutôt que recopiées, pour qu'il reste lisible. Les commentaires d'une seule ligne, eux, sont conservés : ce sont ceux qui expliquent une ligne à l'endroit où elle se lit.</w:t>
       </w:r>
     </w:p>
     <w:p>
@@ -293,7 +288,7 @@
                 <w:sz w:val="20"/>
                 <w:szCs w:val="20"/>
               </w:rPr>
-              <w:t xml:space="preserve">la classe abstraite Jeu n'est pas écrite : elle serait remplacée quatre incréments plus loin par une interface de même nom et de signature incompatible</w:t>
+              <w:t xml:space="preserve">la classe abstraite Jeu n'est pas écrite : elle serait remplacée quatre incréments plus loin par une interface de même nom et de signature incompatible</w:t>
             </w:r>
           </w:p>
         </w:tc>
@@ -345,7 +340,7 @@
                 <w:sz w:val="20"/>
                 <w:szCs w:val="20"/>
               </w:rPr>
-              <w:t xml:space="preserve">l'appel à notifierDebut depuis le constructeur ne prévient personne, les observateurs s'ajoutant après ; le code suit l'énoncé, le commentaire explique</w:t>
+              <w:t xml:space="preserve">l'appel à notifierDebut depuis le constructeur ne prévient personne, les observateurs s'ajoutant après ; le code suit l'énoncé, le commentaire explique</w:t>
             </w:r>
           </w:p>
         </w:tc>
@@ -397,7 +392,7 @@
                 <w:sz w:val="20"/>
                 <w:szCs w:val="20"/>
               </w:rPr>
-              <w:t xml:space="preserve">l'énoncé rend JOUEUR1_GAGNE quand la pioche du joueur 1 est vide ; c'est l'inverse de la règle, et le corrigé applique la règle</w:t>
+              <w:t xml:space="preserve">l'énoncé rend JOUEUR1_GAGNE quand la pioche du joueur 1 est vide ; c'est l'inverse de la règle, et le corrigé applique la règle</w:t>
             </w:r>
           </w:p>
         </w:tc>
@@ -476,7 +471,7 @@
           <w:sz w:val="22"/>
           <w:szCs w:val="22"/>
         </w:rPr>
-        <w:t xml:space="preserve"> : l'énoncé demande des données immuables, et le mot-clé le fait respecter par le compilateur plutôt que par la discipline.</w:t>
+        <w:t xml:space="preserve"> : l'énoncé demande des données immuables, et le mot-clé le fait respecter par le compilateur plutôt que par la discipline.</w:t>
       </w:r>
     </w:p>
     <w:p>
@@ -488,7 +483,7 @@
           <w:sz w:val="22"/>
           <w:szCs w:val="22"/>
         </w:rPr>
-        <w:t xml:space="preserve">Le format du toString est celui des adresses de courrier. Il est réutilisé tel quel par Partie, qui se contente de concaténer des Joueur : c'est l'appel à toString qui fait le travail, sans qu'on l'écrive.</w:t>
+        <w:t xml:space="preserve">Le format du toString est celui des adresses de courrier. Il est réutilisé tel quel par Partie, qui se contente de concaténer des Joueur : c'est l'appel à toString qui fait le travail, sans qu'on l'écrive.</w:t>
       </w:r>
     </w:p>
     <w:p>
@@ -1174,7 +1169,7 @@
           <w:sz w:val="19"/>
           <w:szCs w:val="19"/>
         </w:rPr>
-        <w:t xml:space="preserve">    // propre ligne pour que la liste reste valide a tous les increments :</w:t>
+        <w:t xml:space="preserve">    // propre ligne pour que la liste reste valide a tous les increments :</w:t>
       </w:r>
     </w:p>
     <w:p>
@@ -1206,7 +1201,7 @@
           <w:sz w:val="19"/>
           <w:szCs w:val="19"/>
         </w:rPr>
-        <w:t xml:space="preserve">    ;</w:t>
+        <w:t xml:space="preserve">    ;</w:t>
       </w:r>
     </w:p>
     <w:p>
@@ -1474,7 +1469,7 @@
           <w:sz w:val="22"/>
           <w:szCs w:val="22"/>
         </w:rPr>
-        <w:t xml:space="preserve">ResultatPartie compte trois valeurs, et pas une de plus : c'est exactement ce qu'un jeu à deux joueurs peut produire. C'est aussi le point de friction de </w:t>
+        <w:t xml:space="preserve">ResultatPartie compte trois valeurs, et pas une de plus : c'est exactement ce qu'un jeu à deux joueurs peut produire. C'est aussi le point de friction de </w:t>
       </w:r>
       <w:r>
         <w:rPr>
@@ -1830,7 +1825,7 @@
           <w:sz w:val="22"/>
           <w:szCs w:val="22"/>
         </w:rPr>
-        <w:t xml:space="preserve">Réponse à la question de l'énoncé : ce record se crée dans </w:t>
+        <w:t xml:space="preserve">Réponse à la question de l'énoncé : ce record se crée dans </w:t>
       </w:r>
       <w:r>
         <w:rPr>
@@ -1874,7 +1869,7 @@
           <w:sz w:val="22"/>
           <w:szCs w:val="22"/>
         </w:rPr>
-        <w:t xml:space="preserve"> : c'est un instantané, figé, qu'on transporte et qu'on affiche. Il n'a aucun comportement.</w:t>
+        <w:t xml:space="preserve"> : c'est un instantané, figé, qu'on transporte et qu'on affiche. Il n'a aucun comportement.</w:t>
       </w:r>
     </w:p>
     <w:p>
@@ -2102,7 +2097,7 @@
           <w:sz w:val="22"/>
           <w:szCs w:val="22"/>
         </w:rPr>
-        <w:t xml:space="preserve">Cette classe a grandi par couches, et chaque couche a son incrément : les deux joueurs et le toString, puis les dates, puis le type et le résultat, puis les observateurs.</w:t>
+        <w:t xml:space="preserve">Cette classe a grandi par couches, et chaque couche a son incrément : les deux joueurs et le toString, puis les dates, puis le type et le résultat, puis les observateurs.</w:t>
       </w:r>
     </w:p>
     <w:p>
@@ -2123,7 +2118,7 @@
           <w:sz w:val="22"/>
           <w:szCs w:val="22"/>
         </w:rPr>
-        <w:t xml:space="preserve">Une partie commence donc au moment où l'objet existe : il n'y a aucun instant où une Partie serait sans date de début.</w:t>
+        <w:t xml:space="preserve">Une partie commence donc au moment où l'objet existe : il n'y a aucun instant où une Partie serait sans date de début.</w:t>
       </w:r>
     </w:p>
     <w:p>
@@ -2216,7 +2211,7 @@
                 <w:sz w:val="22"/>
                 <w:szCs w:val="22"/>
               </w:rPr>
-              <w:t xml:space="preserve">L'énoncé demande d'appeler notifierDebut dans le constructeur. Or les observateurs s'ajoutent APRÈS la construction : au moment où notifierDebut s'exécute, la liste est vide et personne n'est prévenu.</w:t>
+              <w:t xml:space="preserve">L'énoncé demande d'appeler notifierDebut dans le constructeur. Or les observateurs s'ajoutent APRÈS la construction : au moment où notifierDebut s'exécute, la liste est vide et personne n'est prévenu.</w:t>
             </w:r>
           </w:p>
           <w:p>
@@ -2228,7 +2223,7 @@
                 <w:sz w:val="22"/>
                 <w:szCs w:val="22"/>
               </w:rPr>
-              <w:t xml:space="preserve">Le code suit l'énoncé à la lettre, et l'appel est donc sans effet. Trois façons de le corriger, selon ce qu'on préfère : passer les observateurs au constructeur, prévenir un observateur au moment où il s'abonne, ou déplacer le début dans une méthode demarrer() appelée par le jeu.</w:t>
+              <w:t xml:space="preserve">Le code suit l'énoncé à la lettre, et l'appel est donc sans effet. Trois façons de le corriger, selon ce qu'on préfère : passer les observateurs au constructeur, prévenir un observateur au moment où il s'abonne, ou déplacer le début dans une méthode demarrer() appelée par le jeu.</w:t>
             </w:r>
           </w:p>
           <w:p>
@@ -3185,7 +3180,7 @@
           <w:sz w:val="19"/>
           <w:szCs w:val="19"/>
         </w:rPr>
-        <w:t xml:space="preserve">        for (ObservateurPartie observateur : observateurs) {</w:t>
+        <w:t xml:space="preserve">        for (ObservateurPartie observateur : observateurs) {</w:t>
       </w:r>
     </w:p>
     <w:p>
@@ -3297,7 +3292,7 @@
           <w:sz w:val="19"/>
           <w:szCs w:val="19"/>
         </w:rPr>
-        <w:t xml:space="preserve">        for (ObservateurPartie observateur : observateurs) {</w:t>
+        <w:t xml:space="preserve">        for (ObservateurPartie observateur : observateurs) {</w:t>
       </w:r>
     </w:p>
     <w:p>
@@ -3409,7 +3404,7 @@
           <w:sz w:val="19"/>
           <w:szCs w:val="19"/>
         </w:rPr>
-        <w:t xml:space="preserve">        for (ObservateurPartie observateur : observateurs) {</w:t>
+        <w:t xml:space="preserve">        for (ObservateurPartie observateur : observateurs) {</w:t>
       </w:r>
     </w:p>
     <w:p>
@@ -4097,7 +4092,7 @@
           <w:sz w:val="19"/>
           <w:szCs w:val="19"/>
         </w:rPr>
-        <w:t xml:space="preserve">                + (resultat != null ? " — resultat : " + resultat : "");   //@G.7</w:t>
+        <w:t xml:space="preserve">                + (resultat != null ? " — resultat : " + resultat : "");   //@G.7</w:t>
       </w:r>
     </w:p>
     <w:p>
@@ -4288,7 +4283,7 @@
           <w:sz w:val="22"/>
           <w:szCs w:val="22"/>
         </w:rPr>
-        <w:t xml:space="preserve">. Les deux désignent la même chose ; le corrigé garde le premier, qui dit ce qu'on observe.</w:t>
+        <w:t xml:space="preserve">. Les deux désignent la même chose ; le corrigé garde le premier, qui dit ce qu'on observe.</w:t>
       </w:r>
     </w:p>
     <w:p>
@@ -5160,7 +5155,7 @@
           <w:sz w:val="19"/>
           <w:szCs w:val="19"/>
         </w:rPr>
-        <w:t xml:space="preserve">            System.out.println("[journal] partie non enregistree : " + e.getMessage());</w:t>
+        <w:t xml:space="preserve">            System.out.println("[journal] partie non enregistree : " + e.getMessage());</w:t>
       </w:r>
     </w:p>
     <w:p>
@@ -5304,7 +5299,7 @@
           <w:sz w:val="19"/>
           <w:szCs w:val="19"/>
         </w:rPr>
-        <w:t xml:space="preserve">            return parties;   // premier lancement : rien a relire</w:t>
+        <w:t xml:space="preserve">            return parties;   // premier lancement : rien a relire</w:t>
       </w:r>
     </w:p>
     <w:p>
@@ -5368,7 +5363,7 @@
           <w:sz w:val="19"/>
           <w:szCs w:val="19"/>
         </w:rPr>
-        <w:t xml:space="preserve">            while ((ligne = entree.readLine()) != null) {</w:t>
+        <w:t xml:space="preserve">            while ((ligne = entree.readLine()) != null) {</w:t>
       </w:r>
     </w:p>
     <w:p>
@@ -5432,7 +5427,7 @@
           <w:sz w:val="19"/>
           <w:szCs w:val="19"/>
         </w:rPr>
-        <w:t xml:space="preserve">            System.out.println("[journal] historique illisible : " + e.getMessage());</w:t>
+        <w:t xml:space="preserve">            System.out.println("[journal] historique illisible : " + e.getMessage());</w:t>
       </w:r>
     </w:p>
     <w:p>
@@ -5787,7 +5782,7 @@
           <w:sz w:val="22"/>
           <w:szCs w:val="22"/>
         </w:rPr>
-        <w:t xml:space="preserve">Réponse à la question de l'énoncé : </w:t>
+        <w:t xml:space="preserve">Réponse à la question de l'énoncé : </w:t>
       </w:r>
       <w:r>
         <w:rPr>
@@ -5957,7 +5952,7 @@
           <w:sz w:val="22"/>
           <w:szCs w:val="22"/>
         </w:rPr>
-        <w:t xml:space="preserve"> ne rendait rien : un jeu devait donc modifier la Partie lui-même, et il en savait trop. Ici le jeu reçoit deux joueurs et rend un résultat ; c'est le hub qui fait le lien.</w:t>
+        <w:t xml:space="preserve"> ne rendait rien : un jeu devait donc modifier la Partie lui-même, et il en savait trop. Ici le jeu reçoit deux joueurs et rend un résultat ; c'est le hub qui fait le lien.</w:t>
       </w:r>
     </w:p>
     <w:p>
@@ -6730,7 +6725,7 @@
           <w:sz w:val="22"/>
           <w:szCs w:val="22"/>
         </w:rPr>
-        <w:t xml:space="preserve">Réponse à la question de l'énoncé : </w:t>
+        <w:t xml:space="preserve">Réponse à la question de l'énoncé : </w:t>
       </w:r>
       <w:r>
         <w:rPr>
@@ -7167,7 +7162,7 @@
           <w:sz w:val="19"/>
           <w:szCs w:val="19"/>
         </w:rPr>
-        <w:t xml:space="preserve">                    "Retrait impossible : " + nombre + " sur " + allumettes + " restantes");</w:t>
+        <w:t xml:space="preserve">                    "Retrait impossible : " + nombre + " sur " + allumettes + " restantes");</w:t>
       </w:r>
     </w:p>
     <w:p>
@@ -7781,7 +7776,7 @@
           <w:sz w:val="22"/>
           <w:szCs w:val="22"/>
         </w:rPr>
-        <w:t xml:space="preserve">Une seule méthode abstraite : </w:t>
+        <w:t xml:space="preserve">Une seule méthode abstraite : </w:t>
       </w:r>
       <w:r>
         <w:rPr>
@@ -7816,7 +7811,7 @@
           <w:sz w:val="22"/>
           <w:szCs w:val="22"/>
         </w:rPr>
-        <w:t xml:space="preserve">Elle reçoit les règles en plus de la pile. Une stratégie qui supposerait « le maximum est trois » cesserait de fonctionner à la première variante ; celle-ci demande.</w:t>
+        <w:t xml:space="preserve">Elle reçoit les règles en plus de la pile. Une stratégie qui supposerait « le maximum est trois » cesserait de fonctionner à la première variante ; celle-ci demande.</w:t>
       </w:r>
     </w:p>
     <w:p>
@@ -8209,7 +8204,7 @@
           <w:sz w:val="22"/>
           <w:szCs w:val="22"/>
         </w:rPr>
-        <w:t xml:space="preserve">Réponse à la question de l'énoncé : </w:t>
+        <w:t xml:space="preserve">Réponse à la question de l'énoncé : </w:t>
       </w:r>
       <w:r>
         <w:rPr>
@@ -8232,7 +8227,7 @@
           <w:sz w:val="22"/>
           <w:szCs w:val="22"/>
         </w:rPr>
-        <w:t xml:space="preserve"> vérifie ce qu'elles proposent et ramène dans les clous. C'est une frontière : à l'intérieur du jeu on se fie à son propre code, mais une stratégie peut venir de n'importe où — y compris d'un étudiant qui en écrit une quatrième.</w:t>
+        <w:t xml:space="preserve"> vérifie ce qu'elles proposent et ramène dans les clous. C'est une frontière : à l'intérieur du jeu on se fie à son propre code, mais une stratégie peut venir de n'importe où — y compris d'un étudiant qui en écrit une quatrième.</w:t>
       </w:r>
     </w:p>
     <w:p>
@@ -8822,7 +8817,7 @@
           <w:sz w:val="19"/>
           <w:szCs w:val="19"/>
         </w:rPr>
-        <w:t xml:space="preserve">        System.out.println("\nStrategie du " + rang + " joueur :");</w:t>
+        <w:t xml:space="preserve">        System.out.println("\nStrategie du " + rang + " joueur :");</w:t>
       </w:r>
     </w:p>
     <w:p>
@@ -8918,7 +8913,7 @@
           <w:sz w:val="19"/>
           <w:szCs w:val="19"/>
         </w:rPr>
-        <w:t xml:space="preserve">            System.out.print("Votre choix : ");</w:t>
+        <w:t xml:space="preserve">            System.out.print("Votre choix : ");</w:t>
       </w:r>
     </w:p>
     <w:p>
@@ -9286,23 +9281,23 @@
           <w:sz w:val="19"/>
           <w:szCs w:val="19"/>
         </w:rPr>
-        <w:t xml:space="preserve">            //@G.18-G.30 StrategieNim strategie = auTourDuPremier ? strategieJoueur1 : strategieJoueur2;</w:t>
-      </w:r>
-    </w:p>
-    <w:p>
-      <w:pPr>
-        <w:keepLines/>
-        <w:shd w:fill="F2F2F2" w:val="clear"/>
-        <w:spacing w:after="0" w:before="0"/>
-        <w:ind w:left="220"/>
-      </w:pPr>
-      <w:r>
-        <w:rPr>
-          <w:rFonts w:ascii="Consolas" w:cs="Consolas" w:eastAsia="Consolas" w:hAnsi="Consolas"/>
-          <w:sz w:val="19"/>
-          <w:szCs w:val="19"/>
-        </w:rPr>
-        <w:t xml:space="preserve">            //@G.18-G.30 Joueur joueur = auTourDuPremier ? joueur1 : joueur2;</w:t>
+        <w:t xml:space="preserve">            //@G.18-G.30 StrategieNim strategie = auTourDuPremier ? strategieJoueur1 : strategieJoueur2;</w:t>
+      </w:r>
+    </w:p>
+    <w:p>
+      <w:pPr>
+        <w:keepLines/>
+        <w:shd w:fill="F2F2F2" w:val="clear"/>
+        <w:spacing w:after="0" w:before="0"/>
+        <w:ind w:left="220"/>
+      </w:pPr>
+      <w:r>
+        <w:rPr>
+          <w:rFonts w:ascii="Consolas" w:cs="Consolas" w:eastAsia="Consolas" w:hAnsi="Consolas"/>
+          <w:sz w:val="19"/>
+          <w:szCs w:val="19"/>
+        </w:rPr>
+        <w:t xml:space="preserve">            //@G.18-G.30 Joueur joueur = auTourDuPremier ? joueur1 : joueur2;</w:t>
       </w:r>
     </w:p>
     <w:p>
@@ -9478,7 +9473,7 @@
           <w:sz w:val="19"/>
           <w:szCs w:val="19"/>
         </w:rPr>
-        <w:t xml:space="preserve">                // Celui qui vient de jouer a pris la derniere : il perd.</w:t>
+        <w:t xml:space="preserve">                // Celui qui vient de jouer a pris la derniere : il perd.</w:t>
       </w:r>
     </w:p>
     <w:p>
@@ -9510,23 +9505,23 @@
           <w:sz w:val="19"/>
           <w:szCs w:val="19"/>
         </w:rPr>
-        <w:t xml:space="preserve">                        ? ResultatPartie.JOUEUR2_GAGNE</w:t>
-      </w:r>
-    </w:p>
-    <w:p>
-      <w:pPr>
-        <w:keepLines/>
-        <w:shd w:fill="F2F2F2" w:val="clear"/>
-        <w:spacing w:after="0" w:before="0"/>
-        <w:ind w:left="220"/>
-      </w:pPr>
-      <w:r>
-        <w:rPr>
-          <w:rFonts w:ascii="Consolas" w:cs="Consolas" w:eastAsia="Consolas" w:hAnsi="Consolas"/>
-          <w:sz w:val="19"/>
-          <w:szCs w:val="19"/>
-        </w:rPr>
-        <w:t xml:space="preserve">                        : ResultatPartie.JOUEUR1_GAGNE;</w:t>
+        <w:t xml:space="preserve">                        ? ResultatPartie.JOUEUR2_GAGNE</w:t>
+      </w:r>
+    </w:p>
+    <w:p>
+      <w:pPr>
+        <w:keepLines/>
+        <w:shd w:fill="F2F2F2" w:val="clear"/>
+        <w:spacing w:after="0" w:before="0"/>
+        <w:ind w:left="220"/>
+      </w:pPr>
+      <w:r>
+        <w:rPr>
+          <w:rFonts w:ascii="Consolas" w:cs="Consolas" w:eastAsia="Consolas" w:hAnsi="Consolas"/>
+          <w:sz w:val="19"/>
+          <w:szCs w:val="19"/>
+        </w:rPr>
+        <w:t xml:space="preserve">                        : ResultatPartie.JOUEUR1_GAGNE;</w:t>
       </w:r>
     </w:p>
     <w:p>
@@ -9558,7 +9553,7 @@
           <w:sz w:val="19"/>
           <w:szCs w:val="19"/>
         </w:rPr>
-        <w:t xml:space="preserve">            auTourDuPremier = !auTourDuPremier;</w:t>
+        <w:t xml:space="preserve">            auTourDuPremier = !auTourDuPremier;</w:t>
       </w:r>
     </w:p>
     <w:p>
@@ -9848,7 +9843,7 @@
                 <w:sz w:val="22"/>
                 <w:szCs w:val="22"/>
               </w:rPr>
-              <w:t xml:space="preserve">Celui qui retire la dernière allumette perd : il faut donc laisser exactement UNE allumette à l'adversaire.</w:t>
+              <w:t xml:space="preserve">Celui qui retire la dernière allumette perd : il faut donc laisser exactement UNE allumette à l'adversaire.</w:t>
             </w:r>
           </w:p>
           <w:p>
@@ -9884,7 +9879,7 @@
                 <w:sz w:val="22"/>
                 <w:szCs w:val="22"/>
               </w:rPr>
-              <w:t xml:space="preserve">Vérifié sur 1200 parties simulées : depuis une position gagnante, cette stratégie ne perd jamais contre un joueur aléatoire.</w:t>
+              <w:t xml:space="preserve">Vérifié sur 1200 parties simulées : depuis une position gagnante, cette stratégie ne perd jamais contre un joueur aléatoire.</w:t>
             </w:r>
           </w:p>
         </w:tc>
@@ -10061,7 +10056,7 @@
           <w:sz w:val="19"/>
           <w:szCs w:val="19"/>
         </w:rPr>
-        <w:t xml:space="preserve">            return 1;   // position perdante : on joue le minimum</w:t>
+        <w:t xml:space="preserve">            return 1;   // position perdante : on joue le minimum</w:t>
       </w:r>
     </w:p>
     <w:p>
@@ -10473,7 +10468,7 @@
           <w:sz w:val="22"/>
           <w:szCs w:val="22"/>
         </w:rPr>
-        <w:t xml:space="preserve">Réponse à la question de l'énoncé : </w:t>
+        <w:t xml:space="preserve">Réponse à la question de l'énoncé : </w:t>
       </w:r>
       <w:r>
         <w:rPr>
@@ -11010,7 +11005,7 @@
           <w:sz w:val="22"/>
           <w:szCs w:val="22"/>
         </w:rPr>
-        <w:t xml:space="preserve">JeuConfigurable ne décrit pas ce qu'est un jeu : elle signale une </w:t>
+        <w:t xml:space="preserve">JeuConfigurable ne décrit pas ce qu'est un jeu : elle signale une </w:t>
       </w:r>
       <w:r>
         <w:rPr>
@@ -11395,7 +11390,7 @@
           <w:sz w:val="19"/>
           <w:szCs w:val="19"/>
         </w:rPr>
-        <w:t xml:space="preserve">        // Le hub ne sait pas si ce jeu se configure : il demande.</w:t>
+        <w:t xml:space="preserve">        // Le hub ne sait pas si ce jeu se configure : il demande.</w:t>
       </w:r>
     </w:p>
     <w:p>
@@ -11667,7 +11662,7 @@
           <w:sz w:val="19"/>
           <w:szCs w:val="19"/>
         </w:rPr>
-        <w:t xml:space="preserve">        System.out.println("Resume : " + partie.getResume());   //@G.9</w:t>
+        <w:t xml:space="preserve">        System.out.println("Resume : " + partie.getResume());   //@G.9</w:t>
       </w:r>
     </w:p>
     <w:p>
@@ -11827,23 +11822,23 @@
           <w:sz w:val="19"/>
           <w:szCs w:val="19"/>
         </w:rPr>
-        <w:t xml:space="preserve">        System.out.println("Parties precedentes :");</w:t>
-      </w:r>
-    </w:p>
-    <w:p>
-      <w:pPr>
-        <w:keepLines/>
-        <w:shd w:fill="F2F2F2" w:val="clear"/>
-        <w:spacing w:after="0" w:before="0"/>
-        <w:ind w:left="220"/>
-      </w:pPr>
-      <w:r>
-        <w:rPr>
-          <w:rFonts w:ascii="Consolas" w:cs="Consolas" w:eastAsia="Consolas" w:hAnsi="Consolas"/>
-          <w:sz w:val="19"/>
-          <w:szCs w:val="19"/>
-        </w:rPr>
-        <w:t xml:space="preserve">        for (ResumePartie resume : parties) {</w:t>
+        <w:t xml:space="preserve">        System.out.println("Parties precedentes :");</w:t>
+      </w:r>
+    </w:p>
+    <w:p>
+      <w:pPr>
+        <w:keepLines/>
+        <w:shd w:fill="F2F2F2" w:val="clear"/>
+        <w:spacing w:after="0" w:before="0"/>
+        <w:ind w:left="220"/>
+      </w:pPr>
+      <w:r>
+        <w:rPr>
+          <w:rFonts w:ascii="Consolas" w:cs="Consolas" w:eastAsia="Consolas" w:hAnsi="Consolas"/>
+          <w:sz w:val="19"/>
+          <w:szCs w:val="19"/>
+        </w:rPr>
+        <w:t xml:space="preserve">        for (ResumePartie resume : parties) {</w:t>
       </w:r>
     </w:p>
     <w:p>
@@ -11939,7 +11934,7 @@
           <w:sz w:val="19"/>
           <w:szCs w:val="19"/>
         </w:rPr>
-        <w:t xml:space="preserve">        System.out.print("Pseudo du " + rang + " joueur : ");</w:t>
+        <w:t xml:space="preserve">        System.out.print("Pseudo du " + rang + " joueur : ");</w:t>
       </w:r>
     </w:p>
     <w:p>
@@ -11971,7 +11966,7 @@
           <w:sz w:val="19"/>
           <w:szCs w:val="19"/>
         </w:rPr>
-        <w:t xml:space="preserve">        System.out.print("Email du " + rang + " joueur : ");</w:t>
+        <w:t xml:space="preserve">        System.out.print("Email du " + rang + " joueur : ");</w:t>
       </w:r>
     </w:p>
     <w:p>
@@ -12083,7 +12078,7 @@
           <w:sz w:val="19"/>
           <w:szCs w:val="19"/>
         </w:rPr>
-        <w:t xml:space="preserve">        System.out.println("\nJeux disponibles :");</w:t>
+        <w:t xml:space="preserve">        System.out.println("\nJeux disponibles :");</w:t>
       </w:r>
     </w:p>
     <w:p>
@@ -12195,7 +12190,7 @@
           <w:sz w:val="19"/>
           <w:szCs w:val="19"/>
         </w:rPr>
-        <w:t xml:space="preserve">            System.out.print("Votre choix : ");</w:t>
+        <w:t xml:space="preserve">            System.out.print("Votre choix : ");</w:t>
       </w:r>
     </w:p>
     <w:p>
@@ -12534,7 +12529,7 @@
           <w:sz w:val="22"/>
           <w:szCs w:val="22"/>
         </w:rPr>
-        <w:t xml:space="preserve"> : une ligne au lieu de six, écrite par des gens dont c'est le métier.</w:t>
+        <w:t xml:space="preserve"> : une ligne au lieu de six, écrite par des gens dont c'est le métier.</w:t>
       </w:r>
     </w:p>
     <w:p>
@@ -12660,23 +12655,23 @@
           <w:sz w:val="19"/>
           <w:szCs w:val="19"/>
         </w:rPr>
-        <w:t xml:space="preserve">        for (Couleur couleur : Couleur.values()) {</w:t>
-      </w:r>
-    </w:p>
-    <w:p>
-      <w:pPr>
-        <w:keepLines/>
-        <w:shd w:fill="F2F2F2" w:val="clear"/>
-        <w:spacing w:after="0" w:before="0"/>
-        <w:ind w:left="220"/>
-      </w:pPr>
-      <w:r>
-        <w:rPr>
-          <w:rFonts w:ascii="Consolas" w:cs="Consolas" w:eastAsia="Consolas" w:hAnsi="Consolas"/>
-          <w:sz w:val="19"/>
-          <w:szCs w:val="19"/>
-        </w:rPr>
-        <w:t xml:space="preserve">            for (Valeur valeur : Valeur.values()) {</w:t>
+        <w:t xml:space="preserve">        for (Couleur couleur : Couleur.values()) {</w:t>
+      </w:r>
+    </w:p>
+    <w:p>
+      <w:pPr>
+        <w:keepLines/>
+        <w:shd w:fill="F2F2F2" w:val="clear"/>
+        <w:spacing w:after="0" w:before="0"/>
+        <w:ind w:left="220"/>
+      </w:pPr>
+      <w:r>
+        <w:rPr>
+          <w:rFonts w:ascii="Consolas" w:cs="Consolas" w:eastAsia="Consolas" w:hAnsi="Consolas"/>
+          <w:sz w:val="19"/>
+          <w:szCs w:val="19"/>
+        </w:rPr>
+        <w:t xml:space="preserve">            for (Valeur valeur : Valeur.values()) {</w:t>
       </w:r>
     </w:p>
     <w:p>
@@ -12985,7 +12980,7 @@
           <w:sz w:val="22"/>
           <w:szCs w:val="22"/>
         </w:rPr>
-        <w:t xml:space="preserve"> l'énumération commençait par AS ; ici elle commence par DEUX et finit par AS, parce qu'à la bataille l'as est la carte la plus forte.</w:t>
+        <w:t xml:space="preserve"> l'énumération commençait par AS ; ici elle commence par DEUX et finit par AS, parce qu'à la bataille l'as est la carte la plus forte.</w:t>
       </w:r>
     </w:p>
     <w:p>
@@ -13013,7 +13008,7 @@
           <w:sz w:val="22"/>
           <w:szCs w:val="22"/>
         </w:rPr>
-        <w:t xml:space="preserve"> rend exactement ce que les règles demandent. On n'écrit aucune comparaison : l'ordre dans lequel on a tapé les constantes fait le travail.</w:t>
+        <w:t xml:space="preserve"> rend exactement ce que les règles demandent. On n'écrit aucune comparaison : l'ordre dans lequel on a tapé les constantes fait le travail.</w:t>
       </w:r>
     </w:p>
     <w:p>
@@ -13824,7 +13819,7 @@
           <w:sz w:val="22"/>
           <w:szCs w:val="22"/>
         </w:rPr>
-        <w:t xml:space="preserve">Une main de bataille se pioche par le dessus et se recharge par le dessous : on a besoin des deux bouts. Une List le permettrait — </w:t>
+        <w:t xml:space="preserve">Une main de bataille se pioche par le dessus et se recharge par le dessous : on a besoin des deux bouts. Une List le permettrait — </w:t>
       </w:r>
       <w:r>
         <w:rPr>
@@ -13912,7 +13907,7 @@
                 <w:sz w:val="22"/>
                 <w:szCs w:val="22"/>
               </w:rPr>
-              <w:t xml:space="preserve">L'énoncé demande : « soit la pioche du joueur 1 est vide : return JOUEUR1_GAGNE ». C'est l'inverse de la règle du jeu — un joueur sans carte a tout perdu.</w:t>
+              <w:t xml:space="preserve">L'énoncé demande : « soit la pioche du joueur 1 est vide : return JOUEUR1_GAGNE ». C'est l'inverse de la règle du jeu — un joueur sans carte a tout perdu.</w:t>
             </w:r>
           </w:p>
           <w:p>
@@ -14634,7 +14629,7 @@
           <w:sz w:val="19"/>
           <w:szCs w:val="19"/>
         </w:rPr>
-        <w:t xml:space="preserve">        while (!piocheJ1.isEmpty() &amp;&amp; !piocheJ2.isEmpty() &amp;&amp; tours &lt; MAX_TOURS) {</w:t>
+        <w:t xml:space="preserve">        while (!piocheJ1.isEmpty() &amp;&amp; !piocheJ2.isEmpty() &amp;&amp; tours &lt; MAX_TOURS) {</w:t>
       </w:r>
     </w:p>
     <w:p>
@@ -14858,7 +14853,7 @@
           <w:sz w:val="19"/>
           <w:szCs w:val="19"/>
         </w:rPr>
-        <w:t xml:space="preserve">                // Version simplifiee : les deux cartes sortent du jeu.</w:t>
+        <w:t xml:space="preserve">                // Version simplifiee : les deux cartes sortent du jeu.</w:t>
       </w:r>
     </w:p>
     <w:p>
@@ -14954,7 +14949,7 @@
           <w:sz w:val="19"/>
           <w:szCs w:val="19"/>
         </w:rPr>
-        <w:t xml:space="preserve">        System.out.printf("%d tour(s), %d carte(s) au cimetiere — %s : %d, %s : %d%n",</w:t>
+        <w:t xml:space="preserve">        System.out.printf("%d tour(s), %d carte(s) au cimetiere — %s : %d, %s : %d%n",</w:t>
       </w:r>
     </w:p>
     <w:p>
@@ -15337,7 +15332,7 @@
           <w:sz w:val="22"/>
           <w:szCs w:val="22"/>
         </w:rPr>
-        <w:t xml:space="preserve"> cherche à faire comprendre : ce qui est commun reste en haut.</w:t>
+        <w:t xml:space="preserve"> cherche à faire comprendre : ce qui est commun reste en haut.</w:t>
       </w:r>
     </w:p>
     <w:p>
@@ -15349,7 +15344,7 @@
           <w:sz w:val="22"/>
           <w:szCs w:val="22"/>
         </w:rPr>
-        <w:t xml:space="preserve">Les deux cas limites font toute la difficulté. Un joueur qui n'a plus assez de cartes pour miser pendant une bataille ne peut pas suivre : il perd, et l'autre ramasse le pot. Si les deux se retrouvent à court en même temps, personne ne ramasse et le pot est perdu pour tout le monde.</w:t>
+        <w:t xml:space="preserve">Les deux cas limites font toute la difficulté. Un joueur qui n'a plus assez de cartes pour miser pendant une bataille ne peut pas suivre : il perd, et l'autre ramasse le pot. Si les deux se retrouvent à court en même temps, personne ne ramasse et le pot est perdu pour tout le monde.</w:t>
       </w:r>
     </w:p>
     <w:p>
@@ -15370,7 +15365,7 @@
           <w:sz w:val="22"/>
           <w:szCs w:val="22"/>
         </w:rPr>
-        <w:t xml:space="preserve">n'est pas une coquetterie. Sans lui, un cycle s'installe : les mêmes cartes reviennent dans le même ordre, indéfiniment. Un vrai joueur ne range pas ses plis dans un ordre choisi.</w:t>
+        <w:t xml:space="preserve">n'est pas une coquetterie. Sans lui, un cycle s'installe : les mêmes cartes reviennent dans le même ordre, indéfiniment. Un vrai joueur ne range pas ses plis dans un ordre choisi.</w:t>
       </w:r>
     </w:p>
     <w:p>
@@ -15736,7 +15731,7 @@
           <w:sz w:val="19"/>
           <w:szCs w:val="19"/>
         </w:rPr>
-        <w:t xml:space="preserve">        while (!piocheJ1.isEmpty() &amp;&amp; !piocheJ2.isEmpty() &amp;&amp; tours &lt; MAX_TOURS) {</w:t>
+        <w:t xml:space="preserve">        while (!piocheJ1.isEmpty() &amp;&amp; !piocheJ2.isEmpty() &amp;&amp; tours &lt; MAX_TOURS) {</w:t>
       </w:r>
     </w:p>
     <w:p>
@@ -16040,7 +16035,7 @@
           <w:sz w:val="19"/>
           <w:szCs w:val="19"/>
         </w:rPr>
-        <w:t xml:space="preserve">        System.out.printf("%d tour(s) dont %d bataille(s) — %s : %d, %s : %d%n",</w:t>
+        <w:t xml:space="preserve">        System.out.printf("%d tour(s) dont %d bataille(s) — %s : %d, %s : %d%n",</w:t>
       </w:r>
     </w:p>
     <w:p>
@@ -16264,7 +16259,7 @@
           <w:sz w:val="19"/>
           <w:szCs w:val="19"/>
         </w:rPr>
-        <w:t xml:space="preserve">            if (!j1PeutSuivre &amp;&amp; !j2PeutSuivre) {</w:t>
+        <w:t xml:space="preserve">            if (!j1PeutSuivre &amp;&amp; !j2PeutSuivre) {</w:t>
       </w:r>
     </w:p>
     <w:p>
@@ -16600,7 +16595,7 @@
           <w:sz w:val="19"/>
           <w:szCs w:val="19"/>
         </w:rPr>
-        <w:t xml:space="preserve">            if (comparaison != 0) {</w:t>
+        <w:t xml:space="preserve">            if (comparaison != 0) {</w:t>
       </w:r>
     </w:p>
     <w:p>
@@ -16648,7 +16643,7 @@
           <w:sz w:val="19"/>
           <w:szCs w:val="19"/>
         </w:rPr>
-        <w:t xml:space="preserve">            // Encore egales : on recommence, et le pot continue de grossir.</w:t>
+        <w:t xml:space="preserve">            // Encore egales : on recommence, et le pot continue de grossir.</w:t>
       </w:r>
     </w:p>
     <w:p>
@@ -16760,7 +16755,7 @@
           <w:sz w:val="19"/>
           <w:szCs w:val="19"/>
         </w:rPr>
-        <w:t xml:space="preserve">            return;   // personne ne peut suivre : le pot est perdu</w:t>
+        <w:t xml:space="preserve">            return;   // personne ne peut suivre : le pot est perdu</w:t>
       </w:r>
     </w:p>
     <w:p>
@@ -16824,23 +16819,23 @@
           <w:sz w:val="19"/>
           <w:szCs w:val="19"/>
         </w:rPr>
-        <w:t xml:space="preserve">        Deque&lt;Carte&gt; gagnant = comparaison &gt; 0 ? piocheJ1 : piocheJ2;</w:t>
-      </w:r>
-    </w:p>
-    <w:p>
-      <w:pPr>
-        <w:keepLines/>
-        <w:shd w:fill="F2F2F2" w:val="clear"/>
-        <w:spacing w:after="0" w:before="0"/>
-        <w:ind w:left="220"/>
-      </w:pPr>
-      <w:r>
-        <w:rPr>
-          <w:rFonts w:ascii="Consolas" w:cs="Consolas" w:eastAsia="Consolas" w:hAnsi="Consolas"/>
-          <w:sz w:val="19"/>
-          <w:szCs w:val="19"/>
-        </w:rPr>
-        <w:t xml:space="preserve">        for (Carte carte : pot) {</w:t>
+        <w:t xml:space="preserve">        Deque&lt;Carte&gt; gagnant = comparaison &gt; 0 ? piocheJ1 : piocheJ2;</w:t>
+      </w:r>
+    </w:p>
+    <w:p>
+      <w:pPr>
+        <w:keepLines/>
+        <w:shd w:fill="F2F2F2" w:val="clear"/>
+        <w:spacing w:after="0" w:before="0"/>
+        <w:ind w:left="220"/>
+      </w:pPr>
+      <w:r>
+        <w:rPr>
+          <w:rFonts w:ascii="Consolas" w:cs="Consolas" w:eastAsia="Consolas" w:hAnsi="Consolas"/>
+          <w:sz w:val="19"/>
+          <w:szCs w:val="19"/>
+        </w:rPr>
+        <w:t xml:space="preserve">        for (Carte carte : pot) {</w:t>
       </w:r>
     </w:p>
     <w:p>
@@ -17102,7 +17097,7 @@
           <w:sz w:val="22"/>
           <w:szCs w:val="22"/>
         </w:rPr>
-        <w:t xml:space="preserve">Configurer les stratégies remplace la ParJoueur entière au lieu de modifier l'une de ses moitiés : il n'existe jamais d'état où une stratégie est neuve et l'autre ancienne.</w:t>
+        <w:t xml:space="preserve">Configurer les stratégies remplace la ParJoueur entière au lieu de modifier l'une de ses moitiés : il n'existe jamais d'état où une stratégie est neuve et l'autre ancienne.</w:t>
       </w:r>
     </w:p>
     <w:p>
@@ -17114,7 +17109,7 @@
           <w:sz w:val="22"/>
           <w:szCs w:val="22"/>
         </w:rPr>
-        <w:t xml:space="preserve">La bataille garde ses deux pioches en paramètres jumeaux. Le corrigé n'y touche pas : les méthodes de V0 et V1 les reçoivent séparément, et les regrouper déplacerait la question sans la simplifier. C'est la dernière question de l'énoncé, et les deux réponses se défendent.</w:t>
+        <w:t xml:space="preserve">La bataille garde ses deux pioches en paramètres jumeaux. Le corrigé n'y touche pas : les méthodes de V0 et V1 les reçoivent séparément, et les regrouper déplacerait la question sans la simplifier. C'est la dernière question de l'énoncé, et les deux réponses se défendent.</w:t>
       </w:r>
     </w:p>
     <w:p>
@@ -17464,7 +17459,7 @@
           <w:sz w:val="19"/>
           <w:szCs w:val="19"/>
         </w:rPr>
-        <w:t xml:space="preserve">        return auTourDuPremier ? duPremier : duSecond;</w:t>
+        <w:t xml:space="preserve">        return auTourDuPremier ? duPremier : duSecond;</w:t>
       </w:r>
     </w:p>
     <w:p>
@@ -17543,7 +17538,7 @@
           <w:sz w:val="22"/>
           <w:szCs w:val="22"/>
         </w:rPr>
-        <w:t xml:space="preserve">parce qu'un jeu a un état : les stratégies configurées d'un Nim. Ranger un jeu tout fait dans la Map ferait jouer la deuxième partie avec la configuration de la première.</w:t>
+        <w:t xml:space="preserve">parce qu'un jeu a un état : les stratégies configurées d'un Nim. Ranger un jeu tout fait dans la Map ferait jouer la deuxième partie avec la configuration de la première.</w:t>
       </w:r>
     </w:p>
     <w:p>
@@ -17555,7 +17550,7 @@
           <w:sz w:val="22"/>
           <w:szCs w:val="22"/>
         </w:rPr>
-        <w:t xml:space="preserve">Le test du null remplace le default du switch. Toutes les valeurs de TypeJeu ont un jeu, il ne sert donc à rien aujourd'hui ; il coûte trois lignes et protège le jour où une valeur s'ajoute sans sa ligne au catalogue.</w:t>
+        <w:t xml:space="preserve">Le test du null remplace le default du switch. Toutes les valeurs de TypeJeu ont un jeu, il ne sert donc à rien aujourd'hui ; il coûte trois lignes et protège le jour où une valeur s'ajoute sans sa ligne au catalogue.</w:t>
       </w:r>
     </w:p>
     <w:p>
@@ -18182,7 +18177,7 @@
           <w:sz w:val="22"/>
           <w:szCs w:val="22"/>
         </w:rPr>
-        <w:t xml:space="preserve">La fenêtre ne s'ouvre pas depuis le menu du hub : il faudrait démarrer JavaFX à la main, sur un autre fil. C'est une application à part, avec son lanceur.</w:t>
+        <w:t xml:space="preserve">La fenêtre ne s'ouvre pas depuis le menu du hub : il faudrait démarrer JavaFX à la main, sur un autre fil. C'est une application à part, avec son lanceur.</w:t>
       </w:r>
     </w:p>
     <w:p>
@@ -18203,7 +18198,7 @@
           <w:sz w:val="22"/>
           <w:szCs w:val="22"/>
         </w:rPr>
-        <w:t xml:space="preserve">Contre la stratégie maligne, celui qui commence à treize perd toujours ; à quatorze, le joueur peut gagner en jouant juste.</w:t>
+        <w:t xml:space="preserve">Contre la stratégie maligne, celui qui commence à treize perd toujours ; à quatorze, le joueur peut gagner en jouant juste.</w:t>
       </w:r>
     </w:p>
     <w:p>
@@ -18215,7 +18210,7 @@
           <w:sz w:val="22"/>
           <w:szCs w:val="22"/>
         </w:rPr>
-        <w:t xml:space="preserve">La méthode pileAChange est le seul endroit où l'écran apprend que la pile a changé. En G.33 elle écrit le libellé ; en G.34 elle met à jour la propriété, et c'est tout ce qui change dans la logique. Les touches du clavier contournent les boutons grisés : c'est le test des règles, au début du tour, qui garde le programme juste.</w:t>
+        <w:t xml:space="preserve">La méthode pileAChange est le seul endroit où l'écran apprend que la pile a changé. En G.33 elle écrit le libellé ; en G.34 elle met à jour la propriété, et c'est tout ce qui change dans la logique. Les touches du clavier contournent les boutons grisés : c'est le test des règles, au début du tour, qui garde le programme juste.</w:t>
       </w:r>
     </w:p>
     <w:p>
@@ -18533,7 +18528,7 @@
           <w:sz w:val="19"/>
           <w:szCs w:val="19"/>
         </w:rPr>
-        <w:t xml:space="preserve">        message = new Label("A vous de jouer : cliquez, ou tapez 1, 2 ou 3.");</w:t>
+        <w:t xml:space="preserve">        message = new Label("A vous de jouer : cliquez, ou tapez 1, 2 ou 3.");</w:t>
       </w:r>
     </w:p>
     <w:p>
@@ -19173,7 +19168,7 @@
           <w:sz w:val="19"/>
           <w:szCs w:val="19"/>
         </w:rPr>
-        <w:t xml:space="preserve">            message.setText("Coup impossible : il reste " + pile.restantes() + " allumette(s).");</w:t>
+        <w:t xml:space="preserve">            message.setText("Coup impossible : il reste " + pile.restantes() + " allumette(s).");</w:t>
       </w:r>
     </w:p>
     <w:p>
@@ -19253,7 +19248,7 @@
           <w:sz w:val="19"/>
           <w:szCs w:val="19"/>
         </w:rPr>
-        <w:t xml:space="preserve">            message.setText("Vous avez pris la derniere allumette : vous avez perdu.");</w:t>
+        <w:t xml:space="preserve">            message.setText("Vous avez pris la derniere allumette : vous avez perdu.");</w:t>
       </w:r>
     </w:p>
     <w:p>
@@ -19365,7 +19360,7 @@
           <w:sz w:val="19"/>
           <w:szCs w:val="19"/>
         </w:rPr>
-        <w:t xml:space="preserve">            message.setText("La machine retire " + coup + " et prend la derniere : vous avez gagne !");</w:t>
+        <w:t xml:space="preserve">            message.setText("La machine retire " + coup + " et prend la derniere : vous avez gagne !");</w:t>
       </w:r>
     </w:p>
     <w:p>
@@ -19493,7 +19488,7 @@
           <w:sz w:val="19"/>
           <w:szCs w:val="19"/>
         </w:rPr>
-        <w:t xml:space="preserve">        return regles.coupValide(pile, propose) ? propose : 1;</w:t>
+        <w:t xml:space="preserve">        return regles.coupValide(pile, propose) ? propose : 1;</w:t>
       </w:r>
     </w:p>
     <w:p>
@@ -19892,7 +19887,7 @@
           <w:sz w:val="22"/>
           <w:szCs w:val="22"/>
         </w:rPr>
-        <w:t xml:space="preserve">L'écriture rattrape son IOException et la signale : un observateur ne peut pas la laisser passer, puisque onFin ne la déclare pas, et la partie qu'on vient de jouer n'a pas à échouer pour autant. La lecture fait de même, et un fichier absent n'est pas une erreur : c'est le premier lancement.</w:t>
+        <w:t xml:space="preserve">L'écriture rattrape son IOException et la signale : un observateur ne peut pas la laisser passer, puisque onFin ne la déclare pas, et la partie qu'on vient de jouer n'a pas à échouer pour autant. La lecture fait de même, et un fichier absent n'est pas une erreur : c'est le premier lancement.</w:t>
       </w:r>
     </w:p>
     <w:p>
@@ -19904,7 +19899,7 @@
           <w:sz w:val="22"/>
           <w:szCs w:val="22"/>
         </w:rPr>
-        <w:t xml:space="preserve">Le corrigé ne protège ni contre un pseudo qui contient un point-virgule, ni contre une ligne abîmée : ce sont les deux premières questions de l'énoncé, et les réponses se discutent.</w:t>
+        <w:t xml:space="preserve">Le corrigé ne protège ni contre un pseudo qui contient un point-virgule, ni contre une ligne abîmée : ce sont les deux premières questions de l'énoncé, et les réponses se discutent.</w:t>
       </w:r>
     </w:p>
     <w:p>
@@ -20606,7 +20601,7 @@
           <w:sz w:val="19"/>
           <w:szCs w:val="19"/>
         </w:rPr>
-        <w:t xml:space="preserve">            System.out.println("[journal] partie non enregistree : " + e.getMessage());</w:t>
+        <w:t xml:space="preserve">            System.out.println("[journal] partie non enregistree : " + e.getMessage());</w:t>
       </w:r>
     </w:p>
     <w:p>
@@ -20750,7 +20745,7 @@
           <w:sz w:val="19"/>
           <w:szCs w:val="19"/>
         </w:rPr>
-        <w:t xml:space="preserve">            return parties;   // premier lancement : rien a relire</w:t>
+        <w:t xml:space="preserve">            return parties;   // premier lancement : rien a relire</w:t>
       </w:r>
     </w:p>
     <w:p>
@@ -20814,7 +20809,7 @@
           <w:sz w:val="19"/>
           <w:szCs w:val="19"/>
         </w:rPr>
-        <w:t xml:space="preserve">            while ((ligne = entree.readLine()) != null) {</w:t>
+        <w:t xml:space="preserve">            while ((ligne = entree.readLine()) != null) {</w:t>
       </w:r>
     </w:p>
     <w:p>
@@ -20878,7 +20873,7 @@
           <w:sz w:val="19"/>
           <w:szCs w:val="19"/>
         </w:rPr>
-        <w:t xml:space="preserve">            System.out.println("[journal] historique illisible : " + e.getMessage());</w:t>
+        <w:t xml:space="preserve">            System.out.println("[journal] historique illisible : " + e.getMessage());</w:t>
       </w:r>
     </w:p>
     <w:p>
@@ -21468,7 +21463,7 @@
           <w:sz w:val="19"/>
           <w:szCs w:val="19"/>
         </w:rPr>
-        <w:t xml:space="preserve">        // Le hub ne sait pas si ce jeu se configure : il demande.</w:t>
+        <w:t xml:space="preserve">        // Le hub ne sait pas si ce jeu se configure : il demande.</w:t>
       </w:r>
     </w:p>
     <w:p>
@@ -21740,7 +21735,7 @@
           <w:sz w:val="19"/>
           <w:szCs w:val="19"/>
         </w:rPr>
-        <w:t xml:space="preserve">        System.out.println("Resume : " + partie.getResume());   //@G.9</w:t>
+        <w:t xml:space="preserve">        System.out.println("Resume : " + partie.getResume());   //@G.9</w:t>
       </w:r>
     </w:p>
     <w:p>
@@ -21900,23 +21895,23 @@
           <w:sz w:val="19"/>
           <w:szCs w:val="19"/>
         </w:rPr>
-        <w:t xml:space="preserve">        System.out.println("Parties precedentes :");</w:t>
-      </w:r>
-    </w:p>
-    <w:p>
-      <w:pPr>
-        <w:keepLines/>
-        <w:shd w:fill="F2F2F2" w:val="clear"/>
-        <w:spacing w:after="0" w:before="0"/>
-        <w:ind w:left="220"/>
-      </w:pPr>
-      <w:r>
-        <w:rPr>
-          <w:rFonts w:ascii="Consolas" w:cs="Consolas" w:eastAsia="Consolas" w:hAnsi="Consolas"/>
-          <w:sz w:val="19"/>
-          <w:szCs w:val="19"/>
-        </w:rPr>
-        <w:t xml:space="preserve">        for (ResumePartie resume : parties) {</w:t>
+        <w:t xml:space="preserve">        System.out.println("Parties precedentes :");</w:t>
+      </w:r>
+    </w:p>
+    <w:p>
+      <w:pPr>
+        <w:keepLines/>
+        <w:shd w:fill="F2F2F2" w:val="clear"/>
+        <w:spacing w:after="0" w:before="0"/>
+        <w:ind w:left="220"/>
+      </w:pPr>
+      <w:r>
+        <w:rPr>
+          <w:rFonts w:ascii="Consolas" w:cs="Consolas" w:eastAsia="Consolas" w:hAnsi="Consolas"/>
+          <w:sz w:val="19"/>
+          <w:szCs w:val="19"/>
+        </w:rPr>
+        <w:t xml:space="preserve">        for (ResumePartie resume : parties) {</w:t>
       </w:r>
     </w:p>
     <w:p>
@@ -22012,7 +22007,7 @@
           <w:sz w:val="19"/>
           <w:szCs w:val="19"/>
         </w:rPr>
-        <w:t xml:space="preserve">        System.out.print("Pseudo du " + rang + " joueur : ");</w:t>
+        <w:t xml:space="preserve">        System.out.print("Pseudo du " + rang + " joueur : ");</w:t>
       </w:r>
     </w:p>
     <w:p>
@@ -22044,7 +22039,7 @@
           <w:sz w:val="19"/>
           <w:szCs w:val="19"/>
         </w:rPr>
-        <w:t xml:space="preserve">        System.out.print("Email du " + rang + " joueur : ");</w:t>
+        <w:t xml:space="preserve">        System.out.print("Email du " + rang + " joueur : ");</w:t>
       </w:r>
     </w:p>
     <w:p>
@@ -22156,7 +22151,7 @@
           <w:sz w:val="19"/>
           <w:szCs w:val="19"/>
         </w:rPr>
-        <w:t xml:space="preserve">        System.out.println("\nJeux disponibles :");</w:t>
+        <w:t xml:space="preserve">        System.out.println("\nJeux disponibles :");</w:t>
       </w:r>
     </w:p>
     <w:p>
@@ -22268,7 +22263,7 @@
           <w:sz w:val="19"/>
           <w:szCs w:val="19"/>
         </w:rPr>
-        <w:t xml:space="preserve">            System.out.print("Votre choix : ");</w:t>
+        <w:t xml:space="preserve">            System.out.print("Votre choix : ");</w:t>
       </w:r>
     </w:p>
     <w:p>
@@ -22535,7 +22530,7 @@
           <w:sz w:val="22"/>
           <w:szCs w:val="22"/>
         </w:rPr>
-        <w:t xml:space="preserve">Le dernier test est le plus utile : il vérifie qu'</w:t>
+        <w:t xml:space="preserve">Le dernier test est le plus utile : il vérifie qu'</w:t>
       </w:r>
       <w:r>
         <w:rPr>
@@ -23381,7 +23376,7 @@
           <w:sz w:val="19"/>
           <w:szCs w:val="19"/>
         </w:rPr>
-        <w:t xml:space="preserve">        // Positions gagnantes : elle ramene le reste a 1 modulo 4.</w:t>
+        <w:t xml:space="preserve">        // Positions gagnantes : elle ramene le reste a 1 modulo 4.</w:t>
       </w:r>
     </w:p>
     <w:p>
@@ -23461,7 +23456,7 @@
           <w:sz w:val="19"/>
           <w:szCs w:val="19"/>
         </w:rPr>
-        <w:t xml:space="preserve">        for (int restantes : new int[]{7, 4, 3, 10, 12, 20}) {</w:t>
+        <w:t xml:space="preserve">        for (int restantes : new int[]{7, 4, 3, 10, 12, 20}) {</w:t>
       </w:r>
     </w:p>
     <w:p>
@@ -23653,7 +23648,7 @@
           <w:sz w:val="19"/>
           <w:szCs w:val="19"/>
         </w:rPr>
-        <w:t xml:space="preserve">        for (int restantes : new int[]{5, 9, 13}) {</w:t>
+        <w:t xml:space="preserve">        for (int restantes : new int[]{5, 9, 13}) {</w:t>
       </w:r>
     </w:p>
     <w:p>
@@ -23685,7 +23680,7 @@
           <w:sz w:val="19"/>
           <w:szCs w:val="19"/>
         </w:rPr>
-        <w:t xml:space="preserve">                    "en " + restantes + " elle ne peut rien forcer : elle joue 1");</w:t>
+        <w:t xml:space="preserve">                    "en " + restantes + " elle ne peut rien forcer : elle joue 1");</w:t>
       </w:r>
     </w:p>
     <w:p>
@@ -23829,7 +23824,7 @@
           <w:sz w:val="19"/>
           <w:szCs w:val="19"/>
         </w:rPr>
-        <w:t xml:space="preserve">        for (TypeStrategieNim type : TypeStrategieNim.values()) {</w:t>
+        <w:t xml:space="preserve">        for (TypeStrategieNim type : TypeStrategieNim.values()) {</w:t>
       </w:r>
     </w:p>
     <w:p>
@@ -23989,7 +23984,7 @@
           <w:sz w:val="19"/>
           <w:szCs w:val="19"/>
         </w:rPr>
-        <w:t xml:space="preserve">        for (TypeStrategieNim type : TypeStrategieNim.values()) {</w:t>
+        <w:t xml:space="preserve">        for (TypeStrategieNim type : TypeStrategieNim.values()) {</w:t>
       </w:r>
     </w:p>
     <w:p>
@@ -24194,7 +24189,7 @@
           <w:sz w:val="22"/>
           <w:szCs w:val="22"/>
         </w:rPr>
-        <w:t xml:space="preserve">Une partie est aléatoire : on ne peut pas vérifier qui gagne. On vérifie donc des propriétés qui doivent tenir à chaque fois — elle se termine, aucune carte ne se perd, une partie sans joueur est refusée.</w:t>
+        <w:t xml:space="preserve">Une partie est aléatoire : on ne peut pas vérifier qui gagne. On vérifie donc des propriétés qui doivent tenir à chaque fois — elle se termine, aucune carte ne se perd, une partie sans joueur est refusée.</w:t>
       </w:r>
     </w:p>
     <w:p>
@@ -24444,23 +24439,23 @@
           <w:sz w:val="19"/>
           <w:szCs w:val="19"/>
         </w:rPr>
-        <w:t xml:space="preserve">        for (Carte carte : deck.getCartes()) {</w:t>
-      </w:r>
-    </w:p>
-    <w:p>
-      <w:pPr>
-        <w:keepLines/>
-        <w:shd w:fill="F2F2F2" w:val="clear"/>
-        <w:spacing w:after="0" w:before="0"/>
-        <w:ind w:left="220"/>
-      </w:pPr>
-      <w:r>
-        <w:rPr>
-          <w:rFonts w:ascii="Consolas" w:cs="Consolas" w:eastAsia="Consolas" w:hAnsi="Consolas"/>
-          <w:sz w:val="19"/>
-          <w:szCs w:val="19"/>
-        </w:rPr>
-        <w:t xml:space="preserve">            assertTrue(vues.add(carte.toString()), "carte en double : " + carte);</w:t>
+        <w:t xml:space="preserve">        for (Carte carte : deck.getCartes()) {</w:t>
+      </w:r>
+    </w:p>
+    <w:p>
+      <w:pPr>
+        <w:keepLines/>
+        <w:shd w:fill="F2F2F2" w:val="clear"/>
+        <w:spacing w:after="0" w:before="0"/>
+        <w:ind w:left="220"/>
+      </w:pPr>
+      <w:r>
+        <w:rPr>
+          <w:rFonts w:ascii="Consolas" w:cs="Consolas" w:eastAsia="Consolas" w:hAnsi="Consolas"/>
+          <w:sz w:val="19"/>
+          <w:szCs w:val="19"/>
+        </w:rPr>
+        <w:t xml:space="preserve">            assertTrue(vues.add(carte.toString()), "carte en double : " + carte);</w:t>
       </w:r>
     </w:p>
     <w:p>
@@ -25777,7 +25772,7 @@
           <w:sz w:val="22"/>
           <w:szCs w:val="22"/>
         </w:rPr>
-        <w:t xml:space="preserve">et la seule chose qu'il faut en retenir : une dépendance qu'on n'a pas créée est une dépendance qu'on n'aura pas à défaire.</w:t>
+        <w:t xml:space="preserve">et la seule chose qu'il faut en retenir : une dépendance qu'on n'a pas créée est une dépendance qu'on n'aura pas à défaire.</w:t>
       </w:r>
     </w:p>
     <w:p>
@@ -26028,10 +26023,9 @@
       </w:tr>
     </w:tbl>
     <w:sectPr>
-      <w:footerReference w:type="default" r:id="rId14"/>
       <w:pgSz w:w="11906" w:h="16838" w:orient="portrait"/>
       <w:pgMar w:top="1440" w:right="1440" w:bottom="1440" w:left="1440" w:header="708" w:footer="708" w:gutter="0"/>
-      <w:pgNumType w:start="1"/>
+      <w:pgNumType/>
       <w:docGrid w:linePitch="360"/>
     </w:sectPr>
   </w:body>
@@ -26077,67 +26071,6 @@
     </w:p>
   </w:endnote>
 </w:endnotes>
-</file>
-
-<file path=word/footer1.xml><?xml version="1.0" encoding="utf-8"?>
-<w:ftr xmlns:w="http://schemas.openxmlformats.org/wordprocessingml/2006/main">
-  <w:p>
-    <w:pPr>
-      <w:jc w:val="center"/>
-      <w:rPr>
-        <w:sz w:val="18"/>
-        <w:szCs w:val="18"/>
-        <w:color w:val="595959"/>
-      </w:rPr>
-    </w:pPr>
-    <w:r>
-      <w:rPr>
-        <w:sz w:val="18"/>
-        <w:szCs w:val="18"/>
-        <w:color w:val="595959"/>
-      </w:rPr>
-      <w:t xml:space="preserve">GameHub </w:t>
-    </w:r>
-    <w:r>
-      <w:fldChar w:fldCharType="begin"/>
-    </w:r>
-    <w:r>
-      <w:instrText xml:space="preserve"> PAGE </w:instrText>
-    </w:r>
-    <w:r>
-      <w:fldChar w:fldCharType="separate"/>
-    </w:r>
-    <w:r>
-      <w:t>1</w:t>
-    </w:r>
-    <w:r>
-      <w:fldChar w:fldCharType="end"/>
-    </w:r>
-    <w:r>
-      <w:rPr>
-        <w:sz w:val="18"/>
-        <w:szCs w:val="18"/>
-        <w:color w:val="595959"/>
-      </w:rPr>
-      <w:t xml:space="preserve"> / </w:t>
-    </w:r>
-    <w:r>
-      <w:fldChar w:fldCharType="begin"/>
-    </w:r>
-    <w:r>
-      <w:instrText xml:space="preserve"> SECTIONPAGES </w:instrText>
-    </w:r>
-    <w:r>
-      <w:fldChar w:fldCharType="separate"/>
-    </w:r>
-    <w:r>
-      <w:t>37</w:t>
-    </w:r>
-    <w:r>
-      <w:fldChar w:fldCharType="end"/>
-    </w:r>
-  </w:p>
-</w:ftr>
 </file>
 
 <file path=word/footnotes.xml><?xml version="1.0" encoding="utf-8"?>

</xml_diff>